<commit_message>
Add product code column to price items
</commit_message>
<xml_diff>
--- a/src/templates/modelo_proposta.docx
+++ b/src/templates/modelo_proposta.docx
@@ -1453,7 +1453,7 @@
     </w:p>
     <w:tbl>
       <w:tblPr>
-        <w:tblW w:w="9360" w:type="dxa"/>
+        <w:tblW w:w="8960" w:type="dxa"/>
         <w:jc w:val="center"/>
         <w:tblLayout w:type="fixed"/>
         <w:tblBorders>
@@ -1467,18 +1467,19 @@
         <w:tblLook w:val="0000" w:firstRow="0" w:lastRow="0" w:firstColumn="0" w:lastColumn="0" w:noHBand="1" w:noVBand="1"/>
       </w:tblPr>
       <w:tblGrid>
+        <w:gridCol w:w="560"/>
+        <w:gridCol w:w="900"/>
+        <w:gridCol w:w="3000"/>
+        <w:gridCol w:w="850"/>
         <w:gridCol w:w="650"/>
-        <w:gridCol w:w="3800"/>
-        <w:gridCol w:w="950"/>
-        <w:gridCol w:w="720"/>
-        <w:gridCol w:w="650"/>
-        <w:gridCol w:w="1300"/>
-        <w:gridCol w:w="1290"/>
+        <w:gridCol w:w="580"/>
+        <w:gridCol w:w="1200"/>
+        <w:gridCol w:w="1220"/>
       </w:tblGrid>
       <w:tr>
         <w:tc>
           <w:tcPr>
-            <w:tcW w:w="650" w:type="dxa"/>
+            <w:tcW w:w="560" w:type="dxa"/>
             <w:shd w:val="clear" w:color="auto" w:fill="BFBFBF"/>
             <w:tcBorders>
               <w:top w:val="single" w:sz="6" w:space="0" w:color="404040"/>
@@ -1516,7 +1517,7 @@
         </w:tc>
         <w:tc>
           <w:tcPr>
-            <w:tcW w:w="3800" w:type="dxa"/>
+            <w:tcW w:w="900" w:type="dxa"/>
             <w:shd w:val="clear" w:color="auto" w:fill="BFBFBF"/>
             <w:tcBorders>
               <w:top w:val="single" w:sz="6" w:space="0" w:color="404040"/>
@@ -1548,13 +1549,13 @@
                 <w:sz w:val="16"/>
                 <w:szCs w:val="16"/>
               </w:rPr>
-              <w:t>DESCRIÇÃO DOS ITENS</w:t>
+              <w:t>CÓDIGO</w:t>
             </w:r>
           </w:p>
         </w:tc>
         <w:tc>
           <w:tcPr>
-            <w:tcW w:w="950" w:type="dxa"/>
+            <w:tcW w:w="3000" w:type="dxa"/>
             <w:shd w:val="clear" w:color="auto" w:fill="BFBFBF"/>
             <w:tcBorders>
               <w:top w:val="single" w:sz="6" w:space="0" w:color="404040"/>
@@ -1586,13 +1587,13 @@
                 <w:sz w:val="16"/>
                 <w:szCs w:val="16"/>
               </w:rPr>
-              <w:t>NCM</w:t>
+              <w:t>DESCRIÇÃO DOS ITENS</w:t>
             </w:r>
           </w:p>
         </w:tc>
         <w:tc>
           <w:tcPr>
-            <w:tcW w:w="720" w:type="dxa"/>
+            <w:tcW w:w="850" w:type="dxa"/>
             <w:shd w:val="clear" w:color="auto" w:fill="BFBFBF"/>
             <w:tcBorders>
               <w:top w:val="single" w:sz="6" w:space="0" w:color="404040"/>
@@ -1624,7 +1625,7 @@
                 <w:sz w:val="16"/>
                 <w:szCs w:val="16"/>
               </w:rPr>
-              <w:t>QTD</w:t>
+              <w:t>NCM</w:t>
             </w:r>
           </w:p>
         </w:tc>
@@ -1662,13 +1663,13 @@
                 <w:sz w:val="16"/>
                 <w:szCs w:val="16"/>
               </w:rPr>
-              <w:t>UNID.</w:t>
+              <w:t>QTD</w:t>
             </w:r>
           </w:p>
         </w:tc>
         <w:tc>
           <w:tcPr>
-            <w:tcW w:w="1300" w:type="dxa"/>
+            <w:tcW w:w="580" w:type="dxa"/>
             <w:shd w:val="clear" w:color="auto" w:fill="BFBFBF"/>
             <w:tcBorders>
               <w:top w:val="single" w:sz="6" w:space="0" w:color="404040"/>
@@ -1700,13 +1701,13 @@
                 <w:sz w:val="16"/>
                 <w:szCs w:val="16"/>
               </w:rPr>
-              <w:t>VALOR UNIT�RIO</w:t>
+              <w:t>UNID.</w:t>
             </w:r>
           </w:p>
         </w:tc>
         <w:tc>
           <w:tcPr>
-            <w:tcW w:w="1290" w:type="dxa"/>
+            <w:tcW w:w="1200" w:type="dxa"/>
             <w:shd w:val="clear" w:color="auto" w:fill="BFBFBF"/>
             <w:tcBorders>
               <w:top w:val="single" w:sz="6" w:space="0" w:color="404040"/>
@@ -1738,6 +1739,44 @@
                 <w:sz w:val="16"/>
                 <w:szCs w:val="16"/>
               </w:rPr>
+              <w:t>VALOR UNIT�RIO</w:t>
+            </w:r>
+          </w:p>
+        </w:tc>
+        <w:tc>
+          <w:tcPr>
+            <w:tcW w:w="1220" w:type="dxa"/>
+            <w:shd w:val="clear" w:color="auto" w:fill="BFBFBF"/>
+            <w:tcBorders>
+              <w:top w:val="single" w:sz="6" w:space="0" w:color="404040"/>
+              <w:left w:val="single" w:sz="4" w:space="0" w:color="7F7F7F"/>
+              <w:bottom w:val="single" w:sz="6" w:space="0" w:color="404040"/>
+              <w:right w:val="single" w:sz="4" w:space="0" w:color="7F7F7F"/>
+            </w:tcBorders>
+            <w:vAlign w:val="center"/>
+            <w:tcMar>
+              <w:top w:w="20" w:type="dxa"/>
+              <w:left w:w="70" w:type="dxa"/>
+              <w:bottom w:w="20" w:type="dxa"/>
+              <w:right w:w="70" w:type="dxa"/>
+            </w:tcMar>
+          </w:tcPr>
+          <w:p>
+            <w:pPr>
+              <w:spacing w:after="0" w:line="240" w:lineRule="auto"/>
+              <w:jc w:val="center"/>
+              <w:rPr>
+                <w:rFonts w:ascii="Calibri" w:hAnsi="Calibri" w:cs="Calibri"/>
+                <w:sz w:val="16"/>
+                <w:szCs w:val="16"/>
+              </w:rPr>
+            </w:pPr>
+            <w:r>
+              <w:rPr>
+                <w:rFonts w:ascii="Calibri" w:hAnsi="Calibri" w:cs="Calibri"/>
+                <w:sz w:val="16"/>
+                <w:szCs w:val="16"/>
+              </w:rPr>
               <w:t>VALOR TOTAL</w:t>
             </w:r>
           </w:p>
@@ -1746,8 +1785,8 @@
       <w:tr>
         <w:tc>
           <w:tcPr>
-            <w:tcW w:w="9360" w:type="dxa"/>
-            <w:gridSpan w:val="7"/>
+            <w:tcW w:w="8960" w:type="dxa"/>
+            <w:gridSpan w:val="8"/>
             <w:tcBorders>
               <w:top w:val="nil"/>
               <w:left w:val="nil"/>
@@ -1787,7 +1826,7 @@
       <w:tr>
         <w:tc>
           <w:tcPr>
-            <w:tcW w:w="650" w:type="dxa"/>
+            <w:tcW w:w="560" w:type="dxa"/>
             <w:tcBorders>
               <w:top w:val="nil"/>
               <w:left w:val="nil"/>
@@ -1825,7 +1864,7 @@
         </w:tc>
         <w:tc>
           <w:tcPr>
-            <w:tcW w:w="3800" w:type="dxa"/>
+            <w:tcW w:w="900" w:type="dxa"/>
             <w:tcBorders>
               <w:top w:val="nil"/>
               <w:left w:val="nil"/>
@@ -1857,13 +1896,51 @@
                 <w:sz w:val="16"/>
                 <w:szCs w:val="16"/>
               </w:rPr>
+              <w:t>{codigo}</w:t>
+            </w:r>
+          </w:p>
+        </w:tc>
+        <w:tc>
+          <w:tcPr>
+            <w:tcW w:w="3000" w:type="dxa"/>
+            <w:tcBorders>
+              <w:top w:val="nil"/>
+              <w:left w:val="nil"/>
+              <w:bottom w:val="single" w:sz="4" w:space="0" w:color="BFBFBF"/>
+              <w:right w:val="nil"/>
+            </w:tcBorders>
+            <w:vAlign w:val="center"/>
+            <w:tcMar>
+              <w:top w:w="35" w:type="dxa"/>
+              <w:left w:w="70" w:type="dxa"/>
+              <w:bottom w:w="35" w:type="dxa"/>
+              <w:right w:w="70" w:type="dxa"/>
+            </w:tcMar>
+          </w:tcPr>
+          <w:p>
+            <w:pPr>
+              <w:spacing w:after="0" w:line="240" w:lineRule="auto"/>
+              <w:rPr>
+                <w:rFonts w:ascii="Calibri" w:hAnsi="Calibri" w:cs="Calibri"/>
+                <w:b/>
+                <w:sz w:val="16"/>
+                <w:szCs w:val="16"/>
+              </w:rPr>
+            </w:pPr>
+            <w:r>
+              <w:rPr>
+                <w:rFonts w:ascii="Calibri" w:hAnsi="Calibri" w:cs="Calibri"/>
+                <w:b/>
+                <w:sz w:val="16"/>
+                <w:szCs w:val="16"/>
+              </w:rPr>
               <w:t>{descricao}</w:t>
             </w:r>
           </w:p>
         </w:tc>
         <w:tc>
           <w:tcPr>
-            <w:tcW w:w="950" w:type="dxa"/>
+            <w:tcW w:w="850" w:type="dxa"/>
             <w:tcBorders>
               <w:top w:val="nil"/>
               <w:left w:val="nil"/>
@@ -1897,45 +1974,6 @@
                 <w:szCs w:val="16"/>
               </w:rPr>
               <w:t>{ncm}</w:t>
-            </w:r>
-          </w:p>
-        </w:tc>
-        <w:tc>
-          <w:tcPr>
-            <w:tcW w:w="720" w:type="dxa"/>
-            <w:tcBorders>
-              <w:top w:val="nil"/>
-              <w:left w:val="nil"/>
-              <w:bottom w:val="single" w:sz="4" w:space="0" w:color="BFBFBF"/>
-              <w:right w:val="nil"/>
-            </w:tcBorders>
-            <w:vAlign w:val="center"/>
-            <w:tcMar>
-              <w:top w:w="35" w:type="dxa"/>
-              <w:left w:w="70" w:type="dxa"/>
-              <w:bottom w:w="35" w:type="dxa"/>
-              <w:right w:w="70" w:type="dxa"/>
-            </w:tcMar>
-          </w:tcPr>
-          <w:p>
-            <w:pPr>
-              <w:spacing w:after="0" w:line="240" w:lineRule="auto"/>
-              <w:jc w:val="right"/>
-              <w:rPr>
-                <w:rFonts w:ascii="Calibri" w:hAnsi="Calibri" w:cs="Calibri"/>
-                <w:b/>
-                <w:sz w:val="16"/>
-                <w:szCs w:val="16"/>
-              </w:rPr>
-            </w:pPr>
-            <w:r>
-              <w:rPr>
-                <w:rFonts w:ascii="Calibri" w:hAnsi="Calibri" w:cs="Calibri"/>
-                <w:b/>
-                <w:sz w:val="16"/>
-                <w:szCs w:val="16"/>
-              </w:rPr>
-              <w:t>{quant}</w:t>
             </w:r>
           </w:p>
         </w:tc>
@@ -1959,6 +1997,45 @@
           <w:p>
             <w:pPr>
               <w:spacing w:after="0" w:line="240" w:lineRule="auto"/>
+              <w:jc w:val="right"/>
+              <w:rPr>
+                <w:rFonts w:ascii="Calibri" w:hAnsi="Calibri" w:cs="Calibri"/>
+                <w:b/>
+                <w:sz w:val="16"/>
+                <w:szCs w:val="16"/>
+              </w:rPr>
+            </w:pPr>
+            <w:r>
+              <w:rPr>
+                <w:rFonts w:ascii="Calibri" w:hAnsi="Calibri" w:cs="Calibri"/>
+                <w:b/>
+                <w:sz w:val="16"/>
+                <w:szCs w:val="16"/>
+              </w:rPr>
+              <w:t>{quant}</w:t>
+            </w:r>
+          </w:p>
+        </w:tc>
+        <w:tc>
+          <w:tcPr>
+            <w:tcW w:w="580" w:type="dxa"/>
+            <w:tcBorders>
+              <w:top w:val="nil"/>
+              <w:left w:val="nil"/>
+              <w:bottom w:val="single" w:sz="4" w:space="0" w:color="BFBFBF"/>
+              <w:right w:val="nil"/>
+            </w:tcBorders>
+            <w:vAlign w:val="center"/>
+            <w:tcMar>
+              <w:top w:w="35" w:type="dxa"/>
+              <w:left w:w="70" w:type="dxa"/>
+              <w:bottom w:w="35" w:type="dxa"/>
+              <w:right w:w="70" w:type="dxa"/>
+            </w:tcMar>
+          </w:tcPr>
+          <w:p>
+            <w:pPr>
+              <w:spacing w:after="0" w:line="240" w:lineRule="auto"/>
               <w:jc w:val="center"/>
               <w:rPr>
                 <w:rFonts w:ascii="Calibri" w:hAnsi="Calibri" w:cs="Calibri"/>
@@ -1980,7 +2057,7 @@
         </w:tc>
         <w:tc>
           <w:tcPr>
-            <w:tcW w:w="1300" w:type="dxa"/>
+            <w:tcW w:w="1200" w:type="dxa"/>
             <w:tcBorders>
               <w:top w:val="nil"/>
               <w:left w:val="nil"/>
@@ -2019,7 +2096,7 @@
         </w:tc>
         <w:tc>
           <w:tcPr>
-            <w:tcW w:w="1290" w:type="dxa"/>
+            <w:tcW w:w="1220" w:type="dxa"/>
             <w:tcBorders>
               <w:top w:val="nil"/>
               <w:left w:val="nil"/>
@@ -2060,8 +2137,8 @@
       <w:tr>
         <w:tc>
           <w:tcPr>
-            <w:tcW w:w="8070" w:type="dxa"/>
-            <w:gridSpan w:val="6"/>
+            <w:tcW w:w="7740" w:type="dxa"/>
+            <w:gridSpan w:val="7"/>
             <w:tcBorders>
               <w:top w:val="single" w:sz="4" w:space="0" w:color="BFBFBF"/>
               <w:left w:val="nil"/>
@@ -2098,7 +2175,7 @@
         </w:tc>
         <w:tc>
           <w:tcPr>
-            <w:tcW w:w="1290" w:type="dxa"/>
+            <w:tcW w:w="1220" w:type="dxa"/>
             <w:tcBorders>
               <w:top w:val="single" w:sz="4" w:space="0" w:color="BFBFBF"/>
               <w:left w:val="nil"/>
@@ -2148,7 +2225,7 @@
     </w:p>
     <w:tbl>
       <w:tblPr>
-        <w:tblW w:w="9360" w:type="dxa"/>
+        <w:tblW w:w="8960" w:type="dxa"/>
         <w:jc w:val="center"/>
         <w:tblLayout w:type="fixed"/>
         <w:tblBorders>
@@ -2162,19 +2239,20 @@
         <w:tblLook w:val="0000" w:firstRow="0" w:lastRow="0" w:firstColumn="0" w:lastColumn="0" w:noHBand="1" w:noVBand="1"/>
       </w:tblPr>
       <w:tblGrid>
+        <w:gridCol w:w="560"/>
+        <w:gridCol w:w="900"/>
+        <w:gridCol w:w="3000"/>
+        <w:gridCol w:w="850"/>
         <w:gridCol w:w="650"/>
-        <w:gridCol w:w="3800"/>
-        <w:gridCol w:w="950"/>
-        <w:gridCol w:w="720"/>
-        <w:gridCol w:w="650"/>
-        <w:gridCol w:w="1300"/>
-        <w:gridCol w:w="1290"/>
+        <w:gridCol w:w="580"/>
+        <w:gridCol w:w="1200"/>
+        <w:gridCol w:w="1220"/>
       </w:tblGrid>
       <w:tr>
         <w:tc>
           <w:tcPr>
-            <w:tcW w:w="4450" w:type="dxa"/>
-            <w:gridSpan w:val="2"/>
+            <w:tcW w:w="4460" w:type="dxa"/>
+            <w:gridSpan w:val="3"/>
             <w:shd w:val="clear" w:color="auto" w:fill="BFBFBF"/>
             <w:tcBorders>
               <w:top w:val="single" w:sz="6" w:space="0" w:color="404040"/>
@@ -2214,7 +2292,7 @@
         </w:tc>
         <w:tc>
           <w:tcPr>
-            <w:tcW w:w="4910" w:type="dxa"/>
+            <w:tcW w:w="4500" w:type="dxa"/>
             <w:gridSpan w:val="5"/>
             <w:shd w:val="clear" w:color="auto" w:fill="BFBFBF"/>
             <w:tcBorders>
@@ -2257,7 +2335,7 @@
     </w:tbl>
     <w:tbl>
       <w:tblPr>
-        <w:tblW w:w="9360" w:type="dxa"/>
+        <w:tblW w:w="8960" w:type="dxa"/>
         <w:jc w:val="center"/>
         <w:tblLayout w:type="fixed"/>
         <w:tblBorders>

</xml_diff>

<commit_message>
Polish price table header layout
</commit_message>
<xml_diff>
--- a/src/templates/modelo_proposta.docx
+++ b/src/templates/modelo_proposta.docx
@@ -1489,27 +1489,27 @@
             </w:tcBorders>
             <w:vAlign w:val="center"/>
             <w:tcMar>
-              <w:top w:w="20" w:type="dxa"/>
-              <w:left w:w="70" w:type="dxa"/>
-              <w:bottom w:w="20" w:type="dxa"/>
-              <w:right w:w="70" w:type="dxa"/>
+              <w:top w:w="8" w:type="dxa"/>
+              <w:left w:w="60" w:type="dxa"/>
+              <w:bottom w:w="8" w:type="dxa"/>
+              <w:right w:w="60" w:type="dxa"/>
             </w:tcMar>
           </w:tcPr>
           <w:p>
             <w:pPr>
-              <w:spacing w:after="0" w:line="240" w:lineRule="auto"/>
+              <w:spacing w:after="0" w:line="180" w:lineRule="auto"/>
               <w:jc w:val="center"/>
               <w:rPr>
                 <w:rFonts w:ascii="Calibri" w:hAnsi="Calibri" w:cs="Calibri"/>
-                <w:sz w:val="16"/>
-                <w:szCs w:val="16"/>
+                <w:sz w:val="14"/>
+                <w:szCs w:val="14"/>
               </w:rPr>
             </w:pPr>
             <w:r>
               <w:rPr>
                 <w:rFonts w:ascii="Calibri" w:hAnsi="Calibri" w:cs="Calibri"/>
-                <w:sz w:val="16"/>
-                <w:szCs w:val="16"/>
+                <w:sz w:val="14"/>
+                <w:szCs w:val="14"/>
               </w:rPr>
               <w:t>ITEM</w:t>
             </w:r>
@@ -1527,27 +1527,27 @@
             </w:tcBorders>
             <w:vAlign w:val="center"/>
             <w:tcMar>
-              <w:top w:w="20" w:type="dxa"/>
-              <w:left w:w="70" w:type="dxa"/>
-              <w:bottom w:w="20" w:type="dxa"/>
-              <w:right w:w="70" w:type="dxa"/>
+              <w:top w:w="8" w:type="dxa"/>
+              <w:left w:w="60" w:type="dxa"/>
+              <w:bottom w:w="8" w:type="dxa"/>
+              <w:right w:w="60" w:type="dxa"/>
             </w:tcMar>
           </w:tcPr>
           <w:p>
             <w:pPr>
-              <w:spacing w:after="0" w:line="240" w:lineRule="auto"/>
+              <w:spacing w:after="0" w:line="180" w:lineRule="auto"/>
               <w:jc w:val="center"/>
               <w:rPr>
                 <w:rFonts w:ascii="Calibri" w:hAnsi="Calibri" w:cs="Calibri"/>
-                <w:sz w:val="16"/>
-                <w:szCs w:val="16"/>
+                <w:sz w:val="14"/>
+                <w:szCs w:val="14"/>
               </w:rPr>
             </w:pPr>
             <w:r>
               <w:rPr>
                 <w:rFonts w:ascii="Calibri" w:hAnsi="Calibri" w:cs="Calibri"/>
-                <w:sz w:val="16"/>
-                <w:szCs w:val="16"/>
+                <w:sz w:val="14"/>
+                <w:szCs w:val="14"/>
               </w:rPr>
               <w:t>CÓDIGO</w:t>
             </w:r>
@@ -1565,27 +1565,27 @@
             </w:tcBorders>
             <w:vAlign w:val="center"/>
             <w:tcMar>
-              <w:top w:w="20" w:type="dxa"/>
-              <w:left w:w="70" w:type="dxa"/>
-              <w:bottom w:w="20" w:type="dxa"/>
-              <w:right w:w="70" w:type="dxa"/>
+              <w:top w:w="8" w:type="dxa"/>
+              <w:left w:w="60" w:type="dxa"/>
+              <w:bottom w:w="8" w:type="dxa"/>
+              <w:right w:w="60" w:type="dxa"/>
             </w:tcMar>
           </w:tcPr>
           <w:p>
             <w:pPr>
-              <w:spacing w:after="0" w:line="240" w:lineRule="auto"/>
+              <w:spacing w:after="0" w:line="180" w:lineRule="auto"/>
               <w:jc w:val="center"/>
               <w:rPr>
                 <w:rFonts w:ascii="Calibri" w:hAnsi="Calibri" w:cs="Calibri"/>
-                <w:sz w:val="16"/>
-                <w:szCs w:val="16"/>
+                <w:sz w:val="14"/>
+                <w:szCs w:val="14"/>
               </w:rPr>
             </w:pPr>
             <w:r>
               <w:rPr>
                 <w:rFonts w:ascii="Calibri" w:hAnsi="Calibri" w:cs="Calibri"/>
-                <w:sz w:val="16"/>
-                <w:szCs w:val="16"/>
+                <w:sz w:val="14"/>
+                <w:szCs w:val="14"/>
               </w:rPr>
               <w:t>DESCRIÇÃO DOS ITENS</w:t>
             </w:r>
@@ -1603,27 +1603,27 @@
             </w:tcBorders>
             <w:vAlign w:val="center"/>
             <w:tcMar>
-              <w:top w:w="20" w:type="dxa"/>
-              <w:left w:w="70" w:type="dxa"/>
-              <w:bottom w:w="20" w:type="dxa"/>
-              <w:right w:w="70" w:type="dxa"/>
+              <w:top w:w="8" w:type="dxa"/>
+              <w:left w:w="60" w:type="dxa"/>
+              <w:bottom w:w="8" w:type="dxa"/>
+              <w:right w:w="60" w:type="dxa"/>
             </w:tcMar>
           </w:tcPr>
           <w:p>
             <w:pPr>
-              <w:spacing w:after="0" w:line="240" w:lineRule="auto"/>
+              <w:spacing w:after="0" w:line="180" w:lineRule="auto"/>
               <w:jc w:val="center"/>
               <w:rPr>
                 <w:rFonts w:ascii="Calibri" w:hAnsi="Calibri" w:cs="Calibri"/>
-                <w:sz w:val="16"/>
-                <w:szCs w:val="16"/>
+                <w:sz w:val="14"/>
+                <w:szCs w:val="14"/>
               </w:rPr>
             </w:pPr>
             <w:r>
               <w:rPr>
                 <w:rFonts w:ascii="Calibri" w:hAnsi="Calibri" w:cs="Calibri"/>
-                <w:sz w:val="16"/>
-                <w:szCs w:val="16"/>
+                <w:sz w:val="14"/>
+                <w:szCs w:val="14"/>
               </w:rPr>
               <w:t>NCM</w:t>
             </w:r>
@@ -1641,27 +1641,27 @@
             </w:tcBorders>
             <w:vAlign w:val="center"/>
             <w:tcMar>
-              <w:top w:w="20" w:type="dxa"/>
-              <w:left w:w="70" w:type="dxa"/>
-              <w:bottom w:w="20" w:type="dxa"/>
-              <w:right w:w="70" w:type="dxa"/>
+              <w:top w:w="8" w:type="dxa"/>
+              <w:left w:w="60" w:type="dxa"/>
+              <w:bottom w:w="8" w:type="dxa"/>
+              <w:right w:w="60" w:type="dxa"/>
             </w:tcMar>
           </w:tcPr>
           <w:p>
             <w:pPr>
-              <w:spacing w:after="0" w:line="240" w:lineRule="auto"/>
+              <w:spacing w:after="0" w:line="180" w:lineRule="auto"/>
               <w:jc w:val="center"/>
               <w:rPr>
                 <w:rFonts w:ascii="Calibri" w:hAnsi="Calibri" w:cs="Calibri"/>
-                <w:sz w:val="16"/>
-                <w:szCs w:val="16"/>
+                <w:sz w:val="14"/>
+                <w:szCs w:val="14"/>
               </w:rPr>
             </w:pPr>
             <w:r>
               <w:rPr>
                 <w:rFonts w:ascii="Calibri" w:hAnsi="Calibri" w:cs="Calibri"/>
-                <w:sz w:val="16"/>
-                <w:szCs w:val="16"/>
+                <w:sz w:val="14"/>
+                <w:szCs w:val="14"/>
               </w:rPr>
               <w:t>QTD</w:t>
             </w:r>
@@ -1679,27 +1679,27 @@
             </w:tcBorders>
             <w:vAlign w:val="center"/>
             <w:tcMar>
-              <w:top w:w="20" w:type="dxa"/>
-              <w:left w:w="70" w:type="dxa"/>
-              <w:bottom w:w="20" w:type="dxa"/>
-              <w:right w:w="70" w:type="dxa"/>
+              <w:top w:w="8" w:type="dxa"/>
+              <w:left w:w="60" w:type="dxa"/>
+              <w:bottom w:w="8" w:type="dxa"/>
+              <w:right w:w="60" w:type="dxa"/>
             </w:tcMar>
           </w:tcPr>
           <w:p>
             <w:pPr>
-              <w:spacing w:after="0" w:line="240" w:lineRule="auto"/>
+              <w:spacing w:after="0" w:line="180" w:lineRule="auto"/>
               <w:jc w:val="center"/>
               <w:rPr>
                 <w:rFonts w:ascii="Calibri" w:hAnsi="Calibri" w:cs="Calibri"/>
-                <w:sz w:val="16"/>
-                <w:szCs w:val="16"/>
+                <w:sz w:val="14"/>
+                <w:szCs w:val="14"/>
               </w:rPr>
             </w:pPr>
             <w:r>
               <w:rPr>
                 <w:rFonts w:ascii="Calibri" w:hAnsi="Calibri" w:cs="Calibri"/>
-                <w:sz w:val="16"/>
-                <w:szCs w:val="16"/>
+                <w:sz w:val="14"/>
+                <w:szCs w:val="14"/>
               </w:rPr>
               <w:t>UNID.</w:t>
             </w:r>
@@ -1717,29 +1717,29 @@
             </w:tcBorders>
             <w:vAlign w:val="center"/>
             <w:tcMar>
-              <w:top w:w="20" w:type="dxa"/>
-              <w:left w:w="70" w:type="dxa"/>
-              <w:bottom w:w="20" w:type="dxa"/>
-              <w:right w:w="70" w:type="dxa"/>
+              <w:top w:w="8" w:type="dxa"/>
+              <w:left w:w="60" w:type="dxa"/>
+              <w:bottom w:w="8" w:type="dxa"/>
+              <w:right w:w="60" w:type="dxa"/>
             </w:tcMar>
           </w:tcPr>
           <w:p>
             <w:pPr>
-              <w:spacing w:after="0" w:line="240" w:lineRule="auto"/>
+              <w:spacing w:after="0" w:line="180" w:lineRule="auto"/>
               <w:jc w:val="center"/>
               <w:rPr>
                 <w:rFonts w:ascii="Calibri" w:hAnsi="Calibri" w:cs="Calibri"/>
-                <w:sz w:val="16"/>
-                <w:szCs w:val="16"/>
+                <w:sz w:val="14"/>
+                <w:szCs w:val="14"/>
               </w:rPr>
             </w:pPr>
             <w:r>
               <w:rPr>
                 <w:rFonts w:ascii="Calibri" w:hAnsi="Calibri" w:cs="Calibri"/>
-                <w:sz w:val="16"/>
-                <w:szCs w:val="16"/>
-              </w:rPr>
-              <w:t>VALOR UNIT�RIO</w:t>
+                <w:sz w:val="14"/>
+                <w:szCs w:val="14"/>
+              </w:rPr>
+              <w:t>VALOR UNT.</w:t>
             </w:r>
           </w:p>
         </w:tc>
@@ -1755,27 +1755,27 @@
             </w:tcBorders>
             <w:vAlign w:val="center"/>
             <w:tcMar>
-              <w:top w:w="20" w:type="dxa"/>
-              <w:left w:w="70" w:type="dxa"/>
-              <w:bottom w:w="20" w:type="dxa"/>
-              <w:right w:w="70" w:type="dxa"/>
+              <w:top w:w="8" w:type="dxa"/>
+              <w:left w:w="60" w:type="dxa"/>
+              <w:bottom w:w="8" w:type="dxa"/>
+              <w:right w:w="60" w:type="dxa"/>
             </w:tcMar>
           </w:tcPr>
           <w:p>
             <w:pPr>
-              <w:spacing w:after="0" w:line="240" w:lineRule="auto"/>
+              <w:spacing w:after="0" w:line="180" w:lineRule="auto"/>
               <w:jc w:val="center"/>
               <w:rPr>
                 <w:rFonts w:ascii="Calibri" w:hAnsi="Calibri" w:cs="Calibri"/>
-                <w:sz w:val="16"/>
-                <w:szCs w:val="16"/>
+                <w:sz w:val="14"/>
+                <w:szCs w:val="14"/>
               </w:rPr>
             </w:pPr>
             <w:r>
               <w:rPr>
                 <w:rFonts w:ascii="Calibri" w:hAnsi="Calibri" w:cs="Calibri"/>
-                <w:sz w:val="16"/>
-                <w:szCs w:val="16"/>
+                <w:sz w:val="14"/>
+                <w:szCs w:val="14"/>
               </w:rPr>
               <w:t>VALOR TOTAL</w:t>
             </w:r>

</xml_diff>

<commit_message>
Match reference price table layout
</commit_message>
<xml_diff>
--- a/src/templates/modelo_proposta.docx
+++ b/src/templates/modelo_proposta.docx
@@ -1453,7 +1453,7 @@
     </w:p>
     <w:tbl>
       <w:tblPr>
-        <w:tblW w:w="8960" w:type="dxa"/>
+        <w:tblW w:w="9360" w:type="dxa"/>
         <w:jc w:val="center"/>
         <w:tblLayout w:type="fixed"/>
         <w:tblBorders>
@@ -1467,19 +1467,18 @@
         <w:tblLook w:val="0000" w:firstRow="0" w:lastRow="0" w:firstColumn="0" w:lastColumn="0" w:noHBand="1" w:noVBand="1"/>
       </w:tblPr>
       <w:tblGrid>
-        <w:gridCol w:w="560"/>
-        <w:gridCol w:w="900"/>
-        <w:gridCol w:w="3000"/>
-        <w:gridCol w:w="850"/>
         <w:gridCol w:w="650"/>
-        <w:gridCol w:w="580"/>
-        <w:gridCol w:w="1200"/>
-        <w:gridCol w:w="1220"/>
+        <w:gridCol w:w="3800"/>
+        <w:gridCol w:w="950"/>
+        <w:gridCol w:w="720"/>
+        <w:gridCol w:w="650"/>
+        <w:gridCol w:w="1300"/>
+        <w:gridCol w:w="1290"/>
       </w:tblGrid>
       <w:tr>
         <w:tc>
           <w:tcPr>
-            <w:tcW w:w="560" w:type="dxa"/>
+            <w:tcW w:w="650" w:type="dxa"/>
             <w:shd w:val="clear" w:color="auto" w:fill="BFBFBF"/>
             <w:tcBorders>
               <w:top w:val="single" w:sz="6" w:space="0" w:color="404040"/>
@@ -1489,27 +1488,27 @@
             </w:tcBorders>
             <w:vAlign w:val="center"/>
             <w:tcMar>
-              <w:top w:w="8" w:type="dxa"/>
-              <w:left w:w="60" w:type="dxa"/>
-              <w:bottom w:w="8" w:type="dxa"/>
-              <w:right w:w="60" w:type="dxa"/>
+              <w:top w:w="16" w:type="dxa"/>
+              <w:left w:w="70" w:type="dxa"/>
+              <w:bottom w:w="16" w:type="dxa"/>
+              <w:right w:w="70" w:type="dxa"/>
             </w:tcMar>
           </w:tcPr>
           <w:p>
             <w:pPr>
-              <w:spacing w:after="0" w:line="180" w:lineRule="auto"/>
+              <w:spacing w:after="0" w:line="220" w:lineRule="auto"/>
               <w:jc w:val="center"/>
               <w:rPr>
                 <w:rFonts w:ascii="Calibri" w:hAnsi="Calibri" w:cs="Calibri"/>
-                <w:sz w:val="14"/>
-                <w:szCs w:val="14"/>
+                <w:sz w:val="16"/>
+                <w:szCs w:val="16"/>
               </w:rPr>
             </w:pPr>
             <w:r>
               <w:rPr>
                 <w:rFonts w:ascii="Calibri" w:hAnsi="Calibri" w:cs="Calibri"/>
-                <w:sz w:val="14"/>
-                <w:szCs w:val="14"/>
+                <w:sz w:val="16"/>
+                <w:szCs w:val="16"/>
               </w:rPr>
               <w:t>ITEM</w:t>
             </w:r>
@@ -1517,7 +1516,7 @@
         </w:tc>
         <w:tc>
           <w:tcPr>
-            <w:tcW w:w="900" w:type="dxa"/>
+            <w:tcW w:w="3800" w:type="dxa"/>
             <w:shd w:val="clear" w:color="auto" w:fill="BFBFBF"/>
             <w:tcBorders>
               <w:top w:val="single" w:sz="6" w:space="0" w:color="404040"/>
@@ -1527,35 +1526,35 @@
             </w:tcBorders>
             <w:vAlign w:val="center"/>
             <w:tcMar>
-              <w:top w:w="8" w:type="dxa"/>
-              <w:left w:w="60" w:type="dxa"/>
-              <w:bottom w:w="8" w:type="dxa"/>
-              <w:right w:w="60" w:type="dxa"/>
+              <w:top w:w="16" w:type="dxa"/>
+              <w:left w:w="70" w:type="dxa"/>
+              <w:bottom w:w="16" w:type="dxa"/>
+              <w:right w:w="70" w:type="dxa"/>
             </w:tcMar>
           </w:tcPr>
           <w:p>
             <w:pPr>
-              <w:spacing w:after="0" w:line="180" w:lineRule="auto"/>
+              <w:spacing w:after="0" w:line="220" w:lineRule="auto"/>
               <w:jc w:val="center"/>
               <w:rPr>
                 <w:rFonts w:ascii="Calibri" w:hAnsi="Calibri" w:cs="Calibri"/>
-                <w:sz w:val="14"/>
-                <w:szCs w:val="14"/>
+                <w:sz w:val="16"/>
+                <w:szCs w:val="16"/>
               </w:rPr>
             </w:pPr>
             <w:r>
               <w:rPr>
                 <w:rFonts w:ascii="Calibri" w:hAnsi="Calibri" w:cs="Calibri"/>
-                <w:sz w:val="14"/>
-                <w:szCs w:val="14"/>
-              </w:rPr>
-              <w:t>CÓDIGO</w:t>
+                <w:sz w:val="16"/>
+                <w:szCs w:val="16"/>
+              </w:rPr>
+              <w:t>DESCRIÇÃO DOS ITENS</w:t>
             </w:r>
           </w:p>
         </w:tc>
         <w:tc>
           <w:tcPr>
-            <w:tcW w:w="3000" w:type="dxa"/>
+            <w:tcW w:w="950" w:type="dxa"/>
             <w:shd w:val="clear" w:color="auto" w:fill="BFBFBF"/>
             <w:tcBorders>
               <w:top w:val="single" w:sz="6" w:space="0" w:color="404040"/>
@@ -1565,35 +1564,35 @@
             </w:tcBorders>
             <w:vAlign w:val="center"/>
             <w:tcMar>
-              <w:top w:w="8" w:type="dxa"/>
-              <w:left w:w="60" w:type="dxa"/>
-              <w:bottom w:w="8" w:type="dxa"/>
-              <w:right w:w="60" w:type="dxa"/>
+              <w:top w:w="16" w:type="dxa"/>
+              <w:left w:w="70" w:type="dxa"/>
+              <w:bottom w:w="16" w:type="dxa"/>
+              <w:right w:w="70" w:type="dxa"/>
             </w:tcMar>
           </w:tcPr>
           <w:p>
             <w:pPr>
-              <w:spacing w:after="0" w:line="180" w:lineRule="auto"/>
+              <w:spacing w:after="0" w:line="220" w:lineRule="auto"/>
               <w:jc w:val="center"/>
               <w:rPr>
                 <w:rFonts w:ascii="Calibri" w:hAnsi="Calibri" w:cs="Calibri"/>
-                <w:sz w:val="14"/>
-                <w:szCs w:val="14"/>
+                <w:sz w:val="16"/>
+                <w:szCs w:val="16"/>
               </w:rPr>
             </w:pPr>
             <w:r>
               <w:rPr>
                 <w:rFonts w:ascii="Calibri" w:hAnsi="Calibri" w:cs="Calibri"/>
-                <w:sz w:val="14"/>
-                <w:szCs w:val="14"/>
-              </w:rPr>
-              <w:t>DESCRIÇÃO DOS ITENS</w:t>
+                <w:sz w:val="16"/>
+                <w:szCs w:val="16"/>
+              </w:rPr>
+              <w:t>NCM</w:t>
             </w:r>
           </w:p>
         </w:tc>
         <w:tc>
           <w:tcPr>
-            <w:tcW w:w="850" w:type="dxa"/>
+            <w:tcW w:w="720" w:type="dxa"/>
             <w:shd w:val="clear" w:color="auto" w:fill="BFBFBF"/>
             <w:tcBorders>
               <w:top w:val="single" w:sz="6" w:space="0" w:color="404040"/>
@@ -1603,29 +1602,29 @@
             </w:tcBorders>
             <w:vAlign w:val="center"/>
             <w:tcMar>
-              <w:top w:w="8" w:type="dxa"/>
-              <w:left w:w="60" w:type="dxa"/>
-              <w:bottom w:w="8" w:type="dxa"/>
-              <w:right w:w="60" w:type="dxa"/>
+              <w:top w:w="16" w:type="dxa"/>
+              <w:left w:w="70" w:type="dxa"/>
+              <w:bottom w:w="16" w:type="dxa"/>
+              <w:right w:w="70" w:type="dxa"/>
             </w:tcMar>
           </w:tcPr>
           <w:p>
             <w:pPr>
-              <w:spacing w:after="0" w:line="180" w:lineRule="auto"/>
+              <w:spacing w:after="0" w:line="220" w:lineRule="auto"/>
               <w:jc w:val="center"/>
               <w:rPr>
                 <w:rFonts w:ascii="Calibri" w:hAnsi="Calibri" w:cs="Calibri"/>
-                <w:sz w:val="14"/>
-                <w:szCs w:val="14"/>
+                <w:sz w:val="16"/>
+                <w:szCs w:val="16"/>
               </w:rPr>
             </w:pPr>
             <w:r>
               <w:rPr>
                 <w:rFonts w:ascii="Calibri" w:hAnsi="Calibri" w:cs="Calibri"/>
-                <w:sz w:val="14"/>
-                <w:szCs w:val="14"/>
-              </w:rPr>
-              <w:t>NCM</w:t>
+                <w:sz w:val="16"/>
+                <w:szCs w:val="16"/>
+              </w:rPr>
+              <w:t>QTD</w:t>
             </w:r>
           </w:p>
         </w:tc>
@@ -1641,35 +1640,35 @@
             </w:tcBorders>
             <w:vAlign w:val="center"/>
             <w:tcMar>
-              <w:top w:w="8" w:type="dxa"/>
-              <w:left w:w="60" w:type="dxa"/>
-              <w:bottom w:w="8" w:type="dxa"/>
-              <w:right w:w="60" w:type="dxa"/>
+              <w:top w:w="16" w:type="dxa"/>
+              <w:left w:w="70" w:type="dxa"/>
+              <w:bottom w:w="16" w:type="dxa"/>
+              <w:right w:w="70" w:type="dxa"/>
             </w:tcMar>
           </w:tcPr>
           <w:p>
             <w:pPr>
-              <w:spacing w:after="0" w:line="180" w:lineRule="auto"/>
+              <w:spacing w:after="0" w:line="220" w:lineRule="auto"/>
               <w:jc w:val="center"/>
               <w:rPr>
                 <w:rFonts w:ascii="Calibri" w:hAnsi="Calibri" w:cs="Calibri"/>
-                <w:sz w:val="14"/>
-                <w:szCs w:val="14"/>
+                <w:sz w:val="16"/>
+                <w:szCs w:val="16"/>
               </w:rPr>
             </w:pPr>
             <w:r>
               <w:rPr>
                 <w:rFonts w:ascii="Calibri" w:hAnsi="Calibri" w:cs="Calibri"/>
-                <w:sz w:val="14"/>
-                <w:szCs w:val="14"/>
-              </w:rPr>
-              <w:t>QTD</w:t>
+                <w:sz w:val="16"/>
+                <w:szCs w:val="16"/>
+              </w:rPr>
+              <w:t>UNID.</w:t>
             </w:r>
           </w:p>
         </w:tc>
         <w:tc>
           <w:tcPr>
-            <w:tcW w:w="580" w:type="dxa"/>
+            <w:tcW w:w="1300" w:type="dxa"/>
             <w:shd w:val="clear" w:color="auto" w:fill="BFBFBF"/>
             <w:tcBorders>
               <w:top w:val="single" w:sz="6" w:space="0" w:color="404040"/>
@@ -1679,35 +1678,35 @@
             </w:tcBorders>
             <w:vAlign w:val="center"/>
             <w:tcMar>
-              <w:top w:w="8" w:type="dxa"/>
-              <w:left w:w="60" w:type="dxa"/>
-              <w:bottom w:w="8" w:type="dxa"/>
-              <w:right w:w="60" w:type="dxa"/>
+              <w:top w:w="16" w:type="dxa"/>
+              <w:left w:w="70" w:type="dxa"/>
+              <w:bottom w:w="16" w:type="dxa"/>
+              <w:right w:w="70" w:type="dxa"/>
             </w:tcMar>
           </w:tcPr>
           <w:p>
             <w:pPr>
-              <w:spacing w:after="0" w:line="180" w:lineRule="auto"/>
+              <w:spacing w:after="0" w:line="220" w:lineRule="auto"/>
               <w:jc w:val="center"/>
               <w:rPr>
                 <w:rFonts w:ascii="Calibri" w:hAnsi="Calibri" w:cs="Calibri"/>
-                <w:sz w:val="14"/>
-                <w:szCs w:val="14"/>
+                <w:sz w:val="16"/>
+                <w:szCs w:val="16"/>
               </w:rPr>
             </w:pPr>
             <w:r>
               <w:rPr>
                 <w:rFonts w:ascii="Calibri" w:hAnsi="Calibri" w:cs="Calibri"/>
-                <w:sz w:val="14"/>
-                <w:szCs w:val="14"/>
-              </w:rPr>
-              <w:t>UNID.</w:t>
+                <w:sz w:val="16"/>
+                <w:szCs w:val="16"/>
+              </w:rPr>
+              <w:t>VALOR UNITÁRIO</w:t>
             </w:r>
           </w:p>
         </w:tc>
         <w:tc>
           <w:tcPr>
-            <w:tcW w:w="1200" w:type="dxa"/>
+            <w:tcW w:w="1290" w:type="dxa"/>
             <w:shd w:val="clear" w:color="auto" w:fill="BFBFBF"/>
             <w:tcBorders>
               <w:top w:val="single" w:sz="6" w:space="0" w:color="404040"/>
@@ -1717,65 +1716,27 @@
             </w:tcBorders>
             <w:vAlign w:val="center"/>
             <w:tcMar>
-              <w:top w:w="8" w:type="dxa"/>
-              <w:left w:w="60" w:type="dxa"/>
-              <w:bottom w:w="8" w:type="dxa"/>
-              <w:right w:w="60" w:type="dxa"/>
+              <w:top w:w="16" w:type="dxa"/>
+              <w:left w:w="70" w:type="dxa"/>
+              <w:bottom w:w="16" w:type="dxa"/>
+              <w:right w:w="70" w:type="dxa"/>
             </w:tcMar>
           </w:tcPr>
           <w:p>
             <w:pPr>
-              <w:spacing w:after="0" w:line="180" w:lineRule="auto"/>
+              <w:spacing w:after="0" w:line="220" w:lineRule="auto"/>
               <w:jc w:val="center"/>
               <w:rPr>
                 <w:rFonts w:ascii="Calibri" w:hAnsi="Calibri" w:cs="Calibri"/>
-                <w:sz w:val="14"/>
-                <w:szCs w:val="14"/>
+                <w:sz w:val="16"/>
+                <w:szCs w:val="16"/>
               </w:rPr>
             </w:pPr>
             <w:r>
               <w:rPr>
                 <w:rFonts w:ascii="Calibri" w:hAnsi="Calibri" w:cs="Calibri"/>
-                <w:sz w:val="14"/>
-                <w:szCs w:val="14"/>
-              </w:rPr>
-              <w:t>VALOR UNT.</w:t>
-            </w:r>
-          </w:p>
-        </w:tc>
-        <w:tc>
-          <w:tcPr>
-            <w:tcW w:w="1220" w:type="dxa"/>
-            <w:shd w:val="clear" w:color="auto" w:fill="BFBFBF"/>
-            <w:tcBorders>
-              <w:top w:val="single" w:sz="6" w:space="0" w:color="404040"/>
-              <w:left w:val="single" w:sz="4" w:space="0" w:color="7F7F7F"/>
-              <w:bottom w:val="single" w:sz="6" w:space="0" w:color="404040"/>
-              <w:right w:val="single" w:sz="4" w:space="0" w:color="7F7F7F"/>
-            </w:tcBorders>
-            <w:vAlign w:val="center"/>
-            <w:tcMar>
-              <w:top w:w="8" w:type="dxa"/>
-              <w:left w:w="60" w:type="dxa"/>
-              <w:bottom w:w="8" w:type="dxa"/>
-              <w:right w:w="60" w:type="dxa"/>
-            </w:tcMar>
-          </w:tcPr>
-          <w:p>
-            <w:pPr>
-              <w:spacing w:after="0" w:line="180" w:lineRule="auto"/>
-              <w:jc w:val="center"/>
-              <w:rPr>
-                <w:rFonts w:ascii="Calibri" w:hAnsi="Calibri" w:cs="Calibri"/>
-                <w:sz w:val="14"/>
-                <w:szCs w:val="14"/>
-              </w:rPr>
-            </w:pPr>
-            <w:r>
-              <w:rPr>
-                <w:rFonts w:ascii="Calibri" w:hAnsi="Calibri" w:cs="Calibri"/>
-                <w:sz w:val="14"/>
-                <w:szCs w:val="14"/>
+                <w:sz w:val="16"/>
+                <w:szCs w:val="16"/>
               </w:rPr>
               <w:t>VALOR TOTAL</w:t>
             </w:r>
@@ -1785,8 +1746,8 @@
       <w:tr>
         <w:tc>
           <w:tcPr>
-            <w:tcW w:w="8960" w:type="dxa"/>
-            <w:gridSpan w:val="8"/>
+            <w:tcW w:w="9360" w:type="dxa"/>
+            <w:gridSpan w:val="7"/>
             <w:tcBorders>
               <w:top w:val="nil"/>
               <w:left w:val="nil"/>
@@ -1826,7 +1787,7 @@
       <w:tr>
         <w:tc>
           <w:tcPr>
-            <w:tcW w:w="560" w:type="dxa"/>
+            <w:tcW w:w="650" w:type="dxa"/>
             <w:tcBorders>
               <w:top w:val="nil"/>
               <w:left w:val="nil"/>
@@ -1864,7 +1825,7 @@
         </w:tc>
         <w:tc>
           <w:tcPr>
-            <w:tcW w:w="900" w:type="dxa"/>
+            <w:tcW w:w="3800" w:type="dxa"/>
             <w:tcBorders>
               <w:top w:val="nil"/>
               <w:left w:val="nil"/>
@@ -1896,51 +1857,13 @@
                 <w:sz w:val="16"/>
                 <w:szCs w:val="16"/>
               </w:rPr>
-              <w:t>{codigo}</w:t>
+              <w:t>{codigo_descricao}</w:t>
             </w:r>
           </w:p>
         </w:tc>
         <w:tc>
           <w:tcPr>
-            <w:tcW w:w="3000" w:type="dxa"/>
-            <w:tcBorders>
-              <w:top w:val="nil"/>
-              <w:left w:val="nil"/>
-              <w:bottom w:val="single" w:sz="4" w:space="0" w:color="BFBFBF"/>
-              <w:right w:val="nil"/>
-            </w:tcBorders>
-            <w:vAlign w:val="center"/>
-            <w:tcMar>
-              <w:top w:w="35" w:type="dxa"/>
-              <w:left w:w="70" w:type="dxa"/>
-              <w:bottom w:w="35" w:type="dxa"/>
-              <w:right w:w="70" w:type="dxa"/>
-            </w:tcMar>
-          </w:tcPr>
-          <w:p>
-            <w:pPr>
-              <w:spacing w:after="0" w:line="240" w:lineRule="auto"/>
-              <w:rPr>
-                <w:rFonts w:ascii="Calibri" w:hAnsi="Calibri" w:cs="Calibri"/>
-                <w:b/>
-                <w:sz w:val="16"/>
-                <w:szCs w:val="16"/>
-              </w:rPr>
-            </w:pPr>
-            <w:r>
-              <w:rPr>
-                <w:rFonts w:ascii="Calibri" w:hAnsi="Calibri" w:cs="Calibri"/>
-                <w:b/>
-                <w:sz w:val="16"/>
-                <w:szCs w:val="16"/>
-              </w:rPr>
-              <w:t>{descricao}</w:t>
-            </w:r>
-          </w:p>
-        </w:tc>
-        <w:tc>
-          <w:tcPr>
-            <w:tcW w:w="850" w:type="dxa"/>
+            <w:tcW w:w="950" w:type="dxa"/>
             <w:tcBorders>
               <w:top w:val="nil"/>
               <w:left w:val="nil"/>
@@ -1974,6 +1897,45 @@
                 <w:szCs w:val="16"/>
               </w:rPr>
               <w:t>{ncm}</w:t>
+            </w:r>
+          </w:p>
+        </w:tc>
+        <w:tc>
+          <w:tcPr>
+            <w:tcW w:w="720" w:type="dxa"/>
+            <w:tcBorders>
+              <w:top w:val="nil"/>
+              <w:left w:val="nil"/>
+              <w:bottom w:val="single" w:sz="4" w:space="0" w:color="BFBFBF"/>
+              <w:right w:val="nil"/>
+            </w:tcBorders>
+            <w:vAlign w:val="center"/>
+            <w:tcMar>
+              <w:top w:w="35" w:type="dxa"/>
+              <w:left w:w="70" w:type="dxa"/>
+              <w:bottom w:w="35" w:type="dxa"/>
+              <w:right w:w="70" w:type="dxa"/>
+            </w:tcMar>
+          </w:tcPr>
+          <w:p>
+            <w:pPr>
+              <w:spacing w:after="0" w:line="240" w:lineRule="auto"/>
+              <w:jc w:val="right"/>
+              <w:rPr>
+                <w:rFonts w:ascii="Calibri" w:hAnsi="Calibri" w:cs="Calibri"/>
+                <w:b/>
+                <w:sz w:val="16"/>
+                <w:szCs w:val="16"/>
+              </w:rPr>
+            </w:pPr>
+            <w:r>
+              <w:rPr>
+                <w:rFonts w:ascii="Calibri" w:hAnsi="Calibri" w:cs="Calibri"/>
+                <w:b/>
+                <w:sz w:val="16"/>
+                <w:szCs w:val="16"/>
+              </w:rPr>
+              <w:t>{quant}</w:t>
             </w:r>
           </w:p>
         </w:tc>
@@ -1997,45 +1959,6 @@
           <w:p>
             <w:pPr>
               <w:spacing w:after="0" w:line="240" w:lineRule="auto"/>
-              <w:jc w:val="right"/>
-              <w:rPr>
-                <w:rFonts w:ascii="Calibri" w:hAnsi="Calibri" w:cs="Calibri"/>
-                <w:b/>
-                <w:sz w:val="16"/>
-                <w:szCs w:val="16"/>
-              </w:rPr>
-            </w:pPr>
-            <w:r>
-              <w:rPr>
-                <w:rFonts w:ascii="Calibri" w:hAnsi="Calibri" w:cs="Calibri"/>
-                <w:b/>
-                <w:sz w:val="16"/>
-                <w:szCs w:val="16"/>
-              </w:rPr>
-              <w:t>{quant}</w:t>
-            </w:r>
-          </w:p>
-        </w:tc>
-        <w:tc>
-          <w:tcPr>
-            <w:tcW w:w="580" w:type="dxa"/>
-            <w:tcBorders>
-              <w:top w:val="nil"/>
-              <w:left w:val="nil"/>
-              <w:bottom w:val="single" w:sz="4" w:space="0" w:color="BFBFBF"/>
-              <w:right w:val="nil"/>
-            </w:tcBorders>
-            <w:vAlign w:val="center"/>
-            <w:tcMar>
-              <w:top w:w="35" w:type="dxa"/>
-              <w:left w:w="70" w:type="dxa"/>
-              <w:bottom w:w="35" w:type="dxa"/>
-              <w:right w:w="70" w:type="dxa"/>
-            </w:tcMar>
-          </w:tcPr>
-          <w:p>
-            <w:pPr>
-              <w:spacing w:after="0" w:line="240" w:lineRule="auto"/>
               <w:jc w:val="center"/>
               <w:rPr>
                 <w:rFonts w:ascii="Calibri" w:hAnsi="Calibri" w:cs="Calibri"/>
@@ -2057,7 +1980,7 @@
         </w:tc>
         <w:tc>
           <w:tcPr>
-            <w:tcW w:w="1200" w:type="dxa"/>
+            <w:tcW w:w="1300" w:type="dxa"/>
             <w:tcBorders>
               <w:top w:val="nil"/>
               <w:left w:val="nil"/>
@@ -2096,7 +2019,7 @@
         </w:tc>
         <w:tc>
           <w:tcPr>
-            <w:tcW w:w="1220" w:type="dxa"/>
+            <w:tcW w:w="1290" w:type="dxa"/>
             <w:tcBorders>
               <w:top w:val="nil"/>
               <w:left w:val="nil"/>
@@ -2137,8 +2060,8 @@
       <w:tr>
         <w:tc>
           <w:tcPr>
-            <w:tcW w:w="7740" w:type="dxa"/>
-            <w:gridSpan w:val="7"/>
+            <w:tcW w:w="8070" w:type="dxa"/>
+            <w:gridSpan w:val="6"/>
             <w:tcBorders>
               <w:top w:val="single" w:sz="4" w:space="0" w:color="BFBFBF"/>
               <w:left w:val="nil"/>
@@ -2175,7 +2098,7 @@
         </w:tc>
         <w:tc>
           <w:tcPr>
-            <w:tcW w:w="1220" w:type="dxa"/>
+            <w:tcW w:w="1290" w:type="dxa"/>
             <w:tcBorders>
               <w:top w:val="single" w:sz="4" w:space="0" w:color="BFBFBF"/>
               <w:left w:val="nil"/>
@@ -2225,7 +2148,7 @@
     </w:p>
     <w:tbl>
       <w:tblPr>
-        <w:tblW w:w="8960" w:type="dxa"/>
+        <w:tblW w:w="9360" w:type="dxa"/>
         <w:jc w:val="center"/>
         <w:tblLayout w:type="fixed"/>
         <w:tblBorders>
@@ -2239,20 +2162,19 @@
         <w:tblLook w:val="0000" w:firstRow="0" w:lastRow="0" w:firstColumn="0" w:lastColumn="0" w:noHBand="1" w:noVBand="1"/>
       </w:tblPr>
       <w:tblGrid>
-        <w:gridCol w:w="560"/>
-        <w:gridCol w:w="900"/>
-        <w:gridCol w:w="3000"/>
-        <w:gridCol w:w="850"/>
         <w:gridCol w:w="650"/>
-        <w:gridCol w:w="580"/>
-        <w:gridCol w:w="1200"/>
-        <w:gridCol w:w="1220"/>
+        <w:gridCol w:w="3800"/>
+        <w:gridCol w:w="950"/>
+        <w:gridCol w:w="720"/>
+        <w:gridCol w:w="650"/>
+        <w:gridCol w:w="1300"/>
+        <w:gridCol w:w="1290"/>
       </w:tblGrid>
       <w:tr>
         <w:tc>
           <w:tcPr>
-            <w:tcW w:w="4460" w:type="dxa"/>
-            <w:gridSpan w:val="3"/>
+            <w:tcW w:w="4450" w:type="dxa"/>
+            <w:gridSpan w:val="2"/>
             <w:shd w:val="clear" w:color="auto" w:fill="BFBFBF"/>
             <w:tcBorders>
               <w:top w:val="single" w:sz="6" w:space="0" w:color="404040"/>
@@ -2292,7 +2214,7 @@
         </w:tc>
         <w:tc>
           <w:tcPr>
-            <w:tcW w:w="4500" w:type="dxa"/>
+            <w:tcW w:w="4910" w:type="dxa"/>
             <w:gridSpan w:val="5"/>
             <w:shd w:val="clear" w:color="auto" w:fill="BFBFBF"/>
             <w:tcBorders>
@@ -2335,7 +2257,7 @@
     </w:tbl>
     <w:tbl>
       <w:tblPr>
-        <w:tblW w:w="8960" w:type="dxa"/>
+        <w:tblW w:w="9360" w:type="dxa"/>
         <w:jc w:val="center"/>
         <w:tblLayout w:type="fixed"/>
         <w:tblBorders>

</xml_diff>

<commit_message>
Center price table with code column
</commit_message>
<xml_diff>
--- a/src/templates/modelo_proposta.docx
+++ b/src/templates/modelo_proposta.docx
@@ -1468,12 +1468,13 @@
       </w:tblPr>
       <w:tblGrid>
         <w:gridCol w:w="650"/>
-        <w:gridCol w:w="3800"/>
-        <w:gridCol w:w="950"/>
+        <w:gridCol w:w="760"/>
+        <w:gridCol w:w="3040"/>
+        <w:gridCol w:w="900"/>
         <w:gridCol w:w="720"/>
         <w:gridCol w:w="650"/>
         <w:gridCol w:w="1300"/>
-        <w:gridCol w:w="1290"/>
+        <w:gridCol w:w="1340"/>
       </w:tblGrid>
       <w:tr>
         <w:tc>
@@ -1516,7 +1517,7 @@
         </w:tc>
         <w:tc>
           <w:tcPr>
-            <w:tcW w:w="3800" w:type="dxa"/>
+            <w:tcW w:w="760" w:type="dxa"/>
             <w:shd w:val="clear" w:color="auto" w:fill="BFBFBF"/>
             <w:tcBorders>
               <w:top w:val="single" w:sz="6" w:space="0" w:color="404040"/>
@@ -1548,13 +1549,51 @@
                 <w:sz w:val="16"/>
                 <w:szCs w:val="16"/>
               </w:rPr>
+              <w:t>CÓDIGO</w:t>
+            </w:r>
+          </w:p>
+        </w:tc>
+        <w:tc>
+          <w:tcPr>
+            <w:tcW w:w="3040" w:type="dxa"/>
+            <w:shd w:val="clear" w:color="auto" w:fill="BFBFBF"/>
+            <w:tcBorders>
+              <w:top w:val="single" w:sz="6" w:space="0" w:color="404040"/>
+              <w:left w:val="single" w:sz="4" w:space="0" w:color="7F7F7F"/>
+              <w:bottom w:val="single" w:sz="6" w:space="0" w:color="404040"/>
+              <w:right w:val="single" w:sz="4" w:space="0" w:color="7F7F7F"/>
+            </w:tcBorders>
+            <w:vAlign w:val="center"/>
+            <w:tcMar>
+              <w:top w:w="16" w:type="dxa"/>
+              <w:left w:w="70" w:type="dxa"/>
+              <w:bottom w:w="16" w:type="dxa"/>
+              <w:right w:w="70" w:type="dxa"/>
+            </w:tcMar>
+          </w:tcPr>
+          <w:p>
+            <w:pPr>
+              <w:spacing w:after="0" w:line="220" w:lineRule="auto"/>
+              <w:jc w:val="center"/>
+              <w:rPr>
+                <w:rFonts w:ascii="Calibri" w:hAnsi="Calibri" w:cs="Calibri"/>
+                <w:sz w:val="16"/>
+                <w:szCs w:val="16"/>
+              </w:rPr>
+            </w:pPr>
+            <w:r>
+              <w:rPr>
+                <w:rFonts w:ascii="Calibri" w:hAnsi="Calibri" w:cs="Calibri"/>
+                <w:sz w:val="16"/>
+                <w:szCs w:val="16"/>
+              </w:rPr>
               <w:t>DESCRIÇÃO DOS ITENS</w:t>
             </w:r>
           </w:p>
         </w:tc>
         <w:tc>
           <w:tcPr>
-            <w:tcW w:w="950" w:type="dxa"/>
+            <w:tcW w:w="900" w:type="dxa"/>
             <w:shd w:val="clear" w:color="auto" w:fill="BFBFBF"/>
             <w:tcBorders>
               <w:top w:val="single" w:sz="6" w:space="0" w:color="404040"/>
@@ -1706,7 +1745,7 @@
         </w:tc>
         <w:tc>
           <w:tcPr>
-            <w:tcW w:w="1290" w:type="dxa"/>
+            <w:tcW w:w="1340" w:type="dxa"/>
             <w:shd w:val="clear" w:color="auto" w:fill="BFBFBF"/>
             <w:tcBorders>
               <w:top w:val="single" w:sz="6" w:space="0" w:color="404040"/>
@@ -1747,7 +1786,7 @@
         <w:tc>
           <w:tcPr>
             <w:tcW w:w="9360" w:type="dxa"/>
-            <w:gridSpan w:val="7"/>
+            <w:gridSpan w:val="8"/>
             <w:tcBorders>
               <w:top w:val="nil"/>
               <w:left w:val="nil"/>
@@ -1805,6 +1844,7 @@
           <w:p>
             <w:pPr>
               <w:spacing w:after="0" w:line="240" w:lineRule="auto"/>
+              <w:jc w:val="center"/>
               <w:rPr>
                 <w:rFonts w:ascii="Calibri" w:hAnsi="Calibri" w:cs="Calibri"/>
                 <w:b/>
@@ -1825,7 +1865,7 @@
         </w:tc>
         <w:tc>
           <w:tcPr>
-            <w:tcW w:w="3800" w:type="dxa"/>
+            <w:tcW w:w="760" w:type="dxa"/>
             <w:tcBorders>
               <w:top w:val="nil"/>
               <w:left w:val="nil"/>
@@ -1843,6 +1883,7 @@
           <w:p>
             <w:pPr>
               <w:spacing w:after="0" w:line="240" w:lineRule="auto"/>
+              <w:jc w:val="center"/>
               <w:rPr>
                 <w:rFonts w:ascii="Calibri" w:hAnsi="Calibri" w:cs="Calibri"/>
                 <w:b/>
@@ -1857,13 +1898,52 @@
                 <w:sz w:val="16"/>
                 <w:szCs w:val="16"/>
               </w:rPr>
-              <w:t>{codigo_descricao}</w:t>
+              <w:t>{codigo}</w:t>
             </w:r>
           </w:p>
         </w:tc>
         <w:tc>
           <w:tcPr>
-            <w:tcW w:w="950" w:type="dxa"/>
+            <w:tcW w:w="3040" w:type="dxa"/>
+            <w:tcBorders>
+              <w:top w:val="nil"/>
+              <w:left w:val="nil"/>
+              <w:bottom w:val="single" w:sz="4" w:space="0" w:color="BFBFBF"/>
+              <w:right w:val="nil"/>
+            </w:tcBorders>
+            <w:vAlign w:val="center"/>
+            <w:tcMar>
+              <w:top w:w="35" w:type="dxa"/>
+              <w:left w:w="70" w:type="dxa"/>
+              <w:bottom w:w="35" w:type="dxa"/>
+              <w:right w:w="70" w:type="dxa"/>
+            </w:tcMar>
+          </w:tcPr>
+          <w:p>
+            <w:pPr>
+              <w:spacing w:after="0" w:line="240" w:lineRule="auto"/>
+              <w:jc w:val="center"/>
+              <w:rPr>
+                <w:rFonts w:ascii="Calibri" w:hAnsi="Calibri" w:cs="Calibri"/>
+                <w:b/>
+                <w:sz w:val="16"/>
+                <w:szCs w:val="16"/>
+              </w:rPr>
+            </w:pPr>
+            <w:r>
+              <w:rPr>
+                <w:rFonts w:ascii="Calibri" w:hAnsi="Calibri" w:cs="Calibri"/>
+                <w:b/>
+                <w:sz w:val="16"/>
+                <w:szCs w:val="16"/>
+              </w:rPr>
+              <w:t>{descricao}</w:t>
+            </w:r>
+          </w:p>
+        </w:tc>
+        <w:tc>
+          <w:tcPr>
+            <w:tcW w:w="900" w:type="dxa"/>
             <w:tcBorders>
               <w:top w:val="nil"/>
               <w:left w:val="nil"/>
@@ -1920,7 +2000,7 @@
           <w:p>
             <w:pPr>
               <w:spacing w:after="0" w:line="240" w:lineRule="auto"/>
-              <w:jc w:val="right"/>
+              <w:jc w:val="center"/>
               <w:rPr>
                 <w:rFonts w:ascii="Calibri" w:hAnsi="Calibri" w:cs="Calibri"/>
                 <w:b/>
@@ -1998,7 +2078,7 @@
           <w:p>
             <w:pPr>
               <w:spacing w:after="0" w:line="240" w:lineRule="auto"/>
-              <w:jc w:val="right"/>
+              <w:jc w:val="center"/>
               <w:rPr>
                 <w:rFonts w:ascii="Calibri" w:hAnsi="Calibri" w:cs="Calibri"/>
                 <w:b/>
@@ -2019,7 +2099,7 @@
         </w:tc>
         <w:tc>
           <w:tcPr>
-            <w:tcW w:w="1290" w:type="dxa"/>
+            <w:tcW w:w="1340" w:type="dxa"/>
             <w:tcBorders>
               <w:top w:val="nil"/>
               <w:left w:val="nil"/>
@@ -2037,7 +2117,7 @@
           <w:p>
             <w:pPr>
               <w:spacing w:after="0" w:line="240" w:lineRule="auto"/>
-              <w:jc w:val="right"/>
+              <w:jc w:val="center"/>
               <w:rPr>
                 <w:rFonts w:ascii="Calibri" w:hAnsi="Calibri" w:cs="Calibri"/>
                 <w:b/>
@@ -2060,8 +2140,8 @@
       <w:tr>
         <w:tc>
           <w:tcPr>
-            <w:tcW w:w="8070" w:type="dxa"/>
-            <w:gridSpan w:val="6"/>
+            <w:tcW w:w="8020" w:type="dxa"/>
+            <w:gridSpan w:val="7"/>
             <w:tcBorders>
               <w:top w:val="single" w:sz="4" w:space="0" w:color="BFBFBF"/>
               <w:left w:val="nil"/>
@@ -2098,7 +2178,7 @@
         </w:tc>
         <w:tc>
           <w:tcPr>
-            <w:tcW w:w="1290" w:type="dxa"/>
+            <w:tcW w:w="1340" w:type="dxa"/>
             <w:tcBorders>
               <w:top w:val="single" w:sz="4" w:space="0" w:color="BFBFBF"/>
               <w:left w:val="nil"/>
@@ -2163,18 +2243,19 @@
       </w:tblPr>
       <w:tblGrid>
         <w:gridCol w:w="650"/>
-        <w:gridCol w:w="3800"/>
-        <w:gridCol w:w="950"/>
+        <w:gridCol w:w="760"/>
+        <w:gridCol w:w="3040"/>
+        <w:gridCol w:w="900"/>
         <w:gridCol w:w="720"/>
         <w:gridCol w:w="650"/>
         <w:gridCol w:w="1300"/>
-        <w:gridCol w:w="1290"/>
+        <w:gridCol w:w="1340"/>
       </w:tblGrid>
       <w:tr>
         <w:tc>
           <w:tcPr>
             <w:tcW w:w="4450" w:type="dxa"/>
-            <w:gridSpan w:val="2"/>
+            <w:gridSpan w:val="3"/>
             <w:shd w:val="clear" w:color="auto" w:fill="BFBFBF"/>
             <w:tcBorders>
               <w:top w:val="single" w:sz="6" w:space="0" w:color="404040"/>

</xml_diff>

<commit_message>
Release 1.0.2 proposal form updates
</commit_message>
<xml_diff>
--- a/src/templates/modelo_proposta.docx
+++ b/src/templates/modelo_proposta.docx
@@ -586,8 +586,6 @@
               <w:ind w:left="-108"/>
               <w:rPr>
                 <w:rFonts w:ascii="Calibri" w:hAnsi="Calibri" w:cs="Calibri"/>
-                <w:b/>
-                <w:bCs/>
                 <w:sz w:val="16"/>
                 <w:szCs w:val="16"/>
               </w:rPr>
@@ -595,8 +593,6 @@
             <w:r>
               <w:rPr>
                 <w:rFonts w:ascii="Calibri" w:hAnsi="Calibri" w:cs="Calibri"/>
-                <w:b/>
-                <w:bCs/>
                 <w:sz w:val="16"/>
                 <w:szCs w:val="16"/>
               </w:rPr>
@@ -1246,7 +1242,59 @@
           <w:szCs w:val="16"/>
           <w:lang w:eastAsia="pt-BR"/>
         </w:rPr>
-        <w:t>{equipe_tecnica}</w:t>
+        <w:t>{#equipe_tecnica_itens}</w:t>
+      </w:r>
+    </w:p>
+    <w:p>
+      <w:pPr>
+        <w:pStyle w:val="PargrafodaLista"/>
+        <w:numPr>
+          <w:ilvl w:val="2"/>
+          <w:numId w:val="1"/>
+        </w:numPr>
+        <w:ind w:left="1191" w:right="737" w:hanging="227"/>
+        <w:jc w:val="both"/>
+        <w:rPr>
+          <w:rFonts w:ascii="Calibri" w:eastAsia="Calibri" w:hAnsi="Calibri" w:cs="Calibri"/>
+          <w:sz w:val="16"/>
+          <w:szCs w:val="16"/>
+          <w:lang w:eastAsia="pt-BR"/>
+        </w:rPr>
+      </w:pPr>
+      <w:r>
+        <w:rPr>
+          <w:rFonts w:ascii="Calibri" w:eastAsia="Calibri" w:hAnsi="Calibri" w:cs="Calibri"/>
+          <w:sz w:val="16"/>
+          <w:szCs w:val="16"/>
+          <w:lang w:eastAsia="pt-BR"/>
+        </w:rPr>
+        <w:t>{item}</w:t>
+      </w:r>
+    </w:p>
+    <w:p>
+      <w:pPr>
+        <w:pStyle w:val="PargrafodaLista"/>
+        <w:numPr>
+          <w:ilvl w:val="2"/>
+          <w:numId w:val="1"/>
+        </w:numPr>
+        <w:ind w:left="1191" w:right="737" w:hanging="227"/>
+        <w:jc w:val="both"/>
+        <w:rPr>
+          <w:rFonts w:ascii="Calibri" w:eastAsia="Calibri" w:hAnsi="Calibri" w:cs="Calibri"/>
+          <w:sz w:val="16"/>
+          <w:szCs w:val="16"/>
+          <w:lang w:eastAsia="pt-BR"/>
+        </w:rPr>
+      </w:pPr>
+      <w:r>
+        <w:rPr>
+          <w:rFonts w:ascii="Calibri" w:eastAsia="Calibri" w:hAnsi="Calibri" w:cs="Calibri"/>
+          <w:sz w:val="16"/>
+          <w:szCs w:val="16"/>
+          <w:lang w:eastAsia="pt-BR"/>
+        </w:rPr>
+        <w:t>{/equipe_tecnica_itens}</w:t>
       </w:r>
     </w:p>
     <w:p>
@@ -1374,7 +1422,7 @@
         <mc:AlternateContent>
           <mc:Choice Requires="wps">
             <w:drawing>
-              <wp:anchor distT="0" distB="0" distL="114300" distR="114300" simplePos="0" relativeHeight="251661824" behindDoc="0" locked="0" layoutInCell="1" allowOverlap="1" wp14:anchorId="20A14F48" wp14:editId="676B3F8A">
+              <wp:anchor distT="0" distB="0" distL="114300" distR="114300" simplePos="0" relativeHeight="251661824" behindDoc="0" locked="0" layoutInCell="1" allowOverlap="1" wp14:anchorId="20A14F48" wp14:editId="38A00D3C">
                 <wp:simplePos x="0" y="0"/>
                 <wp:positionH relativeFrom="column">
                   <wp:posOffset>247650</wp:posOffset>
@@ -1434,7 +1482,7 @@
           </mc:Choice>
           <mc:Fallback>
             <w:pict>
-              <v:line w14:anchorId="0B74771B" id="Conector reto 432194892" o:spid="_x0000_s1026" style="position:absolute;z-index:251661824;visibility:visible;mso-wrap-style:square;mso-width-percent:0;mso-height-percent:0;mso-wrap-distance-left:9pt;mso-wrap-distance-top:0;mso-wrap-distance-right:9pt;mso-wrap-distance-bottom:0;mso-position-horizontal:absolute;mso-position-horizontal-relative:text;mso-position-vertical:absolute;mso-position-vertical-relative:text;mso-width-percent:0;mso-height-percent:0;mso-width-relative:margin;mso-height-relative:margin" from="19.5pt,2.35pt" to="531.75pt,3.1pt" o:gfxdata="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" strokecolor="#002060" strokeweight=".5pt">
+              <v:line w14:anchorId="70C507F5" id="Conector reto 432194892" o:spid="_x0000_s1026" style="position:absolute;z-index:251661824;visibility:visible;mso-wrap-style:square;mso-width-percent:0;mso-height-percent:0;mso-wrap-distance-left:9pt;mso-wrap-distance-top:0;mso-wrap-distance-right:9pt;mso-wrap-distance-bottom:0;mso-position-horizontal:absolute;mso-position-horizontal-relative:text;mso-position-vertical:absolute;mso-position-vertical-relative:text;mso-width-percent:0;mso-height-percent:0;mso-width-relative:margin;mso-height-relative:margin" from="19.5pt,2.35pt" to="531.75pt,3.1pt" o:gfxdata="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" strokecolor="#002060" strokeweight=".5pt">
                 <v:stroke joinstyle="miter"/>
               </v:line>
             </w:pict>
@@ -1442,20 +1490,10 @@
         </mc:AlternateContent>
       </w:r>
     </w:p>
-    <w:p>
-      <w:pPr>
-        <w:spacing w:before="120" w:after="120" w:line="120" w:lineRule="exact"/>
-        <w:rPr>
-          <w:sz w:val="4"/>
-          <w:szCs w:val="4"/>
-        </w:rPr>
-      </w:pPr>
-    </w:p>
     <w:tbl>
       <w:tblPr>
-        <w:tblW w:w="9360" w:type="dxa"/>
-        <w:jc w:val="center"/>
-        <w:tblLayout w:type="fixed"/>
+        <w:tblW w:w="10245" w:type="dxa"/>
+        <w:tblInd w:w="390" w:type="dxa"/>
         <w:tblBorders>
           <w:top w:val="nil"/>
           <w:left w:val="nil"/>
@@ -1464,320 +1502,102 @@
           <w:insideH w:val="nil"/>
           <w:insideV w:val="nil"/>
         </w:tblBorders>
-        <w:tblLook w:val="0000" w:firstRow="0" w:lastRow="0" w:firstColumn="0" w:lastColumn="0" w:noHBand="1" w:noVBand="1"/>
+        <w:tblLayout w:type="fixed"/>
+        <w:tblLook w:val="0600" w:firstRow="0" w:lastRow="0" w:firstColumn="0" w:lastColumn="0" w:noHBand="1" w:noVBand="1"/>
       </w:tblPr>
       <w:tblGrid>
-        <w:gridCol w:w="650"/>
-        <w:gridCol w:w="760"/>
-        <w:gridCol w:w="3040"/>
-        <w:gridCol w:w="900"/>
-        <w:gridCol w:w="720"/>
-        <w:gridCol w:w="650"/>
-        <w:gridCol w:w="1300"/>
-        <w:gridCol w:w="1340"/>
+        <w:gridCol w:w="710"/>
+        <w:gridCol w:w="4540"/>
+        <w:gridCol w:w="945"/>
+        <w:gridCol w:w="710"/>
+        <w:gridCol w:w="590"/>
+        <w:gridCol w:w="1315"/>
+        <w:gridCol w:w="1435"/>
       </w:tblGrid>
       <w:tr>
+        <w:trPr>
+          <w:trHeight w:hRule="exact" w:val="300"/>
+        </w:trPr>
         <w:tc>
           <w:tcPr>
-            <w:tcW w:w="650" w:type="dxa"/>
-            <w:shd w:val="clear" w:color="auto" w:fill="BFBFBF"/>
+            <w:tcW w:w="10245" w:type="dxa"/>
+            <w:gridSpan w:val="7"/>
             <w:tcBorders>
-              <w:top w:val="single" w:sz="6" w:space="0" w:color="404040"/>
-              <w:left w:val="single" w:sz="4" w:space="0" w:color="7F7F7F"/>
-              <w:bottom w:val="single" w:sz="6" w:space="0" w:color="404040"/>
-              <w:right w:val="single" w:sz="4" w:space="0" w:color="7F7F7F"/>
+              <w:top w:val="nil"/>
+              <w:left w:val="nil"/>
+              <w:bottom w:val="nil"/>
+              <w:right w:val="nil"/>
             </w:tcBorders>
+            <w:tcMar>
+              <w:top w:w="0" w:type="dxa"/>
+              <w:left w:w="0" w:type="dxa"/>
+              <w:bottom w:w="0" w:type="dxa"/>
+              <w:right w:w="0" w:type="dxa"/>
+            </w:tcMar>
             <w:vAlign w:val="center"/>
-            <w:tcMar>
-              <w:top w:w="16" w:type="dxa"/>
-              <w:left w:w="70" w:type="dxa"/>
-              <w:bottom w:w="16" w:type="dxa"/>
-              <w:right w:w="70" w:type="dxa"/>
-            </w:tcMar>
           </w:tcPr>
           <w:p>
             <w:pPr>
-              <w:spacing w:after="0" w:line="220" w:lineRule="auto"/>
+              <w:spacing w:line="300" w:lineRule="exact"/>
               <w:jc w:val="center"/>
-              <w:rPr>
-                <w:rFonts w:ascii="Calibri" w:hAnsi="Calibri" w:cs="Calibri"/>
-                <w:sz w:val="16"/>
-                <w:szCs w:val="16"/>
-              </w:rPr>
             </w:pPr>
             <w:r>
               <w:rPr>
-                <w:rFonts w:ascii="Calibri" w:hAnsi="Calibri" w:cs="Calibri"/>
-                <w:sz w:val="16"/>
-                <w:szCs w:val="16"/>
+                <w:noProof/>
               </w:rPr>
-              <w:t>ITEM</w:t>
-            </w:r>
-          </w:p>
-        </w:tc>
-        <w:tc>
-          <w:tcPr>
-            <w:tcW w:w="760" w:type="dxa"/>
-            <w:shd w:val="clear" w:color="auto" w:fill="BFBFBF"/>
-            <w:tcBorders>
-              <w:top w:val="single" w:sz="6" w:space="0" w:color="404040"/>
-              <w:left w:val="single" w:sz="4" w:space="0" w:color="7F7F7F"/>
-              <w:bottom w:val="single" w:sz="6" w:space="0" w:color="404040"/>
-              <w:right w:val="single" w:sz="4" w:space="0" w:color="7F7F7F"/>
-            </w:tcBorders>
-            <w:vAlign w:val="center"/>
-            <w:tcMar>
-              <w:top w:w="16" w:type="dxa"/>
-              <w:left w:w="70" w:type="dxa"/>
-              <w:bottom w:w="16" w:type="dxa"/>
-              <w:right w:w="70" w:type="dxa"/>
-            </w:tcMar>
-          </w:tcPr>
-          <w:p>
-            <w:pPr>
-              <w:spacing w:after="0" w:line="220" w:lineRule="auto"/>
-              <w:jc w:val="center"/>
-              <w:rPr>
-                <w:rFonts w:ascii="Calibri" w:hAnsi="Calibri" w:cs="Calibri"/>
-                <w:sz w:val="16"/>
-                <w:szCs w:val="16"/>
-              </w:rPr>
-            </w:pPr>
-            <w:r>
-              <w:rPr>
-                <w:rFonts w:ascii="Calibri" w:hAnsi="Calibri" w:cs="Calibri"/>
-                <w:sz w:val="16"/>
-                <w:szCs w:val="16"/>
-              </w:rPr>
-              <w:t>CÓDIGO</w:t>
-            </w:r>
-          </w:p>
-        </w:tc>
-        <w:tc>
-          <w:tcPr>
-            <w:tcW w:w="3040" w:type="dxa"/>
-            <w:shd w:val="clear" w:color="auto" w:fill="BFBFBF"/>
-            <w:tcBorders>
-              <w:top w:val="single" w:sz="6" w:space="0" w:color="404040"/>
-              <w:left w:val="single" w:sz="4" w:space="0" w:color="7F7F7F"/>
-              <w:bottom w:val="single" w:sz="6" w:space="0" w:color="404040"/>
-              <w:right w:val="single" w:sz="4" w:space="0" w:color="7F7F7F"/>
-            </w:tcBorders>
-            <w:vAlign w:val="center"/>
-            <w:tcMar>
-              <w:top w:w="16" w:type="dxa"/>
-              <w:left w:w="70" w:type="dxa"/>
-              <w:bottom w:w="16" w:type="dxa"/>
-              <w:right w:w="70" w:type="dxa"/>
-            </w:tcMar>
-          </w:tcPr>
-          <w:p>
-            <w:pPr>
-              <w:spacing w:after="0" w:line="220" w:lineRule="auto"/>
-              <w:jc w:val="center"/>
-              <w:rPr>
-                <w:rFonts w:ascii="Calibri" w:hAnsi="Calibri" w:cs="Calibri"/>
-                <w:sz w:val="16"/>
-                <w:szCs w:val="16"/>
-              </w:rPr>
-            </w:pPr>
-            <w:r>
-              <w:rPr>
-                <w:rFonts w:ascii="Calibri" w:hAnsi="Calibri" w:cs="Calibri"/>
-                <w:sz w:val="16"/>
-                <w:szCs w:val="16"/>
-              </w:rPr>
-              <w:t>DESCRIÇÃO DOS ITENS</w:t>
-            </w:r>
-          </w:p>
-        </w:tc>
-        <w:tc>
-          <w:tcPr>
-            <w:tcW w:w="900" w:type="dxa"/>
-            <w:shd w:val="clear" w:color="auto" w:fill="BFBFBF"/>
-            <w:tcBorders>
-              <w:top w:val="single" w:sz="6" w:space="0" w:color="404040"/>
-              <w:left w:val="single" w:sz="4" w:space="0" w:color="7F7F7F"/>
-              <w:bottom w:val="single" w:sz="6" w:space="0" w:color="404040"/>
-              <w:right w:val="single" w:sz="4" w:space="0" w:color="7F7F7F"/>
-            </w:tcBorders>
-            <w:vAlign w:val="center"/>
-            <w:tcMar>
-              <w:top w:w="16" w:type="dxa"/>
-              <w:left w:w="70" w:type="dxa"/>
-              <w:bottom w:w="16" w:type="dxa"/>
-              <w:right w:w="70" w:type="dxa"/>
-            </w:tcMar>
-          </w:tcPr>
-          <w:p>
-            <w:pPr>
-              <w:spacing w:after="0" w:line="220" w:lineRule="auto"/>
-              <w:jc w:val="center"/>
-              <w:rPr>
-                <w:rFonts w:ascii="Calibri" w:hAnsi="Calibri" w:cs="Calibri"/>
-                <w:sz w:val="16"/>
-                <w:szCs w:val="16"/>
-              </w:rPr>
-            </w:pPr>
-            <w:r>
-              <w:rPr>
-                <w:rFonts w:ascii="Calibri" w:hAnsi="Calibri" w:cs="Calibri"/>
-                <w:sz w:val="16"/>
-                <w:szCs w:val="16"/>
-              </w:rPr>
-              <w:t>NCM</w:t>
-            </w:r>
-          </w:p>
-        </w:tc>
-        <w:tc>
-          <w:tcPr>
-            <w:tcW w:w="720" w:type="dxa"/>
-            <w:shd w:val="clear" w:color="auto" w:fill="BFBFBF"/>
-            <w:tcBorders>
-              <w:top w:val="single" w:sz="6" w:space="0" w:color="404040"/>
-              <w:left w:val="single" w:sz="4" w:space="0" w:color="7F7F7F"/>
-              <w:bottom w:val="single" w:sz="6" w:space="0" w:color="404040"/>
-              <w:right w:val="single" w:sz="4" w:space="0" w:color="7F7F7F"/>
-            </w:tcBorders>
-            <w:vAlign w:val="center"/>
-            <w:tcMar>
-              <w:top w:w="16" w:type="dxa"/>
-              <w:left w:w="70" w:type="dxa"/>
-              <w:bottom w:w="16" w:type="dxa"/>
-              <w:right w:w="70" w:type="dxa"/>
-            </w:tcMar>
-          </w:tcPr>
-          <w:p>
-            <w:pPr>
-              <w:spacing w:after="0" w:line="220" w:lineRule="auto"/>
-              <w:jc w:val="center"/>
-              <w:rPr>
-                <w:rFonts w:ascii="Calibri" w:hAnsi="Calibri" w:cs="Calibri"/>
-                <w:sz w:val="16"/>
-                <w:szCs w:val="16"/>
-              </w:rPr>
-            </w:pPr>
-            <w:r>
-              <w:rPr>
-                <w:rFonts w:ascii="Calibri" w:hAnsi="Calibri" w:cs="Calibri"/>
-                <w:sz w:val="16"/>
-                <w:szCs w:val="16"/>
-              </w:rPr>
-              <w:t>QTD</w:t>
-            </w:r>
-          </w:p>
-        </w:tc>
-        <w:tc>
-          <w:tcPr>
-            <w:tcW w:w="650" w:type="dxa"/>
-            <w:shd w:val="clear" w:color="auto" w:fill="BFBFBF"/>
-            <w:tcBorders>
-              <w:top w:val="single" w:sz="6" w:space="0" w:color="404040"/>
-              <w:left w:val="single" w:sz="4" w:space="0" w:color="7F7F7F"/>
-              <w:bottom w:val="single" w:sz="6" w:space="0" w:color="404040"/>
-              <w:right w:val="single" w:sz="4" w:space="0" w:color="7F7F7F"/>
-            </w:tcBorders>
-            <w:vAlign w:val="center"/>
-            <w:tcMar>
-              <w:top w:w="16" w:type="dxa"/>
-              <w:left w:w="70" w:type="dxa"/>
-              <w:bottom w:w="16" w:type="dxa"/>
-              <w:right w:w="70" w:type="dxa"/>
-            </w:tcMar>
-          </w:tcPr>
-          <w:p>
-            <w:pPr>
-              <w:spacing w:after="0" w:line="220" w:lineRule="auto"/>
-              <w:jc w:val="center"/>
-              <w:rPr>
-                <w:rFonts w:ascii="Calibri" w:hAnsi="Calibri" w:cs="Calibri"/>
-                <w:sz w:val="16"/>
-                <w:szCs w:val="16"/>
-              </w:rPr>
-            </w:pPr>
-            <w:r>
-              <w:rPr>
-                <w:rFonts w:ascii="Calibri" w:hAnsi="Calibri" w:cs="Calibri"/>
-                <w:sz w:val="16"/>
-                <w:szCs w:val="16"/>
-              </w:rPr>
-              <w:t>UNID.</w:t>
-            </w:r>
-          </w:p>
-        </w:tc>
-        <w:tc>
-          <w:tcPr>
-            <w:tcW w:w="1300" w:type="dxa"/>
-            <w:shd w:val="clear" w:color="auto" w:fill="BFBFBF"/>
-            <w:tcBorders>
-              <w:top w:val="single" w:sz="6" w:space="0" w:color="404040"/>
-              <w:left w:val="single" w:sz="4" w:space="0" w:color="7F7F7F"/>
-              <w:bottom w:val="single" w:sz="6" w:space="0" w:color="404040"/>
-              <w:right w:val="single" w:sz="4" w:space="0" w:color="7F7F7F"/>
-            </w:tcBorders>
-            <w:vAlign w:val="center"/>
-            <w:tcMar>
-              <w:top w:w="16" w:type="dxa"/>
-              <w:left w:w="70" w:type="dxa"/>
-              <w:bottom w:w="16" w:type="dxa"/>
-              <w:right w:w="70" w:type="dxa"/>
-            </w:tcMar>
-          </w:tcPr>
-          <w:p>
-            <w:pPr>
-              <w:spacing w:after="0" w:line="220" w:lineRule="auto"/>
-              <w:jc w:val="center"/>
-              <w:rPr>
-                <w:rFonts w:ascii="Calibri" w:hAnsi="Calibri" w:cs="Calibri"/>
-                <w:sz w:val="16"/>
-                <w:szCs w:val="16"/>
-              </w:rPr>
-            </w:pPr>
-            <w:r>
-              <w:rPr>
-                <w:rFonts w:ascii="Calibri" w:hAnsi="Calibri" w:cs="Calibri"/>
-                <w:sz w:val="16"/>
-                <w:szCs w:val="16"/>
-              </w:rPr>
-              <w:t>VALOR UNITÁRIO</w:t>
-            </w:r>
-          </w:p>
-        </w:tc>
-        <w:tc>
-          <w:tcPr>
-            <w:tcW w:w="1340" w:type="dxa"/>
-            <w:shd w:val="clear" w:color="auto" w:fill="BFBFBF"/>
-            <w:tcBorders>
-              <w:top w:val="single" w:sz="6" w:space="0" w:color="404040"/>
-              <w:left w:val="single" w:sz="4" w:space="0" w:color="7F7F7F"/>
-              <w:bottom w:val="single" w:sz="6" w:space="0" w:color="404040"/>
-              <w:right w:val="single" w:sz="4" w:space="0" w:color="7F7F7F"/>
-            </w:tcBorders>
-            <w:vAlign w:val="center"/>
-            <w:tcMar>
-              <w:top w:w="16" w:type="dxa"/>
-              <w:left w:w="70" w:type="dxa"/>
-              <w:bottom w:w="16" w:type="dxa"/>
-              <w:right w:w="70" w:type="dxa"/>
-            </w:tcMar>
-          </w:tcPr>
-          <w:p>
-            <w:pPr>
-              <w:spacing w:after="0" w:line="220" w:lineRule="auto"/>
-              <w:jc w:val="center"/>
-              <w:rPr>
-                <w:rFonts w:ascii="Calibri" w:hAnsi="Calibri" w:cs="Calibri"/>
-                <w:sz w:val="16"/>
-                <w:szCs w:val="16"/>
-              </w:rPr>
-            </w:pPr>
-            <w:r>
-              <w:rPr>
-                <w:rFonts w:ascii="Calibri" w:hAnsi="Calibri" w:cs="Calibri"/>
-                <w:sz w:val="16"/>
-                <w:szCs w:val="16"/>
-              </w:rPr>
-              <w:t>VALOR TOTAL</w:t>
+              <w:drawing>
+                <wp:anchor distT="0" distB="0" distL="114300" distR="114300" simplePos="0" relativeHeight="251664896" behindDoc="1" locked="0" layoutInCell="1" allowOverlap="1" wp14:anchorId="3F807A14" wp14:editId="4DAEFC15">
+                  <wp:simplePos x="0" y="0"/>
+                  <wp:positionH relativeFrom="column">
+                    <wp:posOffset>-2540</wp:posOffset>
+                  </wp:positionH>
+                  <wp:positionV relativeFrom="paragraph">
+                    <wp:posOffset>-191770</wp:posOffset>
+                  </wp:positionV>
+                  <wp:extent cx="6489700" cy="183515"/>
+                  <wp:effectExtent l="0" t="0" r="6350" b="6985"/>
+                  <wp:wrapTopAndBottom/>
+                  <wp:docPr id="9001" name="Cabeçalho de preços"/>
+                  <wp:cNvGraphicFramePr/>
+                  <a:graphic xmlns:a="http://schemas.openxmlformats.org/drawingml/2006/main">
+                    <a:graphicData uri="http://schemas.openxmlformats.org/drawingml/2006/picture">
+                      <pic:pic xmlns:pic="http://schemas.openxmlformats.org/drawingml/2006/picture">
+                        <pic:nvPicPr>
+                          <pic:cNvPr id="9001" name="cabecalho-preco.svg"/>
+                          <pic:cNvPicPr/>
+                        </pic:nvPicPr>
+                        <pic:blipFill>
+                          <a:blip r:embed="rId11">
+                            <a:extLst>
+                              <a:ext uri="{96DAC541-7B7A-43D3-8B79-37D633B846F1}">
+                                <asvg:svgBlip xmlns:asvg="http://schemas.microsoft.com/office/drawing/2016/SVG/main" r:embed="rId12"/>
+                              </a:ext>
+                            </a:extLst>
+                          </a:blip>
+                          <a:stretch>
+                            <a:fillRect/>
+                          </a:stretch>
+                        </pic:blipFill>
+                        <pic:spPr>
+                          <a:xfrm>
+                            <a:off x="0" y="0"/>
+                            <a:ext cx="6489700" cy="183515"/>
+                          </a:xfrm>
+                          <a:prstGeom prst="rect">
+                            <a:avLst/>
+                          </a:prstGeom>
+                        </pic:spPr>
+                      </pic:pic>
+                    </a:graphicData>
+                  </a:graphic>
+                  <wp14:sizeRelH relativeFrom="margin">
+                    <wp14:pctWidth>0</wp14:pctWidth>
+                  </wp14:sizeRelH>
+                  <wp14:sizeRelV relativeFrom="margin">
+                    <wp14:pctHeight>0</wp14:pctHeight>
+                  </wp14:sizeRelV>
+                </wp:anchor>
+              </w:drawing>
             </w:r>
           </w:p>
         </w:tc>
@@ -1785,25 +1605,24 @@
       <w:tr>
         <w:tc>
           <w:tcPr>
-            <w:tcW w:w="9360" w:type="dxa"/>
-            <w:gridSpan w:val="8"/>
+            <w:tcW w:w="10245" w:type="dxa"/>
+            <w:gridSpan w:val="7"/>
             <w:tcBorders>
               <w:top w:val="nil"/>
               <w:left w:val="nil"/>
               <w:bottom w:val="nil"/>
               <w:right w:val="nil"/>
             </w:tcBorders>
-            <w:vAlign w:val="center"/>
             <w:tcMar>
               <w:top w:w="35" w:type="dxa"/>
               <w:left w:w="70" w:type="dxa"/>
               <w:bottom w:w="35" w:type="dxa"/>
               <w:right w:w="70" w:type="dxa"/>
             </w:tcMar>
+            <w:vAlign w:val="center"/>
           </w:tcPr>
           <w:p>
             <w:pPr>
-              <w:spacing w:after="0" w:line="240" w:lineRule="auto"/>
               <w:rPr>
                 <w:rFonts w:ascii="Calibri" w:hAnsi="Calibri" w:cs="Calibri"/>
                 <w:b/>
@@ -1826,28 +1645,26 @@
       <w:tr>
         <w:tc>
           <w:tcPr>
-            <w:tcW w:w="650" w:type="dxa"/>
+            <w:tcW w:w="710" w:type="dxa"/>
             <w:tcBorders>
               <w:top w:val="nil"/>
               <w:left w:val="nil"/>
               <w:bottom w:val="single" w:sz="4" w:space="0" w:color="BFBFBF"/>
               <w:right w:val="nil"/>
             </w:tcBorders>
-            <w:vAlign w:val="center"/>
             <w:tcMar>
               <w:top w:w="35" w:type="dxa"/>
               <w:left w:w="70" w:type="dxa"/>
               <w:bottom w:w="35" w:type="dxa"/>
               <w:right w:w="70" w:type="dxa"/>
             </w:tcMar>
+            <w:vAlign w:val="center"/>
           </w:tcPr>
           <w:p>
             <w:pPr>
-              <w:spacing w:after="0" w:line="240" w:lineRule="auto"/>
-              <w:jc w:val="center"/>
               <w:rPr>
                 <w:rFonts w:ascii="Calibri" w:hAnsi="Calibri" w:cs="Calibri"/>
-                <w:b/>
+                <w:bCs/>
                 <w:sz w:val="16"/>
                 <w:szCs w:val="16"/>
               </w:rPr>
@@ -1855,7 +1672,7 @@
             <w:r>
               <w:rPr>
                 <w:rFonts w:ascii="Calibri" w:hAnsi="Calibri" w:cs="Calibri"/>
-                <w:b/>
+                <w:bCs/>
                 <w:sz w:val="16"/>
                 <w:szCs w:val="16"/>
               </w:rPr>
@@ -1865,28 +1682,26 @@
         </w:tc>
         <w:tc>
           <w:tcPr>
-            <w:tcW w:w="760" w:type="dxa"/>
+            <w:tcW w:w="4540" w:type="dxa"/>
             <w:tcBorders>
               <w:top w:val="nil"/>
               <w:left w:val="nil"/>
               <w:bottom w:val="single" w:sz="4" w:space="0" w:color="BFBFBF"/>
               <w:right w:val="nil"/>
             </w:tcBorders>
-            <w:vAlign w:val="center"/>
             <w:tcMar>
               <w:top w:w="35" w:type="dxa"/>
               <w:left w:w="70" w:type="dxa"/>
               <w:bottom w:w="35" w:type="dxa"/>
               <w:right w:w="70" w:type="dxa"/>
             </w:tcMar>
+            <w:vAlign w:val="center"/>
           </w:tcPr>
           <w:p>
             <w:pPr>
-              <w:spacing w:after="0" w:line="240" w:lineRule="auto"/>
-              <w:jc w:val="center"/>
               <w:rPr>
                 <w:rFonts w:ascii="Calibri" w:hAnsi="Calibri" w:cs="Calibri"/>
-                <w:b/>
+                <w:bCs/>
                 <w:sz w:val="16"/>
                 <w:szCs w:val="16"/>
               </w:rPr>
@@ -1894,38 +1709,37 @@
             <w:r>
               <w:rPr>
                 <w:rFonts w:ascii="Calibri" w:hAnsi="Calibri" w:cs="Calibri"/>
-                <w:b/>
+                <w:bCs/>
                 <w:sz w:val="16"/>
                 <w:szCs w:val="16"/>
               </w:rPr>
-              <w:t>{codigo}</w:t>
+              <w:t>{codigo} {descricao}</w:t>
             </w:r>
           </w:p>
         </w:tc>
         <w:tc>
           <w:tcPr>
-            <w:tcW w:w="3040" w:type="dxa"/>
+            <w:tcW w:w="945" w:type="dxa"/>
             <w:tcBorders>
               <w:top w:val="nil"/>
               <w:left w:val="nil"/>
               <w:bottom w:val="single" w:sz="4" w:space="0" w:color="BFBFBF"/>
               <w:right w:val="nil"/>
             </w:tcBorders>
-            <w:vAlign w:val="center"/>
             <w:tcMar>
               <w:top w:w="35" w:type="dxa"/>
               <w:left w:w="70" w:type="dxa"/>
               <w:bottom w:w="35" w:type="dxa"/>
               <w:right w:w="70" w:type="dxa"/>
             </w:tcMar>
+            <w:vAlign w:val="center"/>
           </w:tcPr>
           <w:p>
             <w:pPr>
-              <w:spacing w:after="0" w:line="240" w:lineRule="auto"/>
               <w:jc w:val="center"/>
               <w:rPr>
                 <w:rFonts w:ascii="Calibri" w:hAnsi="Calibri" w:cs="Calibri"/>
-                <w:b/>
+                <w:bCs/>
                 <w:sz w:val="16"/>
                 <w:szCs w:val="16"/>
               </w:rPr>
@@ -1933,46 +1747,7 @@
             <w:r>
               <w:rPr>
                 <w:rFonts w:ascii="Calibri" w:hAnsi="Calibri" w:cs="Calibri"/>
-                <w:b/>
-                <w:sz w:val="16"/>
-                <w:szCs w:val="16"/>
-              </w:rPr>
-              <w:t>{descricao}</w:t>
-            </w:r>
-          </w:p>
-        </w:tc>
-        <w:tc>
-          <w:tcPr>
-            <w:tcW w:w="900" w:type="dxa"/>
-            <w:tcBorders>
-              <w:top w:val="nil"/>
-              <w:left w:val="nil"/>
-              <w:bottom w:val="single" w:sz="4" w:space="0" w:color="BFBFBF"/>
-              <w:right w:val="nil"/>
-            </w:tcBorders>
-            <w:vAlign w:val="center"/>
-            <w:tcMar>
-              <w:top w:w="35" w:type="dxa"/>
-              <w:left w:w="70" w:type="dxa"/>
-              <w:bottom w:w="35" w:type="dxa"/>
-              <w:right w:w="70" w:type="dxa"/>
-            </w:tcMar>
-          </w:tcPr>
-          <w:p>
-            <w:pPr>
-              <w:spacing w:after="0" w:line="240" w:lineRule="auto"/>
-              <w:jc w:val="center"/>
-              <w:rPr>
-                <w:rFonts w:ascii="Calibri" w:hAnsi="Calibri" w:cs="Calibri"/>
-                <w:b/>
-                <w:sz w:val="16"/>
-                <w:szCs w:val="16"/>
-              </w:rPr>
-            </w:pPr>
-            <w:r>
-              <w:rPr>
-                <w:rFonts w:ascii="Calibri" w:hAnsi="Calibri" w:cs="Calibri"/>
-                <w:b/>
+                <w:bCs/>
                 <w:sz w:val="16"/>
                 <w:szCs w:val="16"/>
               </w:rPr>
@@ -1982,28 +1757,27 @@
         </w:tc>
         <w:tc>
           <w:tcPr>
-            <w:tcW w:w="720" w:type="dxa"/>
+            <w:tcW w:w="710" w:type="dxa"/>
             <w:tcBorders>
               <w:top w:val="nil"/>
               <w:left w:val="nil"/>
               <w:bottom w:val="single" w:sz="4" w:space="0" w:color="BFBFBF"/>
               <w:right w:val="nil"/>
             </w:tcBorders>
-            <w:vAlign w:val="center"/>
             <w:tcMar>
               <w:top w:w="35" w:type="dxa"/>
               <w:left w:w="70" w:type="dxa"/>
               <w:bottom w:w="35" w:type="dxa"/>
               <w:right w:w="70" w:type="dxa"/>
             </w:tcMar>
+            <w:vAlign w:val="center"/>
           </w:tcPr>
           <w:p>
             <w:pPr>
-              <w:spacing w:after="0" w:line="240" w:lineRule="auto"/>
               <w:jc w:val="center"/>
               <w:rPr>
                 <w:rFonts w:ascii="Calibri" w:hAnsi="Calibri" w:cs="Calibri"/>
-                <w:b/>
+                <w:bCs/>
                 <w:sz w:val="16"/>
                 <w:szCs w:val="16"/>
               </w:rPr>
@@ -2011,7 +1785,7 @@
             <w:r>
               <w:rPr>
                 <w:rFonts w:ascii="Calibri" w:hAnsi="Calibri" w:cs="Calibri"/>
-                <w:b/>
+                <w:bCs/>
                 <w:sz w:val="16"/>
                 <w:szCs w:val="16"/>
               </w:rPr>
@@ -2021,28 +1795,27 @@
         </w:tc>
         <w:tc>
           <w:tcPr>
-            <w:tcW w:w="650" w:type="dxa"/>
+            <w:tcW w:w="590" w:type="dxa"/>
             <w:tcBorders>
               <w:top w:val="nil"/>
               <w:left w:val="nil"/>
               <w:bottom w:val="single" w:sz="4" w:space="0" w:color="BFBFBF"/>
               <w:right w:val="nil"/>
             </w:tcBorders>
-            <w:vAlign w:val="center"/>
             <w:tcMar>
               <w:top w:w="35" w:type="dxa"/>
               <w:left w:w="70" w:type="dxa"/>
               <w:bottom w:w="35" w:type="dxa"/>
               <w:right w:w="70" w:type="dxa"/>
             </w:tcMar>
+            <w:vAlign w:val="center"/>
           </w:tcPr>
           <w:p>
             <w:pPr>
-              <w:spacing w:after="0" w:line="240" w:lineRule="auto"/>
               <w:jc w:val="center"/>
               <w:rPr>
                 <w:rFonts w:ascii="Calibri" w:hAnsi="Calibri" w:cs="Calibri"/>
-                <w:b/>
+                <w:bCs/>
                 <w:sz w:val="16"/>
                 <w:szCs w:val="16"/>
               </w:rPr>
@@ -2050,7 +1823,7 @@
             <w:r>
               <w:rPr>
                 <w:rFonts w:ascii="Calibri" w:hAnsi="Calibri" w:cs="Calibri"/>
-                <w:b/>
+                <w:bCs/>
                 <w:sz w:val="16"/>
                 <w:szCs w:val="16"/>
               </w:rPr>
@@ -2060,28 +1833,27 @@
         </w:tc>
         <w:tc>
           <w:tcPr>
-            <w:tcW w:w="1300" w:type="dxa"/>
+            <w:tcW w:w="1315" w:type="dxa"/>
             <w:tcBorders>
               <w:top w:val="nil"/>
               <w:left w:val="nil"/>
               <w:bottom w:val="single" w:sz="4" w:space="0" w:color="BFBFBF"/>
               <w:right w:val="nil"/>
             </w:tcBorders>
-            <w:vAlign w:val="center"/>
             <w:tcMar>
               <w:top w:w="35" w:type="dxa"/>
               <w:left w:w="70" w:type="dxa"/>
               <w:bottom w:w="35" w:type="dxa"/>
               <w:right w:w="70" w:type="dxa"/>
             </w:tcMar>
+            <w:vAlign w:val="center"/>
           </w:tcPr>
           <w:p>
             <w:pPr>
-              <w:spacing w:after="0" w:line="240" w:lineRule="auto"/>
-              <w:jc w:val="center"/>
+              <w:jc w:val="right"/>
               <w:rPr>
                 <w:rFonts w:ascii="Calibri" w:hAnsi="Calibri" w:cs="Calibri"/>
-                <w:b/>
+                <w:bCs/>
                 <w:sz w:val="16"/>
                 <w:szCs w:val="16"/>
               </w:rPr>
@@ -2089,7 +1861,16 @@
             <w:r>
               <w:rPr>
                 <w:rFonts w:ascii="Calibri" w:hAnsi="Calibri" w:cs="Calibri"/>
-                <w:b/>
+                <w:bCs/>
+                <w:sz w:val="16"/>
+                <w:szCs w:val="16"/>
+              </w:rPr>
+              <w:t>R$</w:t>
+            </w:r>
+            <w:r>
+              <w:rPr>
+                <w:rFonts w:ascii="Calibri" w:hAnsi="Calibri" w:cs="Calibri"/>
+                <w:bCs/>
                 <w:sz w:val="16"/>
                 <w:szCs w:val="16"/>
               </w:rPr>
@@ -2099,28 +1880,27 @@
         </w:tc>
         <w:tc>
           <w:tcPr>
-            <w:tcW w:w="1340" w:type="dxa"/>
+            <w:tcW w:w="1435" w:type="dxa"/>
             <w:tcBorders>
               <w:top w:val="nil"/>
               <w:left w:val="nil"/>
               <w:bottom w:val="single" w:sz="4" w:space="0" w:color="BFBFBF"/>
               <w:right w:val="nil"/>
             </w:tcBorders>
-            <w:vAlign w:val="center"/>
             <w:tcMar>
               <w:top w:w="35" w:type="dxa"/>
               <w:left w:w="70" w:type="dxa"/>
               <w:bottom w:w="35" w:type="dxa"/>
               <w:right w:w="70" w:type="dxa"/>
             </w:tcMar>
+            <w:vAlign w:val="center"/>
           </w:tcPr>
           <w:p>
             <w:pPr>
-              <w:spacing w:after="0" w:line="240" w:lineRule="auto"/>
-              <w:jc w:val="center"/>
+              <w:jc w:val="right"/>
               <w:rPr>
                 <w:rFonts w:ascii="Calibri" w:hAnsi="Calibri" w:cs="Calibri"/>
-                <w:b/>
+                <w:bCs/>
                 <w:sz w:val="16"/>
                 <w:szCs w:val="16"/>
               </w:rPr>
@@ -2128,7 +1908,16 @@
             <w:r>
               <w:rPr>
                 <w:rFonts w:ascii="Calibri" w:hAnsi="Calibri" w:cs="Calibri"/>
-                <w:b/>
+                <w:bCs/>
+                <w:sz w:val="16"/>
+                <w:szCs w:val="16"/>
+              </w:rPr>
+              <w:t>R$</w:t>
+            </w:r>
+            <w:r>
+              <w:rPr>
+                <w:rFonts w:ascii="Calibri" w:hAnsi="Calibri" w:cs="Calibri"/>
+                <w:bCs/>
                 <w:sz w:val="16"/>
                 <w:szCs w:val="16"/>
               </w:rPr>
@@ -2140,66 +1929,29 @@
       <w:tr>
         <w:tc>
           <w:tcPr>
-            <w:tcW w:w="8020" w:type="dxa"/>
-            <w:gridSpan w:val="7"/>
+            <w:tcW w:w="8810" w:type="dxa"/>
+            <w:gridSpan w:val="6"/>
             <w:tcBorders>
               <w:top w:val="single" w:sz="4" w:space="0" w:color="BFBFBF"/>
               <w:left w:val="nil"/>
               <w:bottom w:val="nil"/>
               <w:right w:val="nil"/>
             </w:tcBorders>
-            <w:vAlign w:val="center"/>
             <w:tcMar>
               <w:top w:w="35" w:type="dxa"/>
               <w:left w:w="70" w:type="dxa"/>
               <w:bottom w:w="35" w:type="dxa"/>
               <w:right w:w="70" w:type="dxa"/>
             </w:tcMar>
+            <w:vAlign w:val="center"/>
           </w:tcPr>
           <w:p>
             <w:pPr>
-              <w:spacing w:after="0" w:line="240" w:lineRule="auto"/>
-              <w:jc w:val="right"/>
-              <w:rPr>
-                <w:rFonts w:ascii="Calibri" w:hAnsi="Calibri" w:cs="Calibri"/>
-                <w:sz w:val="16"/>
-                <w:szCs w:val="16"/>
-              </w:rPr>
-            </w:pPr>
-            <w:r>
-              <w:rPr>
-                <w:rFonts w:ascii="Calibri" w:hAnsi="Calibri" w:cs="Calibri"/>
-                <w:sz w:val="16"/>
-                <w:szCs w:val="16"/>
-              </w:rPr>
-              <w:t>TOTAL {titulo} :</w:t>
-            </w:r>
-          </w:p>
-        </w:tc>
-        <w:tc>
-          <w:tcPr>
-            <w:tcW w:w="1340" w:type="dxa"/>
-            <w:tcBorders>
-              <w:top w:val="single" w:sz="4" w:space="0" w:color="BFBFBF"/>
-              <w:left w:val="nil"/>
-              <w:bottom w:val="nil"/>
-              <w:right w:val="nil"/>
-            </w:tcBorders>
-            <w:vAlign w:val="center"/>
-            <w:tcMar>
-              <w:top w:w="35" w:type="dxa"/>
-              <w:left w:w="70" w:type="dxa"/>
-              <w:bottom w:w="35" w:type="dxa"/>
-              <w:right w:w="70" w:type="dxa"/>
-            </w:tcMar>
-          </w:tcPr>
-          <w:p>
-            <w:pPr>
-              <w:spacing w:after="0" w:line="240" w:lineRule="auto"/>
               <w:jc w:val="right"/>
               <w:rPr>
                 <w:rFonts w:ascii="Calibri" w:hAnsi="Calibri" w:cs="Calibri"/>
                 <w:b/>
+                <w:bCs/>
                 <w:sz w:val="16"/>
                 <w:szCs w:val="16"/>
               </w:rPr>
@@ -2208,6 +1960,57 @@
               <w:rPr>
                 <w:rFonts w:ascii="Calibri" w:hAnsi="Calibri" w:cs="Calibri"/>
                 <w:b/>
+                <w:bCs/>
+                <w:sz w:val="16"/>
+                <w:szCs w:val="16"/>
+              </w:rPr>
+              <w:t>TOTAL {titulo}:</w:t>
+            </w:r>
+          </w:p>
+        </w:tc>
+        <w:tc>
+          <w:tcPr>
+            <w:tcW w:w="1435" w:type="dxa"/>
+            <w:tcBorders>
+              <w:top w:val="single" w:sz="4" w:space="0" w:color="BFBFBF"/>
+              <w:left w:val="nil"/>
+              <w:bottom w:val="nil"/>
+              <w:right w:val="nil"/>
+            </w:tcBorders>
+            <w:tcMar>
+              <w:top w:w="35" w:type="dxa"/>
+              <w:left w:w="70" w:type="dxa"/>
+              <w:bottom w:w="35" w:type="dxa"/>
+              <w:right w:w="70" w:type="dxa"/>
+            </w:tcMar>
+            <w:vAlign w:val="center"/>
+          </w:tcPr>
+          <w:p>
+            <w:pPr>
+              <w:jc w:val="right"/>
+              <w:rPr>
+                <w:rFonts w:ascii="Calibri" w:hAnsi="Calibri" w:cs="Calibri"/>
+                <w:b/>
+                <w:bCs/>
+                <w:sz w:val="16"/>
+                <w:szCs w:val="16"/>
+              </w:rPr>
+            </w:pPr>
+            <w:r>
+              <w:rPr>
+                <w:rFonts w:ascii="Calibri" w:hAnsi="Calibri" w:cs="Calibri"/>
+                <w:b/>
+                <w:bCs/>
+                <w:sz w:val="16"/>
+                <w:szCs w:val="16"/>
+              </w:rPr>
+              <w:t>R$</w:t>
+            </w:r>
+            <w:r>
+              <w:rPr>
+                <w:rFonts w:ascii="Calibri" w:hAnsi="Calibri" w:cs="Calibri"/>
+                <w:b/>
+                <w:bCs/>
                 <w:sz w:val="16"/>
                 <w:szCs w:val="16"/>
               </w:rPr>
@@ -2220,7 +2023,10 @@
     <w:p>
       <w:pPr>
         <w:spacing w:before="150" w:after="150" w:line="120" w:lineRule="exact"/>
-        <w:rPr>
+        <w:jc w:val="right"/>
+        <w:rPr>
+          <w:b/>
+          <w:bCs/>
           <w:sz w:val="4"/>
           <w:szCs w:val="4"/>
         </w:rPr>
@@ -2228,9 +2034,8 @@
     </w:p>
     <w:tbl>
       <w:tblPr>
-        <w:tblW w:w="9360" w:type="dxa"/>
-        <w:jc w:val="center"/>
-        <w:tblLayout w:type="fixed"/>
+        <w:tblW w:w="10245" w:type="dxa"/>
+        <w:tblInd w:w="390" w:type="dxa"/>
         <w:tblBorders>
           <w:top w:val="nil"/>
           <w:left w:val="nil"/>
@@ -2239,142 +2044,171 @@
           <w:insideH w:val="nil"/>
           <w:insideV w:val="nil"/>
         </w:tblBorders>
-        <w:tblLook w:val="0000" w:firstRow="0" w:lastRow="0" w:firstColumn="0" w:lastColumn="0" w:noHBand="1" w:noVBand="1"/>
+        <w:tblLayout w:type="fixed"/>
+        <w:tblLook w:val="0600" w:firstRow="0" w:lastRow="0" w:firstColumn="0" w:lastColumn="0" w:noHBand="1" w:noVBand="1"/>
       </w:tblPr>
       <w:tblGrid>
-        <w:gridCol w:w="650"/>
-        <w:gridCol w:w="760"/>
-        <w:gridCol w:w="3040"/>
-        <w:gridCol w:w="900"/>
-        <w:gridCol w:w="720"/>
-        <w:gridCol w:w="650"/>
-        <w:gridCol w:w="1300"/>
-        <w:gridCol w:w="1340"/>
+        <w:gridCol w:w="5123"/>
+        <w:gridCol w:w="5122"/>
       </w:tblGrid>
+      <w:tr>
+        <w:trPr>
+          <w:trHeight w:hRule="exact" w:val="340"/>
+        </w:trPr>
+        <w:tc>
+          <w:tcPr>
+            <w:tcW w:w="10245" w:type="dxa"/>
+            <w:gridSpan w:val="2"/>
+            <w:tcBorders>
+              <w:top w:val="nil"/>
+              <w:left w:val="nil"/>
+              <w:bottom w:val="nil"/>
+              <w:right w:val="nil"/>
+            </w:tcBorders>
+            <w:tcMar>
+              <w:top w:w="0" w:type="dxa"/>
+              <w:left w:w="0" w:type="dxa"/>
+              <w:bottom w:w="0" w:type="dxa"/>
+              <w:right w:w="0" w:type="dxa"/>
+            </w:tcMar>
+            <w:vAlign w:val="center"/>
+          </w:tcPr>
+          <w:p>
+            <w:pPr>
+              <w:spacing w:line="340" w:lineRule="exact"/>
+              <w:jc w:val="center"/>
+            </w:pPr>
+            <w:r>
+              <w:pict w14:anchorId="110E67F5">
+                <v:roundrect id="ResumoPrecoArredondado" o:spid="_x0000_s2050" style="width:512.25pt;height:15.1pt;mso-left-percent:-10001;mso-top-percent:-10001;mso-position-horizontal:absolute;mso-position-horizontal-relative:char;mso-position-vertical:absolute;mso-position-vertical-relative:line;mso-left-percent:-10001;mso-top-percent:-10001" arcsize="7864f" fillcolor="#bfbfbf" strokecolor="#404040">
+                  <v:textbox inset="0,0,0,0">
+                    <w:txbxContent>
+                      <w:tbl>
+                        <w:tblPr>
+                          <w:tblW w:w="10245" w:type="dxa"/>
+                          <w:tblBorders>
+                            <w:top w:val="nil"/>
+                            <w:left w:val="nil"/>
+                            <w:bottom w:val="nil"/>
+                            <w:right w:val="nil"/>
+                            <w:insideH w:val="nil"/>
+                            <w:insideV w:val="nil"/>
+                          </w:tblBorders>
+                          <w:tblLayout w:type="fixed"/>
+                          <w:tblLook w:val="0600" w:firstRow="0" w:lastRow="0" w:firstColumn="0" w:lastColumn="0" w:noHBand="1" w:noVBand="1"/>
+                        </w:tblPr>
+                        <w:tblGrid>
+                          <w:gridCol w:w="2760"/>
+                          <w:gridCol w:w="7485"/>
+                        </w:tblGrid>
+                        <w:tr>
+                          <w:tc>
+                            <w:tcPr>
+                              <w:tcW w:w="2760" w:type="dxa"/>
+                              <w:tcBorders>
+                                <w:top w:val="nil"/>
+                                <w:left w:val="nil"/>
+                                <w:bottom w:val="nil"/>
+                                <w:right w:val="single" w:sz="6" w:space="0" w:color="404040"/>
+                              </w:tcBorders>
+                              <w:tcMar>
+                                <w:top w:w="35" w:type="dxa"/>
+                                <w:left w:w="70" w:type="dxa"/>
+                                <w:bottom w:w="35" w:type="dxa"/>
+                                <w:right w:w="70" w:type="dxa"/>
+                              </w:tcMar>
+                              <w:vAlign w:val="center"/>
+                            </w:tcPr>
+                            <w:p>
+                              <w:pPr>
+                                <w:jc w:val="center"/>
+                                <w:rPr>
+                                  <w:rFonts w:ascii="Calibri" w:hAnsi="Calibri" w:cs="Calibri"/>
+                                  <w:b/>
+                                  <w:sz w:val="16"/>
+                                  <w:szCs w:val="16"/>
+                                </w:rPr>
+                              </w:pPr>
+                              <w:r>
+                                <w:rPr>
+                                  <w:rFonts w:ascii="Calibri" w:hAnsi="Calibri" w:cs="Calibri"/>
+                                  <w:b/>
+                                  <w:sz w:val="16"/>
+                                  <w:szCs w:val="16"/>
+                                </w:rPr>
+                                <w:t>PREÇO TOTAL</w:t>
+                              </w:r>
+                            </w:p>
+                          </w:tc>
+                          <w:tc>
+                            <w:tcPr>
+                              <w:tcW w:w="7485" w:type="dxa"/>
+                              <w:tcBorders>
+                                <w:top w:val="nil"/>
+                                <w:left w:val="nil"/>
+                                <w:bottom w:val="nil"/>
+                                <w:right w:val="nil"/>
+                              </w:tcBorders>
+                              <w:tcMar>
+                                <w:top w:w="35" w:type="dxa"/>
+                                <w:left w:w="70" w:type="dxa"/>
+                                <w:bottom w:w="35" w:type="dxa"/>
+                                <w:right w:w="70" w:type="dxa"/>
+                              </w:tcMar>
+                              <w:vAlign w:val="center"/>
+                            </w:tcPr>
+                            <w:p>
+                              <w:pPr>
+                                <w:jc w:val="center"/>
+                                <w:rPr>
+                                  <w:rFonts w:ascii="Calibri" w:hAnsi="Calibri" w:cs="Calibri"/>
+                                  <w:b/>
+                                  <w:sz w:val="16"/>
+                                  <w:szCs w:val="16"/>
+                                </w:rPr>
+                              </w:pPr>
+                              <w:r>
+                                <w:rPr>
+                                  <w:rFonts w:ascii="Calibri" w:hAnsi="Calibri" w:cs="Calibri"/>
+                                  <w:b/>
+                                  <w:sz w:val="16"/>
+                                  <w:szCs w:val="16"/>
+                                </w:rPr>
+                                <w:t>{preco_total_numero} ({preco_total_extenso})</w:t>
+                              </w:r>
+                            </w:p>
+                          </w:tc>
+                        </w:tr>
+                      </w:tbl>
+                      <w:p/>
+                    </w:txbxContent>
+                  </v:textbox>
+                </v:roundrect>
+              </w:pict>
+            </w:r>
+          </w:p>
+        </w:tc>
+      </w:tr>
       <w:tr>
         <w:tc>
           <w:tcPr>
-            <w:tcW w:w="4450" w:type="dxa"/>
-            <w:gridSpan w:val="3"/>
-            <w:shd w:val="clear" w:color="auto" w:fill="BFBFBF"/>
+            <w:tcW w:w="5123" w:type="dxa"/>
             <w:tcBorders>
-              <w:top w:val="single" w:sz="6" w:space="0" w:color="404040"/>
-              <w:left w:val="single" w:sz="6" w:space="0" w:color="404040"/>
-              <w:bottom w:val="single" w:sz="6" w:space="0" w:color="404040"/>
-              <w:right w:val="single" w:sz="6" w:space="0" w:color="404040"/>
+              <w:top w:val="nil"/>
+              <w:left w:val="nil"/>
+              <w:bottom w:val="nil"/>
+              <w:right w:val="single" w:sz="4" w:space="0" w:color="7F7F7F"/>
             </w:tcBorders>
-            <w:vAlign w:val="center"/>
             <w:tcMar>
               <w:top w:w="35" w:type="dxa"/>
               <w:left w:w="70" w:type="dxa"/>
               <w:bottom w:w="35" w:type="dxa"/>
               <w:right w:w="70" w:type="dxa"/>
             </w:tcMar>
+            <w:vAlign w:val="center"/>
           </w:tcPr>
           <w:p>
             <w:pPr>
-              <w:spacing w:after="0" w:line="240" w:lineRule="auto"/>
-              <w:jc w:val="center"/>
-              <w:rPr>
-                <w:rFonts w:ascii="Calibri" w:hAnsi="Calibri" w:cs="Calibri"/>
-                <w:b/>
-                <w:sz w:val="16"/>
-                <w:szCs w:val="16"/>
-              </w:rPr>
-            </w:pPr>
-            <w:r>
-              <w:rPr>
-                <w:rFonts w:ascii="Calibri" w:hAnsi="Calibri" w:cs="Calibri"/>
-                <w:b/>
-                <w:sz w:val="16"/>
-                <w:szCs w:val="16"/>
-              </w:rPr>
-              <w:t>PREÇO TOTAL</w:t>
-            </w:r>
-          </w:p>
-        </w:tc>
-        <w:tc>
-          <w:tcPr>
-            <w:tcW w:w="4910" w:type="dxa"/>
-            <w:gridSpan w:val="5"/>
-            <w:shd w:val="clear" w:color="auto" w:fill="BFBFBF"/>
-            <w:tcBorders>
-              <w:top w:val="single" w:sz="6" w:space="0" w:color="404040"/>
-              <w:left w:val="single" w:sz="6" w:space="0" w:color="404040"/>
-              <w:bottom w:val="single" w:sz="6" w:space="0" w:color="404040"/>
-              <w:right w:val="single" w:sz="6" w:space="0" w:color="404040"/>
-            </w:tcBorders>
-            <w:vAlign w:val="center"/>
-            <w:tcMar>
-              <w:top w:w="35" w:type="dxa"/>
-              <w:left w:w="70" w:type="dxa"/>
-              <w:bottom w:w="35" w:type="dxa"/>
-              <w:right w:w="70" w:type="dxa"/>
-            </w:tcMar>
-          </w:tcPr>
-          <w:p>
-            <w:pPr>
-              <w:spacing w:after="0" w:line="240" w:lineRule="auto"/>
-              <w:jc w:val="center"/>
-              <w:rPr>
-                <w:rFonts w:ascii="Calibri" w:hAnsi="Calibri" w:cs="Calibri"/>
-                <w:b/>
-                <w:sz w:val="16"/>
-                <w:szCs w:val="16"/>
-              </w:rPr>
-            </w:pPr>
-            <w:r>
-              <w:rPr>
-                <w:rFonts w:ascii="Calibri" w:hAnsi="Calibri" w:cs="Calibri"/>
-                <w:b/>
-                <w:sz w:val="16"/>
-                <w:szCs w:val="16"/>
-              </w:rPr>
-              <w:t>{preco_total_numero} ({preco_total_extenso})</w:t>
-            </w:r>
-          </w:p>
-        </w:tc>
-      </w:tr>
-    </w:tbl>
-    <w:tbl>
-      <w:tblPr>
-        <w:tblW w:w="9360" w:type="dxa"/>
-        <w:jc w:val="center"/>
-        <w:tblLayout w:type="fixed"/>
-        <w:tblBorders>
-          <w:top w:val="nil"/>
-          <w:left w:val="nil"/>
-          <w:bottom w:val="nil"/>
-          <w:right w:val="nil"/>
-          <w:insideH w:val="nil"/>
-          <w:insideV w:val="nil"/>
-        </w:tblBorders>
-      </w:tblPr>
-      <w:tblGrid>
-        <w:gridCol w:w="4580"/>
-        <w:gridCol w:w="4580"/>
-      </w:tblGrid>
-      <w:tr>
-        <w:tc>
-          <w:tcPr>
-            <w:tcW w:w="4580" w:type="dxa"/>
-            <w:tcBorders>
-              <w:top w:val="nil"/>
-              <w:left w:val="nil"/>
-              <w:bottom w:val="nil"/>
-              <w:right w:val="nil"/>
-            </w:tcBorders>
-            <w:vAlign w:val="center"/>
-            <w:tcMar>
-              <w:top w:w="35" w:type="dxa"/>
-              <w:left w:w="70" w:type="dxa"/>
-              <w:bottom w:w="35" w:type="dxa"/>
-              <w:right w:w="70" w:type="dxa"/>
-            </w:tcMar>
-          </w:tcPr>
-          <w:p>
-            <w:pPr>
-              <w:spacing w:after="0" w:line="240" w:lineRule="auto"/>
               <w:rPr>
                 <w:rFonts w:ascii="Calibri" w:hAnsi="Calibri" w:cs="Calibri"/>
                 <w:sz w:val="16"/>
@@ -2402,24 +2236,23 @@
         </w:tc>
         <w:tc>
           <w:tcPr>
-            <w:tcW w:w="4580" w:type="dxa"/>
+            <w:tcW w:w="5123" w:type="dxa"/>
             <w:tcBorders>
               <w:top w:val="nil"/>
               <w:left w:val="nil"/>
               <w:bottom w:val="nil"/>
               <w:right w:val="nil"/>
             </w:tcBorders>
-            <w:vAlign w:val="center"/>
             <w:tcMar>
               <w:top w:w="35" w:type="dxa"/>
               <w:left w:w="70" w:type="dxa"/>
               <w:bottom w:w="35" w:type="dxa"/>
               <w:right w:w="70" w:type="dxa"/>
             </w:tcMar>
+            <w:vAlign w:val="center"/>
           </w:tcPr>
           <w:p>
             <w:pPr>
-              <w:spacing w:after="0" w:line="240" w:lineRule="auto"/>
               <w:rPr>
                 <w:rFonts w:ascii="Calibri" w:hAnsi="Calibri" w:cs="Calibri"/>
                 <w:sz w:val="16"/>
@@ -2449,24 +2282,23 @@
       <w:tr>
         <w:tc>
           <w:tcPr>
-            <w:tcW w:w="4580" w:type="dxa"/>
+            <w:tcW w:w="5123" w:type="dxa"/>
             <w:tcBorders>
               <w:top w:val="nil"/>
               <w:left w:val="nil"/>
               <w:bottom w:val="nil"/>
-              <w:right w:val="nil"/>
+              <w:right w:val="single" w:sz="4" w:space="0" w:color="7F7F7F"/>
             </w:tcBorders>
-            <w:vAlign w:val="center"/>
             <w:tcMar>
               <w:top w:w="35" w:type="dxa"/>
               <w:left w:w="70" w:type="dxa"/>
               <w:bottom w:w="35" w:type="dxa"/>
               <w:right w:w="70" w:type="dxa"/>
             </w:tcMar>
+            <w:vAlign w:val="center"/>
           </w:tcPr>
           <w:p>
             <w:pPr>
-              <w:spacing w:after="0" w:line="240" w:lineRule="auto"/>
               <w:rPr>
                 <w:rFonts w:ascii="Calibri" w:hAnsi="Calibri" w:cs="Calibri"/>
                 <w:sz w:val="16"/>
@@ -2494,24 +2326,23 @@
         </w:tc>
         <w:tc>
           <w:tcPr>
-            <w:tcW w:w="4580" w:type="dxa"/>
+            <w:tcW w:w="5123" w:type="dxa"/>
             <w:tcBorders>
               <w:top w:val="nil"/>
               <w:left w:val="nil"/>
               <w:bottom w:val="nil"/>
               <w:right w:val="nil"/>
             </w:tcBorders>
-            <w:vAlign w:val="center"/>
             <w:tcMar>
               <w:top w:w="35" w:type="dxa"/>
               <w:left w:w="70" w:type="dxa"/>
               <w:bottom w:w="35" w:type="dxa"/>
               <w:right w:w="70" w:type="dxa"/>
             </w:tcMar>
+            <w:vAlign w:val="center"/>
           </w:tcPr>
           <w:p>
             <w:pPr>
-              <w:spacing w:after="0" w:line="240" w:lineRule="auto"/>
               <w:rPr>
                 <w:rFonts w:ascii="Calibri" w:hAnsi="Calibri" w:cs="Calibri"/>
                 <w:sz w:val="16"/>
@@ -2541,24 +2372,23 @@
       <w:tr>
         <w:tc>
           <w:tcPr>
-            <w:tcW w:w="4580" w:type="dxa"/>
+            <w:tcW w:w="5123" w:type="dxa"/>
             <w:tcBorders>
               <w:top w:val="nil"/>
               <w:left w:val="nil"/>
               <w:bottom w:val="nil"/>
-              <w:right w:val="nil"/>
+              <w:right w:val="single" w:sz="4" w:space="0" w:color="7F7F7F"/>
             </w:tcBorders>
-            <w:vAlign w:val="center"/>
             <w:tcMar>
               <w:top w:w="35" w:type="dxa"/>
               <w:left w:w="70" w:type="dxa"/>
               <w:bottom w:w="35" w:type="dxa"/>
               <w:right w:w="70" w:type="dxa"/>
             </w:tcMar>
+            <w:vAlign w:val="center"/>
           </w:tcPr>
           <w:p>
             <w:pPr>
-              <w:spacing w:after="0" w:line="240" w:lineRule="auto"/>
               <w:rPr>
                 <w:rFonts w:ascii="Calibri" w:hAnsi="Calibri" w:cs="Calibri"/>
                 <w:sz w:val="16"/>
@@ -2586,24 +2416,23 @@
         </w:tc>
         <w:tc>
           <w:tcPr>
-            <w:tcW w:w="4580" w:type="dxa"/>
+            <w:tcW w:w="5123" w:type="dxa"/>
             <w:tcBorders>
               <w:top w:val="nil"/>
               <w:left w:val="nil"/>
               <w:bottom w:val="nil"/>
               <w:right w:val="nil"/>
             </w:tcBorders>
-            <w:vAlign w:val="center"/>
             <w:tcMar>
               <w:top w:w="35" w:type="dxa"/>
               <w:left w:w="70" w:type="dxa"/>
               <w:bottom w:w="35" w:type="dxa"/>
               <w:right w:w="70" w:type="dxa"/>
             </w:tcMar>
+            <w:vAlign w:val="center"/>
           </w:tcPr>
           <w:p>
             <w:pPr>
-              <w:spacing w:after="0" w:line="240" w:lineRule="auto"/>
               <w:rPr>
                 <w:rFonts w:ascii="Calibri" w:hAnsi="Calibri" w:cs="Calibri"/>
                 <w:sz w:val="16"/>
@@ -2635,6 +2464,7 @@
       <w:pPr>
         <w:spacing w:before="130" w:after="130" w:line="120" w:lineRule="exact"/>
         <w:rPr>
+          <w:bCs/>
           <w:sz w:val="4"/>
           <w:szCs w:val="4"/>
         </w:rPr>
@@ -2780,7 +2610,61 @@
           <w:szCs w:val="16"/>
           <w:lang w:eastAsia="pt-BR"/>
         </w:rPr>
-        <w:t>Prazo de Execução</w:t>
+        <w:t>{#mostrar_info_51}</w:t>
+      </w:r>
+    </w:p>
+    <w:p>
+      <w:pPr>
+        <w:pStyle w:val="PargrafodaLista"/>
+        <w:numPr>
+          <w:ilvl w:val="1"/>
+          <w:numId w:val="21"/>
+        </w:numPr>
+        <w:ind w:left="964" w:hanging="284"/>
+        <w:rPr>
+          <w:rFonts w:ascii="Calibri" w:eastAsia="Times New Roman" w:hAnsi="Calibri" w:cs="Calibri"/>
+          <w:color w:val="000000"/>
+          <w:sz w:val="16"/>
+          <w:szCs w:val="16"/>
+          <w:lang w:eastAsia="pt-BR"/>
+        </w:rPr>
+      </w:pPr>
+      <w:r>
+        <w:rPr>
+          <w:rFonts w:ascii="Calibri" w:eastAsia="Times New Roman" w:hAnsi="Calibri" w:cs="Calibri"/>
+          <w:color w:val="000000"/>
+          <w:sz w:val="16"/>
+          <w:szCs w:val="16"/>
+          <w:lang w:eastAsia="pt-BR"/>
+        </w:rPr>
+        <w:t>{texto_info_51}</w:t>
+      </w:r>
+    </w:p>
+    <w:p>
+      <w:pPr>
+        <w:pStyle w:val="PargrafodaLista"/>
+        <w:numPr>
+          <w:ilvl w:val="1"/>
+          <w:numId w:val="21"/>
+        </w:numPr>
+        <w:ind w:left="964" w:hanging="284"/>
+        <w:rPr>
+          <w:rFonts w:ascii="Calibri" w:eastAsia="Times New Roman" w:hAnsi="Calibri" w:cs="Calibri"/>
+          <w:color w:val="000000"/>
+          <w:sz w:val="16"/>
+          <w:szCs w:val="16"/>
+          <w:lang w:eastAsia="pt-BR"/>
+        </w:rPr>
+      </w:pPr>
+      <w:r>
+        <w:rPr>
+          <w:rFonts w:ascii="Calibri" w:eastAsia="Times New Roman" w:hAnsi="Calibri" w:cs="Calibri"/>
+          <w:color w:val="000000"/>
+          <w:sz w:val="16"/>
+          <w:szCs w:val="16"/>
+          <w:lang w:eastAsia="pt-BR"/>
+        </w:rPr>
+        <w:t>{/mostrar_info_51}</w:t>
       </w:r>
     </w:p>
     <w:p>
@@ -2807,7 +2691,7 @@
           <w:szCs w:val="16"/>
           <w:lang w:eastAsia="pt-BR"/>
         </w:rPr>
-        <w:t>Serviços: Estimados em {prazo_execucao_dias}, incluindo translado ida &amp; volta Equipe;</w:t>
+        <w:t>{#mostrar_info_511}</w:t>
       </w:r>
     </w:p>
     <w:p>
@@ -2834,27 +2718,7 @@
           <w:szCs w:val="16"/>
           <w:lang w:eastAsia="pt-BR"/>
         </w:rPr>
-        <w:t xml:space="preserve">Consumíveis/Materiais/Equipamentos: </w:t>
-      </w:r>
-      <w:r>
-        <w:rPr>
-          <w:rFonts w:ascii="Calibri" w:eastAsia="Times New Roman" w:hAnsi="Calibri" w:cs="Calibri"/>
-          <w:color w:val="000000"/>
-          <w:sz w:val="16"/>
-          <w:szCs w:val="16"/>
-          <w:lang w:eastAsia="pt-BR"/>
-        </w:rPr>
-        <w:t>Imediato</w:t>
-      </w:r>
-      <w:r>
-        <w:rPr>
-          <w:rFonts w:ascii="Calibri" w:eastAsia="Times New Roman" w:hAnsi="Calibri" w:cs="Calibri"/>
-          <w:color w:val="000000"/>
-          <w:sz w:val="16"/>
-          <w:szCs w:val="16"/>
-          <w:lang w:eastAsia="pt-BR"/>
-        </w:rPr>
-        <w:t>;</w:t>
+        <w:t>{texto_info_511}</w:t>
       </w:r>
     </w:p>
     <w:p>
@@ -2881,39 +2745,7 @@
           <w:szCs w:val="16"/>
           <w:lang w:eastAsia="pt-BR"/>
         </w:rPr>
-        <w:t>O p</w:t>
-      </w:r>
-      <w:r>
-        <w:rPr>
-          <w:rFonts w:ascii="Calibri" w:eastAsia="Times New Roman" w:hAnsi="Calibri" w:cs="Calibri"/>
-          <w:color w:val="000000"/>
-          <w:sz w:val="16"/>
-          <w:szCs w:val="16"/>
-          <w:lang w:eastAsia="pt-BR"/>
-        </w:rPr>
-        <w:t xml:space="preserve">razo de Execução dos serviços pode ser alterado de acordo com as condições de execução </w:t>
-      </w:r>
-      <w:proofErr w:type="gramStart"/>
-      <w:r>
-        <w:rPr>
-          <w:rFonts w:ascii="Calibri" w:eastAsia="Times New Roman" w:hAnsi="Calibri" w:cs="Calibri"/>
-          <w:color w:val="000000"/>
-          <w:sz w:val="16"/>
-          <w:szCs w:val="16"/>
-          <w:lang w:eastAsia="pt-BR"/>
-        </w:rPr>
-        <w:t>dos mesmos</w:t>
-      </w:r>
-      <w:proofErr w:type="gramEnd"/>
-      <w:r>
-        <w:rPr>
-          <w:rFonts w:ascii="Calibri" w:eastAsia="Times New Roman" w:hAnsi="Calibri" w:cs="Calibri"/>
-          <w:color w:val="000000"/>
-          <w:sz w:val="16"/>
-          <w:szCs w:val="16"/>
-          <w:lang w:eastAsia="pt-BR"/>
-        </w:rPr>
-        <w:t>;</w:t>
+        <w:t>{/mostrar_info_511}</w:t>
       </w:r>
     </w:p>
     <w:p>
@@ -2940,8 +2772,25 @@
           <w:szCs w:val="16"/>
           <w:lang w:eastAsia="pt-BR"/>
         </w:rPr>
-        <w:t>Caso o prazo de execução seja diferente do mencionado, o valor total da presente proposta será alterado conforme as informações abaixo</w:t>
+        <w:t>{#mostrar_info_512}</w:t>
       </w:r>
+    </w:p>
+    <w:p>
+      <w:pPr>
+        <w:pStyle w:val="PargrafodaLista"/>
+        <w:numPr>
+          <w:ilvl w:val="2"/>
+          <w:numId w:val="21"/>
+        </w:numPr>
+        <w:ind w:left="1191" w:hanging="227"/>
+        <w:rPr>
+          <w:rFonts w:ascii="Calibri" w:eastAsia="Times New Roman" w:hAnsi="Calibri" w:cs="Calibri"/>
+          <w:color w:val="000000"/>
+          <w:sz w:val="16"/>
+          <w:szCs w:val="16"/>
+          <w:lang w:eastAsia="pt-BR"/>
+        </w:rPr>
+      </w:pPr>
       <w:r>
         <w:rPr>
           <w:rFonts w:ascii="Calibri" w:eastAsia="Times New Roman" w:hAnsi="Calibri" w:cs="Calibri"/>
@@ -2950,7 +2799,196 @@
           <w:szCs w:val="16"/>
           <w:lang w:eastAsia="pt-BR"/>
         </w:rPr>
-        <w:t>:</w:t>
+        <w:t>{texto_info_512}</w:t>
+      </w:r>
+    </w:p>
+    <w:p>
+      <w:pPr>
+        <w:pStyle w:val="PargrafodaLista"/>
+        <w:numPr>
+          <w:ilvl w:val="2"/>
+          <w:numId w:val="21"/>
+        </w:numPr>
+        <w:ind w:left="1191" w:hanging="227"/>
+        <w:rPr>
+          <w:rFonts w:ascii="Calibri" w:eastAsia="Times New Roman" w:hAnsi="Calibri" w:cs="Calibri"/>
+          <w:color w:val="000000"/>
+          <w:sz w:val="16"/>
+          <w:szCs w:val="16"/>
+          <w:lang w:eastAsia="pt-BR"/>
+        </w:rPr>
+      </w:pPr>
+      <w:r>
+        <w:rPr>
+          <w:rFonts w:ascii="Calibri" w:eastAsia="Times New Roman" w:hAnsi="Calibri" w:cs="Calibri"/>
+          <w:color w:val="000000"/>
+          <w:sz w:val="16"/>
+          <w:szCs w:val="16"/>
+          <w:lang w:eastAsia="pt-BR"/>
+        </w:rPr>
+        <w:t>{/mostrar_info_512}</w:t>
+      </w:r>
+    </w:p>
+    <w:p>
+      <w:pPr>
+        <w:pStyle w:val="PargrafodaLista"/>
+        <w:numPr>
+          <w:ilvl w:val="2"/>
+          <w:numId w:val="21"/>
+        </w:numPr>
+        <w:ind w:left="1191" w:hanging="227"/>
+        <w:rPr>
+          <w:rFonts w:ascii="Calibri" w:eastAsia="Times New Roman" w:hAnsi="Calibri" w:cs="Calibri"/>
+          <w:color w:val="000000"/>
+          <w:sz w:val="16"/>
+          <w:szCs w:val="16"/>
+          <w:lang w:eastAsia="pt-BR"/>
+        </w:rPr>
+      </w:pPr>
+      <w:r>
+        <w:rPr>
+          <w:rFonts w:ascii="Calibri" w:eastAsia="Times New Roman" w:hAnsi="Calibri" w:cs="Calibri"/>
+          <w:color w:val="000000"/>
+          <w:sz w:val="16"/>
+          <w:szCs w:val="16"/>
+          <w:lang w:eastAsia="pt-BR"/>
+        </w:rPr>
+        <w:t>{#mostrar_info_513}</w:t>
+      </w:r>
+    </w:p>
+    <w:p>
+      <w:pPr>
+        <w:pStyle w:val="PargrafodaLista"/>
+        <w:numPr>
+          <w:ilvl w:val="2"/>
+          <w:numId w:val="21"/>
+        </w:numPr>
+        <w:ind w:left="1191" w:hanging="227"/>
+        <w:rPr>
+          <w:rFonts w:ascii="Calibri" w:eastAsia="Times New Roman" w:hAnsi="Calibri" w:cs="Calibri"/>
+          <w:color w:val="000000"/>
+          <w:sz w:val="16"/>
+          <w:szCs w:val="16"/>
+          <w:lang w:eastAsia="pt-BR"/>
+        </w:rPr>
+      </w:pPr>
+      <w:r>
+        <w:rPr>
+          <w:rFonts w:ascii="Calibri" w:eastAsia="Times New Roman" w:hAnsi="Calibri" w:cs="Calibri"/>
+          <w:color w:val="000000"/>
+          <w:sz w:val="16"/>
+          <w:szCs w:val="16"/>
+          <w:lang w:eastAsia="pt-BR"/>
+        </w:rPr>
+        <w:t>{texto_info_513}</w:t>
+      </w:r>
+    </w:p>
+    <w:p>
+      <w:pPr>
+        <w:pStyle w:val="PargrafodaLista"/>
+        <w:numPr>
+          <w:ilvl w:val="2"/>
+          <w:numId w:val="21"/>
+        </w:numPr>
+        <w:ind w:left="1191" w:hanging="227"/>
+        <w:rPr>
+          <w:rFonts w:ascii="Calibri" w:eastAsia="Times New Roman" w:hAnsi="Calibri" w:cs="Calibri"/>
+          <w:color w:val="000000"/>
+          <w:sz w:val="16"/>
+          <w:szCs w:val="16"/>
+          <w:lang w:eastAsia="pt-BR"/>
+        </w:rPr>
+      </w:pPr>
+      <w:r>
+        <w:rPr>
+          <w:rFonts w:ascii="Calibri" w:eastAsia="Times New Roman" w:hAnsi="Calibri" w:cs="Calibri"/>
+          <w:color w:val="000000"/>
+          <w:sz w:val="16"/>
+          <w:szCs w:val="16"/>
+          <w:lang w:eastAsia="pt-BR"/>
+        </w:rPr>
+        <w:t>{/mostrar_info_513}</w:t>
+      </w:r>
+    </w:p>
+    <w:p>
+      <w:pPr>
+        <w:pStyle w:val="PargrafodaLista"/>
+        <w:numPr>
+          <w:ilvl w:val="2"/>
+          <w:numId w:val="21"/>
+        </w:numPr>
+        <w:ind w:left="1191" w:hanging="227"/>
+        <w:rPr>
+          <w:rFonts w:ascii="Calibri" w:eastAsia="Times New Roman" w:hAnsi="Calibri" w:cs="Calibri"/>
+          <w:color w:val="000000"/>
+          <w:sz w:val="16"/>
+          <w:szCs w:val="16"/>
+          <w:lang w:eastAsia="pt-BR"/>
+        </w:rPr>
+      </w:pPr>
+      <w:r>
+        <w:rPr>
+          <w:rFonts w:ascii="Calibri" w:eastAsia="Times New Roman" w:hAnsi="Calibri" w:cs="Calibri"/>
+          <w:color w:val="000000"/>
+          <w:sz w:val="16"/>
+          <w:szCs w:val="16"/>
+          <w:lang w:eastAsia="pt-BR"/>
+        </w:rPr>
+        <w:t>{#mostrar_info_514}</w:t>
+      </w:r>
+    </w:p>
+    <w:p>
+      <w:pPr>
+        <w:pStyle w:val="PargrafodaLista"/>
+        <w:numPr>
+          <w:ilvl w:val="2"/>
+          <w:numId w:val="21"/>
+        </w:numPr>
+        <w:ind w:left="1191" w:hanging="227"/>
+        <w:rPr>
+          <w:rFonts w:ascii="Calibri" w:eastAsia="Times New Roman" w:hAnsi="Calibri" w:cs="Calibri"/>
+          <w:color w:val="000000"/>
+          <w:sz w:val="16"/>
+          <w:szCs w:val="16"/>
+          <w:lang w:eastAsia="pt-BR"/>
+        </w:rPr>
+      </w:pPr>
+      <w:r>
+        <w:rPr>
+          <w:rFonts w:ascii="Calibri" w:eastAsia="Times New Roman" w:hAnsi="Calibri" w:cs="Calibri"/>
+          <w:color w:val="000000"/>
+          <w:sz w:val="16"/>
+          <w:szCs w:val="16"/>
+          <w:lang w:eastAsia="pt-BR"/>
+        </w:rPr>
+        <w:t>{texto_info_514}</w:t>
+      </w:r>
+    </w:p>
+    <w:p>
+      <w:pPr>
+        <w:pStyle w:val="PargrafodaLista"/>
+        <w:numPr>
+          <w:ilvl w:val="2"/>
+          <w:numId w:val="21"/>
+        </w:numPr>
+        <w:ind w:left="1191" w:hanging="227"/>
+        <w:rPr>
+          <w:rFonts w:ascii="Calibri" w:eastAsia="Times New Roman" w:hAnsi="Calibri" w:cs="Calibri"/>
+          <w:color w:val="000000"/>
+          <w:sz w:val="16"/>
+          <w:szCs w:val="16"/>
+          <w:lang w:eastAsia="pt-BR"/>
+        </w:rPr>
+      </w:pPr>
+      <w:r>
+        <w:rPr>
+          <w:rFonts w:ascii="Calibri" w:eastAsia="Times New Roman" w:hAnsi="Calibri" w:cs="Calibri"/>
+          <w:color w:val="000000"/>
+          <w:sz w:val="16"/>
+          <w:szCs w:val="16"/>
+          <w:lang w:eastAsia="pt-BR"/>
+        </w:rPr>
+        <w:t>{/mostrar_info_514}</w:t>
       </w:r>
     </w:p>
     <w:p>
@@ -2977,7 +3015,7 @@
           <w:szCs w:val="16"/>
           <w:lang w:eastAsia="pt-BR"/>
         </w:rPr>
-        <w:t>De Segunda-feira a Sexta-feira das 17h30min até as 7h30min 50% adicional;</w:t>
+        <w:t>{#mostrar_info_514a}</w:t>
       </w:r>
     </w:p>
     <w:p>
@@ -3004,7 +3042,7 @@
           <w:szCs w:val="16"/>
           <w:lang w:eastAsia="pt-BR"/>
         </w:rPr>
-        <w:t>Durante o Sábado 50% adicional o dia todo;</w:t>
+        <w:t>{texto_info_514a}</w:t>
       </w:r>
     </w:p>
     <w:p>
@@ -3031,7 +3069,7 @@
           <w:szCs w:val="16"/>
           <w:lang w:eastAsia="pt-BR"/>
         </w:rPr>
-        <w:t>Domingos e Feriados 100% adicional o dia todo;</w:t>
+        <w:t>{/mostrar_info_514a}</w:t>
       </w:r>
     </w:p>
     <w:p>
@@ -3058,7 +3096,223 @@
           <w:szCs w:val="16"/>
           <w:lang w:eastAsia="pt-BR"/>
         </w:rPr>
-        <w:t>Diária Offshore quando o barco em operação ou fundeado e a equipe permanecer a bordo.</w:t>
+        <w:t>{#mostrar_info_514b}</w:t>
+      </w:r>
+    </w:p>
+    <w:p>
+      <w:pPr>
+        <w:pStyle w:val="PargrafodaLista"/>
+        <w:numPr>
+          <w:ilvl w:val="0"/>
+          <w:numId w:val="40"/>
+        </w:numPr>
+        <w:ind w:left="1645" w:hanging="227"/>
+        <w:rPr>
+          <w:rFonts w:ascii="Calibri" w:eastAsia="Times New Roman" w:hAnsi="Calibri" w:cs="Calibri"/>
+          <w:color w:val="000000"/>
+          <w:sz w:val="16"/>
+          <w:szCs w:val="16"/>
+          <w:lang w:eastAsia="pt-BR"/>
+        </w:rPr>
+      </w:pPr>
+      <w:r>
+        <w:rPr>
+          <w:rFonts w:ascii="Calibri" w:eastAsia="Times New Roman" w:hAnsi="Calibri" w:cs="Calibri"/>
+          <w:color w:val="000000"/>
+          <w:sz w:val="16"/>
+          <w:szCs w:val="16"/>
+          <w:lang w:eastAsia="pt-BR"/>
+        </w:rPr>
+        <w:t>{texto_info_514b}</w:t>
+      </w:r>
+    </w:p>
+    <w:p>
+      <w:pPr>
+        <w:pStyle w:val="PargrafodaLista"/>
+        <w:numPr>
+          <w:ilvl w:val="0"/>
+          <w:numId w:val="40"/>
+        </w:numPr>
+        <w:ind w:left="1645" w:hanging="227"/>
+        <w:rPr>
+          <w:rFonts w:ascii="Calibri" w:eastAsia="Times New Roman" w:hAnsi="Calibri" w:cs="Calibri"/>
+          <w:color w:val="000000"/>
+          <w:sz w:val="16"/>
+          <w:szCs w:val="16"/>
+          <w:lang w:eastAsia="pt-BR"/>
+        </w:rPr>
+      </w:pPr>
+      <w:r>
+        <w:rPr>
+          <w:rFonts w:ascii="Calibri" w:eastAsia="Times New Roman" w:hAnsi="Calibri" w:cs="Calibri"/>
+          <w:color w:val="000000"/>
+          <w:sz w:val="16"/>
+          <w:szCs w:val="16"/>
+          <w:lang w:eastAsia="pt-BR"/>
+        </w:rPr>
+        <w:t>{/mostrar_info_514b}</w:t>
+      </w:r>
+    </w:p>
+    <w:p>
+      <w:pPr>
+        <w:pStyle w:val="PargrafodaLista"/>
+        <w:numPr>
+          <w:ilvl w:val="0"/>
+          <w:numId w:val="40"/>
+        </w:numPr>
+        <w:ind w:left="1645" w:hanging="227"/>
+        <w:rPr>
+          <w:rFonts w:ascii="Calibri" w:eastAsia="Times New Roman" w:hAnsi="Calibri" w:cs="Calibri"/>
+          <w:color w:val="000000"/>
+          <w:sz w:val="16"/>
+          <w:szCs w:val="16"/>
+          <w:lang w:eastAsia="pt-BR"/>
+        </w:rPr>
+      </w:pPr>
+      <w:r>
+        <w:rPr>
+          <w:rFonts w:ascii="Calibri" w:eastAsia="Times New Roman" w:hAnsi="Calibri" w:cs="Calibri"/>
+          <w:color w:val="000000"/>
+          <w:sz w:val="16"/>
+          <w:szCs w:val="16"/>
+          <w:lang w:eastAsia="pt-BR"/>
+        </w:rPr>
+        <w:t>{#mostrar_info_514c}</w:t>
+      </w:r>
+    </w:p>
+    <w:p>
+      <w:pPr>
+        <w:pStyle w:val="PargrafodaLista"/>
+        <w:numPr>
+          <w:ilvl w:val="0"/>
+          <w:numId w:val="40"/>
+        </w:numPr>
+        <w:ind w:left="1645" w:hanging="227"/>
+        <w:rPr>
+          <w:rFonts w:ascii="Calibri" w:eastAsia="Times New Roman" w:hAnsi="Calibri" w:cs="Calibri"/>
+          <w:color w:val="000000"/>
+          <w:sz w:val="16"/>
+          <w:szCs w:val="16"/>
+          <w:lang w:eastAsia="pt-BR"/>
+        </w:rPr>
+      </w:pPr>
+      <w:r>
+        <w:rPr>
+          <w:rFonts w:ascii="Calibri" w:eastAsia="Times New Roman" w:hAnsi="Calibri" w:cs="Calibri"/>
+          <w:color w:val="000000"/>
+          <w:sz w:val="16"/>
+          <w:szCs w:val="16"/>
+          <w:lang w:eastAsia="pt-BR"/>
+        </w:rPr>
+        <w:t>{texto_info_514c}</w:t>
+      </w:r>
+    </w:p>
+    <w:p>
+      <w:pPr>
+        <w:pStyle w:val="PargrafodaLista"/>
+        <w:numPr>
+          <w:ilvl w:val="0"/>
+          <w:numId w:val="40"/>
+        </w:numPr>
+        <w:ind w:left="1645" w:hanging="227"/>
+        <w:rPr>
+          <w:rFonts w:ascii="Calibri" w:eastAsia="Times New Roman" w:hAnsi="Calibri" w:cs="Calibri"/>
+          <w:color w:val="000000"/>
+          <w:sz w:val="16"/>
+          <w:szCs w:val="16"/>
+          <w:lang w:eastAsia="pt-BR"/>
+        </w:rPr>
+      </w:pPr>
+      <w:r>
+        <w:rPr>
+          <w:rFonts w:ascii="Calibri" w:eastAsia="Times New Roman" w:hAnsi="Calibri" w:cs="Calibri"/>
+          <w:color w:val="000000"/>
+          <w:sz w:val="16"/>
+          <w:szCs w:val="16"/>
+          <w:lang w:eastAsia="pt-BR"/>
+        </w:rPr>
+        <w:t>{/mostrar_info_514c}</w:t>
+      </w:r>
+    </w:p>
+    <w:p>
+      <w:pPr>
+        <w:pStyle w:val="PargrafodaLista"/>
+        <w:numPr>
+          <w:ilvl w:val="0"/>
+          <w:numId w:val="40"/>
+        </w:numPr>
+        <w:ind w:left="1645" w:hanging="227"/>
+        <w:rPr>
+          <w:rFonts w:ascii="Calibri" w:eastAsia="Times New Roman" w:hAnsi="Calibri" w:cs="Calibri"/>
+          <w:color w:val="000000"/>
+          <w:sz w:val="16"/>
+          <w:szCs w:val="16"/>
+          <w:lang w:eastAsia="pt-BR"/>
+        </w:rPr>
+      </w:pPr>
+      <w:r>
+        <w:rPr>
+          <w:rFonts w:ascii="Calibri" w:eastAsia="Times New Roman" w:hAnsi="Calibri" w:cs="Calibri"/>
+          <w:color w:val="000000"/>
+          <w:sz w:val="16"/>
+          <w:szCs w:val="16"/>
+          <w:lang w:eastAsia="pt-BR"/>
+        </w:rPr>
+        <w:t>{#mostrar_info_514d}</w:t>
+      </w:r>
+    </w:p>
+    <w:p>
+      <w:pPr>
+        <w:pStyle w:val="PargrafodaLista"/>
+        <w:numPr>
+          <w:ilvl w:val="0"/>
+          <w:numId w:val="40"/>
+        </w:numPr>
+        <w:ind w:left="1645" w:hanging="227"/>
+        <w:rPr>
+          <w:rFonts w:ascii="Calibri" w:eastAsia="Times New Roman" w:hAnsi="Calibri" w:cs="Calibri"/>
+          <w:color w:val="000000"/>
+          <w:sz w:val="16"/>
+          <w:szCs w:val="16"/>
+          <w:lang w:eastAsia="pt-BR"/>
+        </w:rPr>
+      </w:pPr>
+      <w:r>
+        <w:rPr>
+          <w:rFonts w:ascii="Calibri" w:eastAsia="Times New Roman" w:hAnsi="Calibri" w:cs="Calibri"/>
+          <w:color w:val="000000"/>
+          <w:sz w:val="16"/>
+          <w:szCs w:val="16"/>
+          <w:lang w:eastAsia="pt-BR"/>
+        </w:rPr>
+        <w:t>{texto_info_514d}</w:t>
+      </w:r>
+    </w:p>
+    <w:p>
+      <w:pPr>
+        <w:pStyle w:val="PargrafodaLista"/>
+        <w:numPr>
+          <w:ilvl w:val="0"/>
+          <w:numId w:val="40"/>
+        </w:numPr>
+        <w:ind w:left="1645" w:hanging="227"/>
+        <w:rPr>
+          <w:rFonts w:ascii="Calibri" w:eastAsia="Times New Roman" w:hAnsi="Calibri" w:cs="Calibri"/>
+          <w:color w:val="000000"/>
+          <w:sz w:val="16"/>
+          <w:szCs w:val="16"/>
+          <w:lang w:eastAsia="pt-BR"/>
+        </w:rPr>
+      </w:pPr>
+      <w:r>
+        <w:rPr>
+          <w:rFonts w:ascii="Calibri" w:eastAsia="Times New Roman" w:hAnsi="Calibri" w:cs="Calibri"/>
+          <w:color w:val="000000"/>
+          <w:sz w:val="16"/>
+          <w:szCs w:val="16"/>
+          <w:lang w:eastAsia="pt-BR"/>
+        </w:rPr>
+        <w:t>{/mostrar_info_514d}</w:t>
       </w:r>
     </w:p>
     <w:p>
@@ -3085,79 +3339,7 @@
           <w:szCs w:val="16"/>
           <w:lang w:eastAsia="pt-BR"/>
         </w:rPr>
-        <w:t>Caso haja a necessidade de subs</w:t>
-      </w:r>
-      <w:r>
-        <w:rPr>
-          <w:rFonts w:ascii="Calibri" w:eastAsia="Calibri" w:hAnsi="Calibri" w:cs="Calibri"/>
-          <w:color w:val="000000"/>
-          <w:sz w:val="16"/>
-          <w:szCs w:val="16"/>
-          <w:lang w:eastAsia="pt-BR"/>
-        </w:rPr>
-        <w:t>ti</w:t>
-      </w:r>
-      <w:r>
-        <w:rPr>
-          <w:rFonts w:ascii="Calibri" w:eastAsia="Times New Roman" w:hAnsi="Calibri" w:cs="Calibri"/>
-          <w:color w:val="000000"/>
-          <w:sz w:val="16"/>
-          <w:szCs w:val="16"/>
-          <w:lang w:eastAsia="pt-BR"/>
-        </w:rPr>
-        <w:t xml:space="preserve">tuição de algum componente não previsto nesta proposta </w:t>
-      </w:r>
-      <w:proofErr w:type="gramStart"/>
-      <w:r>
-        <w:rPr>
-          <w:rFonts w:ascii="Calibri" w:eastAsia="Times New Roman" w:hAnsi="Calibri" w:cs="Calibri"/>
-          <w:color w:val="000000"/>
-          <w:sz w:val="16"/>
-          <w:szCs w:val="16"/>
-          <w:lang w:eastAsia="pt-BR"/>
-        </w:rPr>
-        <w:t>o mesmo</w:t>
-      </w:r>
-      <w:proofErr w:type="gramEnd"/>
-      <w:r>
-        <w:rPr>
-          <w:rFonts w:ascii="Calibri" w:eastAsia="Times New Roman" w:hAnsi="Calibri" w:cs="Calibri"/>
-          <w:color w:val="000000"/>
-          <w:sz w:val="16"/>
-          <w:szCs w:val="16"/>
-          <w:lang w:eastAsia="pt-BR"/>
-        </w:rPr>
-        <w:t xml:space="preserve"> será objeto de orçamento adi</w:t>
-      </w:r>
-      <w:r>
-        <w:rPr>
-          <w:rFonts w:ascii="Calibri" w:eastAsia="Calibri" w:hAnsi="Calibri" w:cs="Calibri"/>
-          <w:color w:val="000000"/>
-          <w:sz w:val="16"/>
-          <w:szCs w:val="16"/>
-          <w:lang w:eastAsia="pt-BR"/>
-        </w:rPr>
-        <w:t>ti</w:t>
-      </w:r>
-      <w:r>
-        <w:rPr>
-          <w:rFonts w:ascii="Calibri" w:eastAsia="Times New Roman" w:hAnsi="Calibri" w:cs="Calibri"/>
-          <w:color w:val="000000"/>
-          <w:sz w:val="16"/>
-          <w:szCs w:val="16"/>
-          <w:lang w:eastAsia="pt-BR"/>
-        </w:rPr>
-        <w:t>vo</w:t>
-      </w:r>
-      <w:r>
-        <w:rPr>
-          <w:rFonts w:ascii="Calibri" w:eastAsia="Times New Roman" w:hAnsi="Calibri" w:cs="Calibri"/>
-          <w:color w:val="000000"/>
-          <w:sz w:val="16"/>
-          <w:szCs w:val="16"/>
-          <w:lang w:eastAsia="pt-BR"/>
-        </w:rPr>
-        <w:t>.</w:t>
+        <w:t>{#mostrar_info_52}</w:t>
       </w:r>
     </w:p>
     <w:p>
@@ -3184,17 +3366,7 @@
           <w:szCs w:val="16"/>
           <w:lang w:eastAsia="pt-BR"/>
         </w:rPr>
-        <w:t>Após o término do serviço será enviado uma medição, incluindo as horas de viagem, espera a bordo e a disposição, caso necessário</w:t>
-      </w:r>
-      <w:r>
-        <w:rPr>
-          <w:rFonts w:ascii="Calibri" w:eastAsia="Times New Roman" w:hAnsi="Calibri" w:cs="Calibri"/>
-          <w:color w:val="000000"/>
-          <w:sz w:val="16"/>
-          <w:szCs w:val="16"/>
-          <w:lang w:eastAsia="pt-BR"/>
-        </w:rPr>
-        <w:t>.</w:t>
+        <w:t>{texto_info_52}</w:t>
       </w:r>
     </w:p>
     <w:p>
@@ -3221,8 +3393,25 @@
           <w:szCs w:val="16"/>
           <w:lang w:eastAsia="pt-BR"/>
         </w:rPr>
-        <w:t>Todas as despesas com deslocamento, alimentação e estadia da equipe, caso necessário, serão por conta do cliente</w:t>
+        <w:t>{/mostrar_info_52}</w:t>
       </w:r>
+    </w:p>
+    <w:p>
+      <w:pPr>
+        <w:pStyle w:val="PargrafodaLista"/>
+        <w:numPr>
+          <w:ilvl w:val="1"/>
+          <w:numId w:val="21"/>
+        </w:numPr>
+        <w:ind w:left="964" w:hanging="284"/>
+        <w:rPr>
+          <w:rFonts w:ascii="Calibri" w:eastAsia="Times New Roman" w:hAnsi="Calibri" w:cs="Calibri"/>
+          <w:color w:val="000000"/>
+          <w:sz w:val="16"/>
+          <w:szCs w:val="16"/>
+          <w:lang w:eastAsia="pt-BR"/>
+        </w:rPr>
+      </w:pPr>
       <w:r>
         <w:rPr>
           <w:rFonts w:ascii="Calibri" w:eastAsia="Times New Roman" w:hAnsi="Calibri" w:cs="Calibri"/>
@@ -3231,7 +3420,142 @@
           <w:szCs w:val="16"/>
           <w:lang w:eastAsia="pt-BR"/>
         </w:rPr>
-        <w:t>;</w:t>
+        <w:t>{#mostrar_info_53}</w:t>
+      </w:r>
+    </w:p>
+    <w:p>
+      <w:pPr>
+        <w:pStyle w:val="PargrafodaLista"/>
+        <w:numPr>
+          <w:ilvl w:val="1"/>
+          <w:numId w:val="21"/>
+        </w:numPr>
+        <w:ind w:left="964" w:hanging="284"/>
+        <w:rPr>
+          <w:rFonts w:ascii="Calibri" w:eastAsia="Times New Roman" w:hAnsi="Calibri" w:cs="Calibri"/>
+          <w:color w:val="000000"/>
+          <w:sz w:val="16"/>
+          <w:szCs w:val="16"/>
+          <w:lang w:eastAsia="pt-BR"/>
+        </w:rPr>
+      </w:pPr>
+      <w:r>
+        <w:rPr>
+          <w:rFonts w:ascii="Calibri" w:eastAsia="Times New Roman" w:hAnsi="Calibri" w:cs="Calibri"/>
+          <w:color w:val="000000"/>
+          <w:sz w:val="16"/>
+          <w:szCs w:val="16"/>
+          <w:lang w:eastAsia="pt-BR"/>
+        </w:rPr>
+        <w:t>{texto_info_53}</w:t>
+      </w:r>
+    </w:p>
+    <w:p>
+      <w:pPr>
+        <w:pStyle w:val="PargrafodaLista"/>
+        <w:numPr>
+          <w:ilvl w:val="1"/>
+          <w:numId w:val="21"/>
+        </w:numPr>
+        <w:ind w:left="964" w:hanging="284"/>
+        <w:rPr>
+          <w:rFonts w:ascii="Calibri" w:eastAsia="Times New Roman" w:hAnsi="Calibri" w:cs="Calibri"/>
+          <w:color w:val="000000"/>
+          <w:sz w:val="16"/>
+          <w:szCs w:val="16"/>
+          <w:lang w:eastAsia="pt-BR"/>
+        </w:rPr>
+      </w:pPr>
+      <w:r>
+        <w:rPr>
+          <w:rFonts w:ascii="Calibri" w:eastAsia="Times New Roman" w:hAnsi="Calibri" w:cs="Calibri"/>
+          <w:color w:val="000000"/>
+          <w:sz w:val="16"/>
+          <w:szCs w:val="16"/>
+          <w:lang w:eastAsia="pt-BR"/>
+        </w:rPr>
+        <w:t>{/mostrar_info_53}</w:t>
+      </w:r>
+    </w:p>
+    <w:p>
+      <w:pPr>
+        <w:pStyle w:val="PargrafodaLista"/>
+        <w:numPr>
+          <w:ilvl w:val="1"/>
+          <w:numId w:val="21"/>
+        </w:numPr>
+        <w:ind w:left="964" w:hanging="284"/>
+        <w:rPr>
+          <w:rFonts w:ascii="Calibri" w:eastAsia="Times New Roman" w:hAnsi="Calibri" w:cs="Calibri"/>
+          <w:color w:val="000000"/>
+          <w:sz w:val="16"/>
+          <w:szCs w:val="16"/>
+          <w:lang w:eastAsia="pt-BR"/>
+        </w:rPr>
+      </w:pPr>
+      <w:r>
+        <w:rPr>
+          <w:rFonts w:ascii="Calibri" w:eastAsia="Times New Roman" w:hAnsi="Calibri" w:cs="Calibri"/>
+          <w:color w:val="000000"/>
+          <w:sz w:val="16"/>
+          <w:szCs w:val="16"/>
+          <w:lang w:eastAsia="pt-BR"/>
+        </w:rPr>
+        <w:t>{#mostrar_info_54}</w:t>
+      </w:r>
+    </w:p>
+    <w:p>
+      <w:pPr>
+        <w:pStyle w:val="PargrafodaLista"/>
+        <w:numPr>
+          <w:ilvl w:val="1"/>
+          <w:numId w:val="21"/>
+        </w:numPr>
+        <w:ind w:left="964" w:hanging="284"/>
+        <w:rPr>
+          <w:rFonts w:ascii="Calibri" w:eastAsia="Times New Roman" w:hAnsi="Calibri" w:cs="Calibri"/>
+          <w:color w:val="000000"/>
+          <w:sz w:val="16"/>
+          <w:szCs w:val="16"/>
+          <w:lang w:eastAsia="pt-BR"/>
+        </w:rPr>
+      </w:pPr>
+      <w:r>
+        <w:rPr>
+          <w:rFonts w:ascii="Calibri" w:eastAsia="Times New Roman" w:hAnsi="Calibri" w:cs="Calibri"/>
+          <w:color w:val="000000"/>
+          <w:sz w:val="16"/>
+          <w:szCs w:val="16"/>
+          <w:lang w:eastAsia="pt-BR"/>
+        </w:rPr>
+        <w:t>{texto_info_54}</w:t>
+      </w:r>
+    </w:p>
+    <w:p>
+      <w:pPr>
+        <w:pStyle w:val="PargrafodaLista"/>
+        <w:numPr>
+          <w:ilvl w:val="1"/>
+          <w:numId w:val="21"/>
+        </w:numPr>
+        <w:ind w:left="964" w:hanging="284"/>
+        <w:rPr>
+          <w:rFonts w:ascii="Calibri" w:eastAsia="Times New Roman" w:hAnsi="Calibri" w:cs="Calibri"/>
+          <w:color w:val="000000"/>
+          <w:sz w:val="16"/>
+          <w:szCs w:val="16"/>
+          <w:lang w:eastAsia="pt-BR"/>
+        </w:rPr>
+      </w:pPr>
+      <w:r>
+        <w:rPr>
+          <w:rFonts w:ascii="Calibri" w:eastAsia="Times New Roman" w:hAnsi="Calibri" w:cs="Calibri"/>
+          <w:color w:val="000000"/>
+          <w:sz w:val="16"/>
+          <w:szCs w:val="16"/>
+          <w:lang w:eastAsia="pt-BR"/>
+        </w:rPr>
+        <w:t>{/mostrar_info_54}</w:t>
       </w:r>
     </w:p>
     <w:p>
@@ -3258,9 +3582,25 @@
           <w:szCs w:val="16"/>
           <w:lang w:eastAsia="pt-BR"/>
         </w:rPr>
-        <w:t xml:space="preserve">Os Equipamentos e Ferramentas de propriedade da SUPPLY MARINE deverão ser devolvidos no prazo máximo de 03 (três) dias após a conclusão dos serviços. Caso contrário, a SUPPLY MARINE cobrará pelos custos de cessão </w:t>
+        <w:t>{#mostrar_info_55}</w:t>
       </w:r>
-      <w:proofErr w:type="gramStart"/>
+    </w:p>
+    <w:p>
+      <w:pPr>
+        <w:pStyle w:val="PargrafodaLista"/>
+        <w:numPr>
+          <w:ilvl w:val="1"/>
+          <w:numId w:val="21"/>
+        </w:numPr>
+        <w:ind w:left="964" w:right="567" w:hanging="284"/>
+        <w:rPr>
+          <w:rFonts w:ascii="Calibri" w:eastAsia="Times New Roman" w:hAnsi="Calibri" w:cs="Calibri"/>
+          <w:color w:val="000000"/>
+          <w:sz w:val="16"/>
+          <w:szCs w:val="16"/>
+          <w:lang w:eastAsia="pt-BR"/>
+        </w:rPr>
+      </w:pPr>
       <w:r>
         <w:rPr>
           <w:rFonts w:ascii="Calibri" w:eastAsia="Times New Roman" w:hAnsi="Calibri" w:cs="Calibri"/>
@@ -3269,9 +3609,25 @@
           <w:szCs w:val="16"/>
           <w:lang w:eastAsia="pt-BR"/>
         </w:rPr>
-        <w:t>dos mesmos</w:t>
+        <w:t>{texto_info_55}</w:t>
       </w:r>
-      <w:proofErr w:type="gramEnd"/>
+    </w:p>
+    <w:p>
+      <w:pPr>
+        <w:pStyle w:val="PargrafodaLista"/>
+        <w:numPr>
+          <w:ilvl w:val="1"/>
+          <w:numId w:val="21"/>
+        </w:numPr>
+        <w:ind w:left="964" w:right="567" w:hanging="284"/>
+        <w:rPr>
+          <w:rFonts w:ascii="Calibri" w:eastAsia="Times New Roman" w:hAnsi="Calibri" w:cs="Calibri"/>
+          <w:color w:val="000000"/>
+          <w:sz w:val="16"/>
+          <w:szCs w:val="16"/>
+          <w:lang w:eastAsia="pt-BR"/>
+        </w:rPr>
+      </w:pPr>
       <w:r>
         <w:rPr>
           <w:rFonts w:ascii="Calibri" w:eastAsia="Times New Roman" w:hAnsi="Calibri" w:cs="Calibri"/>
@@ -3280,7 +3636,88 @@
           <w:szCs w:val="16"/>
           <w:lang w:eastAsia="pt-BR"/>
         </w:rPr>
-        <w:t xml:space="preserve"> conforme tabela abaixo:</w:t>
+        <w:t>{/mostrar_info_55}</w:t>
+      </w:r>
+    </w:p>
+    <w:p>
+      <w:pPr>
+        <w:pStyle w:val="PargrafodaLista"/>
+        <w:numPr>
+          <w:ilvl w:val="1"/>
+          <w:numId w:val="21"/>
+        </w:numPr>
+        <w:ind w:left="964" w:right="567" w:hanging="284"/>
+        <w:rPr>
+          <w:rFonts w:ascii="Calibri" w:eastAsia="Times New Roman" w:hAnsi="Calibri" w:cs="Calibri"/>
+          <w:color w:val="000000"/>
+          <w:sz w:val="16"/>
+          <w:szCs w:val="16"/>
+          <w:lang w:eastAsia="pt-BR"/>
+        </w:rPr>
+      </w:pPr>
+      <w:r>
+        <w:rPr>
+          <w:rFonts w:ascii="Calibri" w:eastAsia="Times New Roman" w:hAnsi="Calibri" w:cs="Calibri"/>
+          <w:color w:val="000000"/>
+          <w:sz w:val="16"/>
+          <w:szCs w:val="16"/>
+          <w:lang w:eastAsia="pt-BR"/>
+        </w:rPr>
+        <w:t>{#informacoes_adicionais}</w:t>
+      </w:r>
+    </w:p>
+    <w:p>
+      <w:pPr>
+        <w:pStyle w:val="PargrafodaLista"/>
+        <w:numPr>
+          <w:ilvl w:val="1"/>
+          <w:numId w:val="21"/>
+        </w:numPr>
+        <w:ind w:left="964" w:right="567" w:hanging="284"/>
+        <w:rPr>
+          <w:rFonts w:ascii="Calibri" w:eastAsia="Times New Roman" w:hAnsi="Calibri" w:cs="Calibri"/>
+          <w:color w:val="000000"/>
+          <w:sz w:val="16"/>
+          <w:szCs w:val="16"/>
+          <w:lang w:eastAsia="pt-BR"/>
+        </w:rPr>
+      </w:pPr>
+      <w:r>
+        <w:rPr>
+          <w:rFonts w:ascii="Calibri" w:eastAsia="Times New Roman" w:hAnsi="Calibri" w:cs="Calibri"/>
+          <w:color w:val="000000"/>
+          <w:sz w:val="16"/>
+          <w:szCs w:val="16"/>
+          <w:lang w:eastAsia="pt-BR"/>
+        </w:rPr>
+        <w:t>{item}</w:t>
+      </w:r>
+    </w:p>
+    <w:p>
+      <w:pPr>
+        <w:pStyle w:val="PargrafodaLista"/>
+        <w:numPr>
+          <w:ilvl w:val="1"/>
+          <w:numId w:val="21"/>
+        </w:numPr>
+        <w:ind w:left="964" w:right="567" w:hanging="284"/>
+        <w:rPr>
+          <w:rFonts w:ascii="Calibri" w:eastAsia="Times New Roman" w:hAnsi="Calibri" w:cs="Calibri"/>
+          <w:color w:val="000000"/>
+          <w:sz w:val="16"/>
+          <w:szCs w:val="16"/>
+          <w:lang w:eastAsia="pt-BR"/>
+        </w:rPr>
+      </w:pPr>
+      <w:r>
+        <w:rPr>
+          <w:rFonts w:ascii="Calibri" w:eastAsia="Times New Roman" w:hAnsi="Calibri" w:cs="Calibri"/>
+          <w:color w:val="000000"/>
+          <w:sz w:val="16"/>
+          <w:szCs w:val="16"/>
+          <w:lang w:eastAsia="pt-BR"/>
+        </w:rPr>
+        <w:t>{/informacoes_adicionais}</w:t>
       </w:r>
     </w:p>
     <w:p>
@@ -3359,8 +3796,8 @@
       </w:r>
     </w:p>
     <w:sectPr>
-      <w:headerReference w:type="default" r:id="rId12"/>
-      <w:footerReference w:type="default" r:id="rId13"/>
+      <w:headerReference w:type="default" r:id="rId13"/>
+      <w:footerReference w:type="default" r:id="rId14"/>
       <w:type w:val="continuous"/>
       <w:pgSz w:w="11906" w:h="16838" w:code="9"/>
       <w:pgMar w:top="1701" w:right="244" w:bottom="397" w:left="284" w:header="0" w:footer="964" w:gutter="0"/>
@@ -9635,12 +10072,9 @@
 </file>
 
 <file path=customXml/item1.xml><?xml version="1.0" encoding="utf-8"?>
-<?mso-contentType ?>
-<FormTemplates xmlns="http://schemas.microsoft.com/sharepoint/v3/contenttype/forms">
-  <Display>DocumentLibraryForm</Display>
-  <Edit>DocumentLibraryForm</Edit>
-  <New>DocumentLibraryForm</New>
-</FormTemplates>
+<p:properties xmlns:p="http://schemas.microsoft.com/office/2006/metadata/properties" xmlns:xsi="http://www.w3.org/2001/XMLSchema-instance" xmlns:pc="http://schemas.microsoft.com/office/infopath/2007/PartnerControls">
+  <documentManagement/>
+</p:properties>
 </file>
 
 <file path=customXml/item2.xml><?xml version="1.0" encoding="utf-8"?>
@@ -9808,15 +10242,23 @@
 </file>
 
 <file path=customXml/item3.xml><?xml version="1.0" encoding="utf-8"?>
-<p:properties xmlns:p="http://schemas.microsoft.com/office/2006/metadata/properties" xmlns:xsi="http://www.w3.org/2001/XMLSchema-instance" xmlns:pc="http://schemas.microsoft.com/office/infopath/2007/PartnerControls">
-  <documentManagement/>
-</p:properties>
+<?mso-contentType ?>
+<FormTemplates xmlns="http://schemas.microsoft.com/sharepoint/v3/contenttype/forms">
+  <Display>DocumentLibraryForm</Display>
+  <Edit>DocumentLibraryForm</Edit>
+  <New>DocumentLibraryForm</New>
+</FormTemplates>
+</file>
+
+<file path=customXml/item4.xml><?xml version="1.0" encoding="utf-8"?>
+<b:Sources xmlns:b="http://schemas.openxmlformats.org/officeDocument/2006/bibliography" xmlns="http://schemas.openxmlformats.org/officeDocument/2006/bibliography" SelectedStyle="\APASixthEditionOfficeOnline.xsl" StyleName="APA" Version="6"/>
 </file>
 
 <file path=customXml/itemProps1.xml><?xml version="1.0" encoding="utf-8"?>
-<ds:datastoreItem xmlns:ds="http://schemas.openxmlformats.org/officeDocument/2006/customXml" ds:itemID="{6A6DB6DC-5E25-404D-837F-EED97508210D}">
+<ds:datastoreItem xmlns:ds="http://schemas.openxmlformats.org/officeDocument/2006/customXml" ds:itemID="{56D08023-C9A9-4771-B259-4E5ABEBE4DB5}">
   <ds:schemaRefs>
-    <ds:schemaRef ds:uri="http://schemas.microsoft.com/sharepoint/v3/contenttype/forms"/>
+    <ds:schemaRef ds:uri="http://schemas.microsoft.com/office/2006/metadata/properties"/>
+    <ds:schemaRef ds:uri="http://schemas.microsoft.com/office/infopath/2007/PartnerControls"/>
   </ds:schemaRefs>
 </ds:datastoreItem>
 </file>
@@ -9840,10 +10282,17 @@
 </file>
 
 <file path=customXml/itemProps3.xml><?xml version="1.0" encoding="utf-8"?>
-<ds:datastoreItem xmlns:ds="http://schemas.openxmlformats.org/officeDocument/2006/customXml" ds:itemID="{56D08023-C9A9-4771-B259-4E5ABEBE4DB5}">
+<ds:datastoreItem xmlns:ds="http://schemas.openxmlformats.org/officeDocument/2006/customXml" ds:itemID="{6A6DB6DC-5E25-404D-837F-EED97508210D}">
   <ds:schemaRefs>
-    <ds:schemaRef ds:uri="http://schemas.microsoft.com/office/2006/metadata/properties"/>
-    <ds:schemaRef ds:uri="http://schemas.microsoft.com/office/infopath/2007/PartnerControls"/>
+    <ds:schemaRef ds:uri="http://schemas.microsoft.com/sharepoint/v3/contenttype/forms"/>
+  </ds:schemaRefs>
+</ds:datastoreItem>
+</file>
+
+<file path=customXml/itemProps4.xml><?xml version="1.0" encoding="utf-8"?>
+<ds:datastoreItem xmlns:ds="http://schemas.openxmlformats.org/officeDocument/2006/customXml" ds:itemID="{7F353C01-F2A8-491F-8680-64886334D565}">
+  <ds:schemaRefs>
+    <ds:schemaRef ds:uri="http://schemas.openxmlformats.org/officeDocument/2006/bibliography"/>
   </ds:schemaRefs>
 </ds:datastoreItem>
 </file>
</xml_diff>

<commit_message>
Release 1.0.2: atualizacoes do gerador de propostas (#1)
Atualiza formulario, modelo DOCX, historico e informacoes adicionais.
</commit_message>
<xml_diff>
--- a/src/templates/modelo_proposta.docx
+++ b/src/templates/modelo_proposta.docx
@@ -586,8 +586,6 @@
               <w:ind w:left="-108"/>
               <w:rPr>
                 <w:rFonts w:ascii="Calibri" w:hAnsi="Calibri" w:cs="Calibri"/>
-                <w:b/>
-                <w:bCs/>
                 <w:sz w:val="16"/>
                 <w:szCs w:val="16"/>
               </w:rPr>
@@ -595,8 +593,6 @@
             <w:r>
               <w:rPr>
                 <w:rFonts w:ascii="Calibri" w:hAnsi="Calibri" w:cs="Calibri"/>
-                <w:b/>
-                <w:bCs/>
                 <w:sz w:val="16"/>
                 <w:szCs w:val="16"/>
               </w:rPr>
@@ -1246,7 +1242,59 @@
           <w:szCs w:val="16"/>
           <w:lang w:eastAsia="pt-BR"/>
         </w:rPr>
-        <w:t>{equipe_tecnica}</w:t>
+        <w:t>{#equipe_tecnica_itens}</w:t>
+      </w:r>
+    </w:p>
+    <w:p>
+      <w:pPr>
+        <w:pStyle w:val="PargrafodaLista"/>
+        <w:numPr>
+          <w:ilvl w:val="2"/>
+          <w:numId w:val="1"/>
+        </w:numPr>
+        <w:ind w:left="1191" w:right="737" w:hanging="227"/>
+        <w:jc w:val="both"/>
+        <w:rPr>
+          <w:rFonts w:ascii="Calibri" w:eastAsia="Calibri" w:hAnsi="Calibri" w:cs="Calibri"/>
+          <w:sz w:val="16"/>
+          <w:szCs w:val="16"/>
+          <w:lang w:eastAsia="pt-BR"/>
+        </w:rPr>
+      </w:pPr>
+      <w:r>
+        <w:rPr>
+          <w:rFonts w:ascii="Calibri" w:eastAsia="Calibri" w:hAnsi="Calibri" w:cs="Calibri"/>
+          <w:sz w:val="16"/>
+          <w:szCs w:val="16"/>
+          <w:lang w:eastAsia="pt-BR"/>
+        </w:rPr>
+        <w:t>{item}</w:t>
+      </w:r>
+    </w:p>
+    <w:p>
+      <w:pPr>
+        <w:pStyle w:val="PargrafodaLista"/>
+        <w:numPr>
+          <w:ilvl w:val="2"/>
+          <w:numId w:val="1"/>
+        </w:numPr>
+        <w:ind w:left="1191" w:right="737" w:hanging="227"/>
+        <w:jc w:val="both"/>
+        <w:rPr>
+          <w:rFonts w:ascii="Calibri" w:eastAsia="Calibri" w:hAnsi="Calibri" w:cs="Calibri"/>
+          <w:sz w:val="16"/>
+          <w:szCs w:val="16"/>
+          <w:lang w:eastAsia="pt-BR"/>
+        </w:rPr>
+      </w:pPr>
+      <w:r>
+        <w:rPr>
+          <w:rFonts w:ascii="Calibri" w:eastAsia="Calibri" w:hAnsi="Calibri" w:cs="Calibri"/>
+          <w:sz w:val="16"/>
+          <w:szCs w:val="16"/>
+          <w:lang w:eastAsia="pt-BR"/>
+        </w:rPr>
+        <w:t>{/equipe_tecnica_itens}</w:t>
       </w:r>
     </w:p>
     <w:p>
@@ -1374,7 +1422,7 @@
         <mc:AlternateContent>
           <mc:Choice Requires="wps">
             <w:drawing>
-              <wp:anchor distT="0" distB="0" distL="114300" distR="114300" simplePos="0" relativeHeight="251661824" behindDoc="0" locked="0" layoutInCell="1" allowOverlap="1" wp14:anchorId="20A14F48" wp14:editId="676B3F8A">
+              <wp:anchor distT="0" distB="0" distL="114300" distR="114300" simplePos="0" relativeHeight="251661824" behindDoc="0" locked="0" layoutInCell="1" allowOverlap="1" wp14:anchorId="20A14F48" wp14:editId="38A00D3C">
                 <wp:simplePos x="0" y="0"/>
                 <wp:positionH relativeFrom="column">
                   <wp:posOffset>247650</wp:posOffset>
@@ -1434,7 +1482,7 @@
           </mc:Choice>
           <mc:Fallback>
             <w:pict>
-              <v:line w14:anchorId="0B74771B" id="Conector reto 432194892" o:spid="_x0000_s1026" style="position:absolute;z-index:251661824;visibility:visible;mso-wrap-style:square;mso-width-percent:0;mso-height-percent:0;mso-wrap-distance-left:9pt;mso-wrap-distance-top:0;mso-wrap-distance-right:9pt;mso-wrap-distance-bottom:0;mso-position-horizontal:absolute;mso-position-horizontal-relative:text;mso-position-vertical:absolute;mso-position-vertical-relative:text;mso-width-percent:0;mso-height-percent:0;mso-width-relative:margin;mso-height-relative:margin" from="19.5pt,2.35pt" to="531.75pt,3.1pt" o:gfxdata="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" strokecolor="#002060" strokeweight=".5pt">
+              <v:line w14:anchorId="70C507F5" id="Conector reto 432194892" o:spid="_x0000_s1026" style="position:absolute;z-index:251661824;visibility:visible;mso-wrap-style:square;mso-width-percent:0;mso-height-percent:0;mso-wrap-distance-left:9pt;mso-wrap-distance-top:0;mso-wrap-distance-right:9pt;mso-wrap-distance-bottom:0;mso-position-horizontal:absolute;mso-position-horizontal-relative:text;mso-position-vertical:absolute;mso-position-vertical-relative:text;mso-width-percent:0;mso-height-percent:0;mso-width-relative:margin;mso-height-relative:margin" from="19.5pt,2.35pt" to="531.75pt,3.1pt" o:gfxdata="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" strokecolor="#002060" strokeweight=".5pt">
                 <v:stroke joinstyle="miter"/>
               </v:line>
             </w:pict>
@@ -1442,20 +1490,10 @@
         </mc:AlternateContent>
       </w:r>
     </w:p>
-    <w:p>
-      <w:pPr>
-        <w:spacing w:before="120" w:after="120" w:line="120" w:lineRule="exact"/>
-        <w:rPr>
-          <w:sz w:val="4"/>
-          <w:szCs w:val="4"/>
-        </w:rPr>
-      </w:pPr>
-    </w:p>
     <w:tbl>
       <w:tblPr>
-        <w:tblW w:w="9360" w:type="dxa"/>
-        <w:jc w:val="center"/>
-        <w:tblLayout w:type="fixed"/>
+        <w:tblW w:w="10245" w:type="dxa"/>
+        <w:tblInd w:w="390" w:type="dxa"/>
         <w:tblBorders>
           <w:top w:val="nil"/>
           <w:left w:val="nil"/>
@@ -1464,320 +1502,102 @@
           <w:insideH w:val="nil"/>
           <w:insideV w:val="nil"/>
         </w:tblBorders>
-        <w:tblLook w:val="0000" w:firstRow="0" w:lastRow="0" w:firstColumn="0" w:lastColumn="0" w:noHBand="1" w:noVBand="1"/>
+        <w:tblLayout w:type="fixed"/>
+        <w:tblLook w:val="0600" w:firstRow="0" w:lastRow="0" w:firstColumn="0" w:lastColumn="0" w:noHBand="1" w:noVBand="1"/>
       </w:tblPr>
       <w:tblGrid>
-        <w:gridCol w:w="650"/>
-        <w:gridCol w:w="760"/>
-        <w:gridCol w:w="3040"/>
-        <w:gridCol w:w="900"/>
-        <w:gridCol w:w="720"/>
-        <w:gridCol w:w="650"/>
-        <w:gridCol w:w="1300"/>
-        <w:gridCol w:w="1340"/>
+        <w:gridCol w:w="710"/>
+        <w:gridCol w:w="4540"/>
+        <w:gridCol w:w="945"/>
+        <w:gridCol w:w="710"/>
+        <w:gridCol w:w="590"/>
+        <w:gridCol w:w="1315"/>
+        <w:gridCol w:w="1435"/>
       </w:tblGrid>
       <w:tr>
+        <w:trPr>
+          <w:trHeight w:hRule="exact" w:val="300"/>
+        </w:trPr>
         <w:tc>
           <w:tcPr>
-            <w:tcW w:w="650" w:type="dxa"/>
-            <w:shd w:val="clear" w:color="auto" w:fill="BFBFBF"/>
+            <w:tcW w:w="10245" w:type="dxa"/>
+            <w:gridSpan w:val="7"/>
             <w:tcBorders>
-              <w:top w:val="single" w:sz="6" w:space="0" w:color="404040"/>
-              <w:left w:val="single" w:sz="4" w:space="0" w:color="7F7F7F"/>
-              <w:bottom w:val="single" w:sz="6" w:space="0" w:color="404040"/>
-              <w:right w:val="single" w:sz="4" w:space="0" w:color="7F7F7F"/>
+              <w:top w:val="nil"/>
+              <w:left w:val="nil"/>
+              <w:bottom w:val="nil"/>
+              <w:right w:val="nil"/>
             </w:tcBorders>
+            <w:tcMar>
+              <w:top w:w="0" w:type="dxa"/>
+              <w:left w:w="0" w:type="dxa"/>
+              <w:bottom w:w="0" w:type="dxa"/>
+              <w:right w:w="0" w:type="dxa"/>
+            </w:tcMar>
             <w:vAlign w:val="center"/>
-            <w:tcMar>
-              <w:top w:w="16" w:type="dxa"/>
-              <w:left w:w="70" w:type="dxa"/>
-              <w:bottom w:w="16" w:type="dxa"/>
-              <w:right w:w="70" w:type="dxa"/>
-            </w:tcMar>
           </w:tcPr>
           <w:p>
             <w:pPr>
-              <w:spacing w:after="0" w:line="220" w:lineRule="auto"/>
+              <w:spacing w:line="300" w:lineRule="exact"/>
               <w:jc w:val="center"/>
-              <w:rPr>
-                <w:rFonts w:ascii="Calibri" w:hAnsi="Calibri" w:cs="Calibri"/>
-                <w:sz w:val="16"/>
-                <w:szCs w:val="16"/>
-              </w:rPr>
             </w:pPr>
             <w:r>
               <w:rPr>
-                <w:rFonts w:ascii="Calibri" w:hAnsi="Calibri" w:cs="Calibri"/>
-                <w:sz w:val="16"/>
-                <w:szCs w:val="16"/>
+                <w:noProof/>
               </w:rPr>
-              <w:t>ITEM</w:t>
-            </w:r>
-          </w:p>
-        </w:tc>
-        <w:tc>
-          <w:tcPr>
-            <w:tcW w:w="760" w:type="dxa"/>
-            <w:shd w:val="clear" w:color="auto" w:fill="BFBFBF"/>
-            <w:tcBorders>
-              <w:top w:val="single" w:sz="6" w:space="0" w:color="404040"/>
-              <w:left w:val="single" w:sz="4" w:space="0" w:color="7F7F7F"/>
-              <w:bottom w:val="single" w:sz="6" w:space="0" w:color="404040"/>
-              <w:right w:val="single" w:sz="4" w:space="0" w:color="7F7F7F"/>
-            </w:tcBorders>
-            <w:vAlign w:val="center"/>
-            <w:tcMar>
-              <w:top w:w="16" w:type="dxa"/>
-              <w:left w:w="70" w:type="dxa"/>
-              <w:bottom w:w="16" w:type="dxa"/>
-              <w:right w:w="70" w:type="dxa"/>
-            </w:tcMar>
-          </w:tcPr>
-          <w:p>
-            <w:pPr>
-              <w:spacing w:after="0" w:line="220" w:lineRule="auto"/>
-              <w:jc w:val="center"/>
-              <w:rPr>
-                <w:rFonts w:ascii="Calibri" w:hAnsi="Calibri" w:cs="Calibri"/>
-                <w:sz w:val="16"/>
-                <w:szCs w:val="16"/>
-              </w:rPr>
-            </w:pPr>
-            <w:r>
-              <w:rPr>
-                <w:rFonts w:ascii="Calibri" w:hAnsi="Calibri" w:cs="Calibri"/>
-                <w:sz w:val="16"/>
-                <w:szCs w:val="16"/>
-              </w:rPr>
-              <w:t>CÓDIGO</w:t>
-            </w:r>
-          </w:p>
-        </w:tc>
-        <w:tc>
-          <w:tcPr>
-            <w:tcW w:w="3040" w:type="dxa"/>
-            <w:shd w:val="clear" w:color="auto" w:fill="BFBFBF"/>
-            <w:tcBorders>
-              <w:top w:val="single" w:sz="6" w:space="0" w:color="404040"/>
-              <w:left w:val="single" w:sz="4" w:space="0" w:color="7F7F7F"/>
-              <w:bottom w:val="single" w:sz="6" w:space="0" w:color="404040"/>
-              <w:right w:val="single" w:sz="4" w:space="0" w:color="7F7F7F"/>
-            </w:tcBorders>
-            <w:vAlign w:val="center"/>
-            <w:tcMar>
-              <w:top w:w="16" w:type="dxa"/>
-              <w:left w:w="70" w:type="dxa"/>
-              <w:bottom w:w="16" w:type="dxa"/>
-              <w:right w:w="70" w:type="dxa"/>
-            </w:tcMar>
-          </w:tcPr>
-          <w:p>
-            <w:pPr>
-              <w:spacing w:after="0" w:line="220" w:lineRule="auto"/>
-              <w:jc w:val="center"/>
-              <w:rPr>
-                <w:rFonts w:ascii="Calibri" w:hAnsi="Calibri" w:cs="Calibri"/>
-                <w:sz w:val="16"/>
-                <w:szCs w:val="16"/>
-              </w:rPr>
-            </w:pPr>
-            <w:r>
-              <w:rPr>
-                <w:rFonts w:ascii="Calibri" w:hAnsi="Calibri" w:cs="Calibri"/>
-                <w:sz w:val="16"/>
-                <w:szCs w:val="16"/>
-              </w:rPr>
-              <w:t>DESCRIÇÃO DOS ITENS</w:t>
-            </w:r>
-          </w:p>
-        </w:tc>
-        <w:tc>
-          <w:tcPr>
-            <w:tcW w:w="900" w:type="dxa"/>
-            <w:shd w:val="clear" w:color="auto" w:fill="BFBFBF"/>
-            <w:tcBorders>
-              <w:top w:val="single" w:sz="6" w:space="0" w:color="404040"/>
-              <w:left w:val="single" w:sz="4" w:space="0" w:color="7F7F7F"/>
-              <w:bottom w:val="single" w:sz="6" w:space="0" w:color="404040"/>
-              <w:right w:val="single" w:sz="4" w:space="0" w:color="7F7F7F"/>
-            </w:tcBorders>
-            <w:vAlign w:val="center"/>
-            <w:tcMar>
-              <w:top w:w="16" w:type="dxa"/>
-              <w:left w:w="70" w:type="dxa"/>
-              <w:bottom w:w="16" w:type="dxa"/>
-              <w:right w:w="70" w:type="dxa"/>
-            </w:tcMar>
-          </w:tcPr>
-          <w:p>
-            <w:pPr>
-              <w:spacing w:after="0" w:line="220" w:lineRule="auto"/>
-              <w:jc w:val="center"/>
-              <w:rPr>
-                <w:rFonts w:ascii="Calibri" w:hAnsi="Calibri" w:cs="Calibri"/>
-                <w:sz w:val="16"/>
-                <w:szCs w:val="16"/>
-              </w:rPr>
-            </w:pPr>
-            <w:r>
-              <w:rPr>
-                <w:rFonts w:ascii="Calibri" w:hAnsi="Calibri" w:cs="Calibri"/>
-                <w:sz w:val="16"/>
-                <w:szCs w:val="16"/>
-              </w:rPr>
-              <w:t>NCM</w:t>
-            </w:r>
-          </w:p>
-        </w:tc>
-        <w:tc>
-          <w:tcPr>
-            <w:tcW w:w="720" w:type="dxa"/>
-            <w:shd w:val="clear" w:color="auto" w:fill="BFBFBF"/>
-            <w:tcBorders>
-              <w:top w:val="single" w:sz="6" w:space="0" w:color="404040"/>
-              <w:left w:val="single" w:sz="4" w:space="0" w:color="7F7F7F"/>
-              <w:bottom w:val="single" w:sz="6" w:space="0" w:color="404040"/>
-              <w:right w:val="single" w:sz="4" w:space="0" w:color="7F7F7F"/>
-            </w:tcBorders>
-            <w:vAlign w:val="center"/>
-            <w:tcMar>
-              <w:top w:w="16" w:type="dxa"/>
-              <w:left w:w="70" w:type="dxa"/>
-              <w:bottom w:w="16" w:type="dxa"/>
-              <w:right w:w="70" w:type="dxa"/>
-            </w:tcMar>
-          </w:tcPr>
-          <w:p>
-            <w:pPr>
-              <w:spacing w:after="0" w:line="220" w:lineRule="auto"/>
-              <w:jc w:val="center"/>
-              <w:rPr>
-                <w:rFonts w:ascii="Calibri" w:hAnsi="Calibri" w:cs="Calibri"/>
-                <w:sz w:val="16"/>
-                <w:szCs w:val="16"/>
-              </w:rPr>
-            </w:pPr>
-            <w:r>
-              <w:rPr>
-                <w:rFonts w:ascii="Calibri" w:hAnsi="Calibri" w:cs="Calibri"/>
-                <w:sz w:val="16"/>
-                <w:szCs w:val="16"/>
-              </w:rPr>
-              <w:t>QTD</w:t>
-            </w:r>
-          </w:p>
-        </w:tc>
-        <w:tc>
-          <w:tcPr>
-            <w:tcW w:w="650" w:type="dxa"/>
-            <w:shd w:val="clear" w:color="auto" w:fill="BFBFBF"/>
-            <w:tcBorders>
-              <w:top w:val="single" w:sz="6" w:space="0" w:color="404040"/>
-              <w:left w:val="single" w:sz="4" w:space="0" w:color="7F7F7F"/>
-              <w:bottom w:val="single" w:sz="6" w:space="0" w:color="404040"/>
-              <w:right w:val="single" w:sz="4" w:space="0" w:color="7F7F7F"/>
-            </w:tcBorders>
-            <w:vAlign w:val="center"/>
-            <w:tcMar>
-              <w:top w:w="16" w:type="dxa"/>
-              <w:left w:w="70" w:type="dxa"/>
-              <w:bottom w:w="16" w:type="dxa"/>
-              <w:right w:w="70" w:type="dxa"/>
-            </w:tcMar>
-          </w:tcPr>
-          <w:p>
-            <w:pPr>
-              <w:spacing w:after="0" w:line="220" w:lineRule="auto"/>
-              <w:jc w:val="center"/>
-              <w:rPr>
-                <w:rFonts w:ascii="Calibri" w:hAnsi="Calibri" w:cs="Calibri"/>
-                <w:sz w:val="16"/>
-                <w:szCs w:val="16"/>
-              </w:rPr>
-            </w:pPr>
-            <w:r>
-              <w:rPr>
-                <w:rFonts w:ascii="Calibri" w:hAnsi="Calibri" w:cs="Calibri"/>
-                <w:sz w:val="16"/>
-                <w:szCs w:val="16"/>
-              </w:rPr>
-              <w:t>UNID.</w:t>
-            </w:r>
-          </w:p>
-        </w:tc>
-        <w:tc>
-          <w:tcPr>
-            <w:tcW w:w="1300" w:type="dxa"/>
-            <w:shd w:val="clear" w:color="auto" w:fill="BFBFBF"/>
-            <w:tcBorders>
-              <w:top w:val="single" w:sz="6" w:space="0" w:color="404040"/>
-              <w:left w:val="single" w:sz="4" w:space="0" w:color="7F7F7F"/>
-              <w:bottom w:val="single" w:sz="6" w:space="0" w:color="404040"/>
-              <w:right w:val="single" w:sz="4" w:space="0" w:color="7F7F7F"/>
-            </w:tcBorders>
-            <w:vAlign w:val="center"/>
-            <w:tcMar>
-              <w:top w:w="16" w:type="dxa"/>
-              <w:left w:w="70" w:type="dxa"/>
-              <w:bottom w:w="16" w:type="dxa"/>
-              <w:right w:w="70" w:type="dxa"/>
-            </w:tcMar>
-          </w:tcPr>
-          <w:p>
-            <w:pPr>
-              <w:spacing w:after="0" w:line="220" w:lineRule="auto"/>
-              <w:jc w:val="center"/>
-              <w:rPr>
-                <w:rFonts w:ascii="Calibri" w:hAnsi="Calibri" w:cs="Calibri"/>
-                <w:sz w:val="16"/>
-                <w:szCs w:val="16"/>
-              </w:rPr>
-            </w:pPr>
-            <w:r>
-              <w:rPr>
-                <w:rFonts w:ascii="Calibri" w:hAnsi="Calibri" w:cs="Calibri"/>
-                <w:sz w:val="16"/>
-                <w:szCs w:val="16"/>
-              </w:rPr>
-              <w:t>VALOR UNITÁRIO</w:t>
-            </w:r>
-          </w:p>
-        </w:tc>
-        <w:tc>
-          <w:tcPr>
-            <w:tcW w:w="1340" w:type="dxa"/>
-            <w:shd w:val="clear" w:color="auto" w:fill="BFBFBF"/>
-            <w:tcBorders>
-              <w:top w:val="single" w:sz="6" w:space="0" w:color="404040"/>
-              <w:left w:val="single" w:sz="4" w:space="0" w:color="7F7F7F"/>
-              <w:bottom w:val="single" w:sz="6" w:space="0" w:color="404040"/>
-              <w:right w:val="single" w:sz="4" w:space="0" w:color="7F7F7F"/>
-            </w:tcBorders>
-            <w:vAlign w:val="center"/>
-            <w:tcMar>
-              <w:top w:w="16" w:type="dxa"/>
-              <w:left w:w="70" w:type="dxa"/>
-              <w:bottom w:w="16" w:type="dxa"/>
-              <w:right w:w="70" w:type="dxa"/>
-            </w:tcMar>
-          </w:tcPr>
-          <w:p>
-            <w:pPr>
-              <w:spacing w:after="0" w:line="220" w:lineRule="auto"/>
-              <w:jc w:val="center"/>
-              <w:rPr>
-                <w:rFonts w:ascii="Calibri" w:hAnsi="Calibri" w:cs="Calibri"/>
-                <w:sz w:val="16"/>
-                <w:szCs w:val="16"/>
-              </w:rPr>
-            </w:pPr>
-            <w:r>
-              <w:rPr>
-                <w:rFonts w:ascii="Calibri" w:hAnsi="Calibri" w:cs="Calibri"/>
-                <w:sz w:val="16"/>
-                <w:szCs w:val="16"/>
-              </w:rPr>
-              <w:t>VALOR TOTAL</w:t>
+              <w:drawing>
+                <wp:anchor distT="0" distB="0" distL="114300" distR="114300" simplePos="0" relativeHeight="251664896" behindDoc="1" locked="0" layoutInCell="1" allowOverlap="1" wp14:anchorId="3F807A14" wp14:editId="4DAEFC15">
+                  <wp:simplePos x="0" y="0"/>
+                  <wp:positionH relativeFrom="column">
+                    <wp:posOffset>-2540</wp:posOffset>
+                  </wp:positionH>
+                  <wp:positionV relativeFrom="paragraph">
+                    <wp:posOffset>-191770</wp:posOffset>
+                  </wp:positionV>
+                  <wp:extent cx="6489700" cy="183515"/>
+                  <wp:effectExtent l="0" t="0" r="6350" b="6985"/>
+                  <wp:wrapTopAndBottom/>
+                  <wp:docPr id="9001" name="Cabeçalho de preços"/>
+                  <wp:cNvGraphicFramePr/>
+                  <a:graphic xmlns:a="http://schemas.openxmlformats.org/drawingml/2006/main">
+                    <a:graphicData uri="http://schemas.openxmlformats.org/drawingml/2006/picture">
+                      <pic:pic xmlns:pic="http://schemas.openxmlformats.org/drawingml/2006/picture">
+                        <pic:nvPicPr>
+                          <pic:cNvPr id="9001" name="cabecalho-preco.svg"/>
+                          <pic:cNvPicPr/>
+                        </pic:nvPicPr>
+                        <pic:blipFill>
+                          <a:blip r:embed="rId11">
+                            <a:extLst>
+                              <a:ext uri="{96DAC541-7B7A-43D3-8B79-37D633B846F1}">
+                                <asvg:svgBlip xmlns:asvg="http://schemas.microsoft.com/office/drawing/2016/SVG/main" r:embed="rId12"/>
+                              </a:ext>
+                            </a:extLst>
+                          </a:blip>
+                          <a:stretch>
+                            <a:fillRect/>
+                          </a:stretch>
+                        </pic:blipFill>
+                        <pic:spPr>
+                          <a:xfrm>
+                            <a:off x="0" y="0"/>
+                            <a:ext cx="6489700" cy="183515"/>
+                          </a:xfrm>
+                          <a:prstGeom prst="rect">
+                            <a:avLst/>
+                          </a:prstGeom>
+                        </pic:spPr>
+                      </pic:pic>
+                    </a:graphicData>
+                  </a:graphic>
+                  <wp14:sizeRelH relativeFrom="margin">
+                    <wp14:pctWidth>0</wp14:pctWidth>
+                  </wp14:sizeRelH>
+                  <wp14:sizeRelV relativeFrom="margin">
+                    <wp14:pctHeight>0</wp14:pctHeight>
+                  </wp14:sizeRelV>
+                </wp:anchor>
+              </w:drawing>
             </w:r>
           </w:p>
         </w:tc>
@@ -1785,25 +1605,24 @@
       <w:tr>
         <w:tc>
           <w:tcPr>
-            <w:tcW w:w="9360" w:type="dxa"/>
-            <w:gridSpan w:val="8"/>
+            <w:tcW w:w="10245" w:type="dxa"/>
+            <w:gridSpan w:val="7"/>
             <w:tcBorders>
               <w:top w:val="nil"/>
               <w:left w:val="nil"/>
               <w:bottom w:val="nil"/>
               <w:right w:val="nil"/>
             </w:tcBorders>
-            <w:vAlign w:val="center"/>
             <w:tcMar>
               <w:top w:w="35" w:type="dxa"/>
               <w:left w:w="70" w:type="dxa"/>
               <w:bottom w:w="35" w:type="dxa"/>
               <w:right w:w="70" w:type="dxa"/>
             </w:tcMar>
+            <w:vAlign w:val="center"/>
           </w:tcPr>
           <w:p>
             <w:pPr>
-              <w:spacing w:after="0" w:line="240" w:lineRule="auto"/>
               <w:rPr>
                 <w:rFonts w:ascii="Calibri" w:hAnsi="Calibri" w:cs="Calibri"/>
                 <w:b/>
@@ -1826,28 +1645,26 @@
       <w:tr>
         <w:tc>
           <w:tcPr>
-            <w:tcW w:w="650" w:type="dxa"/>
+            <w:tcW w:w="710" w:type="dxa"/>
             <w:tcBorders>
               <w:top w:val="nil"/>
               <w:left w:val="nil"/>
               <w:bottom w:val="single" w:sz="4" w:space="0" w:color="BFBFBF"/>
               <w:right w:val="nil"/>
             </w:tcBorders>
-            <w:vAlign w:val="center"/>
             <w:tcMar>
               <w:top w:w="35" w:type="dxa"/>
               <w:left w:w="70" w:type="dxa"/>
               <w:bottom w:w="35" w:type="dxa"/>
               <w:right w:w="70" w:type="dxa"/>
             </w:tcMar>
+            <w:vAlign w:val="center"/>
           </w:tcPr>
           <w:p>
             <w:pPr>
-              <w:spacing w:after="0" w:line="240" w:lineRule="auto"/>
-              <w:jc w:val="center"/>
               <w:rPr>
                 <w:rFonts w:ascii="Calibri" w:hAnsi="Calibri" w:cs="Calibri"/>
-                <w:b/>
+                <w:bCs/>
                 <w:sz w:val="16"/>
                 <w:szCs w:val="16"/>
               </w:rPr>
@@ -1855,7 +1672,7 @@
             <w:r>
               <w:rPr>
                 <w:rFonts w:ascii="Calibri" w:hAnsi="Calibri" w:cs="Calibri"/>
-                <w:b/>
+                <w:bCs/>
                 <w:sz w:val="16"/>
                 <w:szCs w:val="16"/>
               </w:rPr>
@@ -1865,28 +1682,26 @@
         </w:tc>
         <w:tc>
           <w:tcPr>
-            <w:tcW w:w="760" w:type="dxa"/>
+            <w:tcW w:w="4540" w:type="dxa"/>
             <w:tcBorders>
               <w:top w:val="nil"/>
               <w:left w:val="nil"/>
               <w:bottom w:val="single" w:sz="4" w:space="0" w:color="BFBFBF"/>
               <w:right w:val="nil"/>
             </w:tcBorders>
-            <w:vAlign w:val="center"/>
             <w:tcMar>
               <w:top w:w="35" w:type="dxa"/>
               <w:left w:w="70" w:type="dxa"/>
               <w:bottom w:w="35" w:type="dxa"/>
               <w:right w:w="70" w:type="dxa"/>
             </w:tcMar>
+            <w:vAlign w:val="center"/>
           </w:tcPr>
           <w:p>
             <w:pPr>
-              <w:spacing w:after="0" w:line="240" w:lineRule="auto"/>
-              <w:jc w:val="center"/>
               <w:rPr>
                 <w:rFonts w:ascii="Calibri" w:hAnsi="Calibri" w:cs="Calibri"/>
-                <w:b/>
+                <w:bCs/>
                 <w:sz w:val="16"/>
                 <w:szCs w:val="16"/>
               </w:rPr>
@@ -1894,38 +1709,37 @@
             <w:r>
               <w:rPr>
                 <w:rFonts w:ascii="Calibri" w:hAnsi="Calibri" w:cs="Calibri"/>
-                <w:b/>
+                <w:bCs/>
                 <w:sz w:val="16"/>
                 <w:szCs w:val="16"/>
               </w:rPr>
-              <w:t>{codigo}</w:t>
+              <w:t>{codigo} {descricao}</w:t>
             </w:r>
           </w:p>
         </w:tc>
         <w:tc>
           <w:tcPr>
-            <w:tcW w:w="3040" w:type="dxa"/>
+            <w:tcW w:w="945" w:type="dxa"/>
             <w:tcBorders>
               <w:top w:val="nil"/>
               <w:left w:val="nil"/>
               <w:bottom w:val="single" w:sz="4" w:space="0" w:color="BFBFBF"/>
               <w:right w:val="nil"/>
             </w:tcBorders>
-            <w:vAlign w:val="center"/>
             <w:tcMar>
               <w:top w:w="35" w:type="dxa"/>
               <w:left w:w="70" w:type="dxa"/>
               <w:bottom w:w="35" w:type="dxa"/>
               <w:right w:w="70" w:type="dxa"/>
             </w:tcMar>
+            <w:vAlign w:val="center"/>
           </w:tcPr>
           <w:p>
             <w:pPr>
-              <w:spacing w:after="0" w:line="240" w:lineRule="auto"/>
               <w:jc w:val="center"/>
               <w:rPr>
                 <w:rFonts w:ascii="Calibri" w:hAnsi="Calibri" w:cs="Calibri"/>
-                <w:b/>
+                <w:bCs/>
                 <w:sz w:val="16"/>
                 <w:szCs w:val="16"/>
               </w:rPr>
@@ -1933,46 +1747,7 @@
             <w:r>
               <w:rPr>
                 <w:rFonts w:ascii="Calibri" w:hAnsi="Calibri" w:cs="Calibri"/>
-                <w:b/>
-                <w:sz w:val="16"/>
-                <w:szCs w:val="16"/>
-              </w:rPr>
-              <w:t>{descricao}</w:t>
-            </w:r>
-          </w:p>
-        </w:tc>
-        <w:tc>
-          <w:tcPr>
-            <w:tcW w:w="900" w:type="dxa"/>
-            <w:tcBorders>
-              <w:top w:val="nil"/>
-              <w:left w:val="nil"/>
-              <w:bottom w:val="single" w:sz="4" w:space="0" w:color="BFBFBF"/>
-              <w:right w:val="nil"/>
-            </w:tcBorders>
-            <w:vAlign w:val="center"/>
-            <w:tcMar>
-              <w:top w:w="35" w:type="dxa"/>
-              <w:left w:w="70" w:type="dxa"/>
-              <w:bottom w:w="35" w:type="dxa"/>
-              <w:right w:w="70" w:type="dxa"/>
-            </w:tcMar>
-          </w:tcPr>
-          <w:p>
-            <w:pPr>
-              <w:spacing w:after="0" w:line="240" w:lineRule="auto"/>
-              <w:jc w:val="center"/>
-              <w:rPr>
-                <w:rFonts w:ascii="Calibri" w:hAnsi="Calibri" w:cs="Calibri"/>
-                <w:b/>
-                <w:sz w:val="16"/>
-                <w:szCs w:val="16"/>
-              </w:rPr>
-            </w:pPr>
-            <w:r>
-              <w:rPr>
-                <w:rFonts w:ascii="Calibri" w:hAnsi="Calibri" w:cs="Calibri"/>
-                <w:b/>
+                <w:bCs/>
                 <w:sz w:val="16"/>
                 <w:szCs w:val="16"/>
               </w:rPr>
@@ -1982,28 +1757,27 @@
         </w:tc>
         <w:tc>
           <w:tcPr>
-            <w:tcW w:w="720" w:type="dxa"/>
+            <w:tcW w:w="710" w:type="dxa"/>
             <w:tcBorders>
               <w:top w:val="nil"/>
               <w:left w:val="nil"/>
               <w:bottom w:val="single" w:sz="4" w:space="0" w:color="BFBFBF"/>
               <w:right w:val="nil"/>
             </w:tcBorders>
-            <w:vAlign w:val="center"/>
             <w:tcMar>
               <w:top w:w="35" w:type="dxa"/>
               <w:left w:w="70" w:type="dxa"/>
               <w:bottom w:w="35" w:type="dxa"/>
               <w:right w:w="70" w:type="dxa"/>
             </w:tcMar>
+            <w:vAlign w:val="center"/>
           </w:tcPr>
           <w:p>
             <w:pPr>
-              <w:spacing w:after="0" w:line="240" w:lineRule="auto"/>
               <w:jc w:val="center"/>
               <w:rPr>
                 <w:rFonts w:ascii="Calibri" w:hAnsi="Calibri" w:cs="Calibri"/>
-                <w:b/>
+                <w:bCs/>
                 <w:sz w:val="16"/>
                 <w:szCs w:val="16"/>
               </w:rPr>
@@ -2011,7 +1785,7 @@
             <w:r>
               <w:rPr>
                 <w:rFonts w:ascii="Calibri" w:hAnsi="Calibri" w:cs="Calibri"/>
-                <w:b/>
+                <w:bCs/>
                 <w:sz w:val="16"/>
                 <w:szCs w:val="16"/>
               </w:rPr>
@@ -2021,28 +1795,27 @@
         </w:tc>
         <w:tc>
           <w:tcPr>
-            <w:tcW w:w="650" w:type="dxa"/>
+            <w:tcW w:w="590" w:type="dxa"/>
             <w:tcBorders>
               <w:top w:val="nil"/>
               <w:left w:val="nil"/>
               <w:bottom w:val="single" w:sz="4" w:space="0" w:color="BFBFBF"/>
               <w:right w:val="nil"/>
             </w:tcBorders>
-            <w:vAlign w:val="center"/>
             <w:tcMar>
               <w:top w:w="35" w:type="dxa"/>
               <w:left w:w="70" w:type="dxa"/>
               <w:bottom w:w="35" w:type="dxa"/>
               <w:right w:w="70" w:type="dxa"/>
             </w:tcMar>
+            <w:vAlign w:val="center"/>
           </w:tcPr>
           <w:p>
             <w:pPr>
-              <w:spacing w:after="0" w:line="240" w:lineRule="auto"/>
               <w:jc w:val="center"/>
               <w:rPr>
                 <w:rFonts w:ascii="Calibri" w:hAnsi="Calibri" w:cs="Calibri"/>
-                <w:b/>
+                <w:bCs/>
                 <w:sz w:val="16"/>
                 <w:szCs w:val="16"/>
               </w:rPr>
@@ -2050,7 +1823,7 @@
             <w:r>
               <w:rPr>
                 <w:rFonts w:ascii="Calibri" w:hAnsi="Calibri" w:cs="Calibri"/>
-                <w:b/>
+                <w:bCs/>
                 <w:sz w:val="16"/>
                 <w:szCs w:val="16"/>
               </w:rPr>
@@ -2060,28 +1833,27 @@
         </w:tc>
         <w:tc>
           <w:tcPr>
-            <w:tcW w:w="1300" w:type="dxa"/>
+            <w:tcW w:w="1315" w:type="dxa"/>
             <w:tcBorders>
               <w:top w:val="nil"/>
               <w:left w:val="nil"/>
               <w:bottom w:val="single" w:sz="4" w:space="0" w:color="BFBFBF"/>
               <w:right w:val="nil"/>
             </w:tcBorders>
-            <w:vAlign w:val="center"/>
             <w:tcMar>
               <w:top w:w="35" w:type="dxa"/>
               <w:left w:w="70" w:type="dxa"/>
               <w:bottom w:w="35" w:type="dxa"/>
               <w:right w:w="70" w:type="dxa"/>
             </w:tcMar>
+            <w:vAlign w:val="center"/>
           </w:tcPr>
           <w:p>
             <w:pPr>
-              <w:spacing w:after="0" w:line="240" w:lineRule="auto"/>
-              <w:jc w:val="center"/>
+              <w:jc w:val="right"/>
               <w:rPr>
                 <w:rFonts w:ascii="Calibri" w:hAnsi="Calibri" w:cs="Calibri"/>
-                <w:b/>
+                <w:bCs/>
                 <w:sz w:val="16"/>
                 <w:szCs w:val="16"/>
               </w:rPr>
@@ -2089,7 +1861,16 @@
             <w:r>
               <w:rPr>
                 <w:rFonts w:ascii="Calibri" w:hAnsi="Calibri" w:cs="Calibri"/>
-                <w:b/>
+                <w:bCs/>
+                <w:sz w:val="16"/>
+                <w:szCs w:val="16"/>
+              </w:rPr>
+              <w:t>R$</w:t>
+            </w:r>
+            <w:r>
+              <w:rPr>
+                <w:rFonts w:ascii="Calibri" w:hAnsi="Calibri" w:cs="Calibri"/>
+                <w:bCs/>
                 <w:sz w:val="16"/>
                 <w:szCs w:val="16"/>
               </w:rPr>
@@ -2099,28 +1880,27 @@
         </w:tc>
         <w:tc>
           <w:tcPr>
-            <w:tcW w:w="1340" w:type="dxa"/>
+            <w:tcW w:w="1435" w:type="dxa"/>
             <w:tcBorders>
               <w:top w:val="nil"/>
               <w:left w:val="nil"/>
               <w:bottom w:val="single" w:sz="4" w:space="0" w:color="BFBFBF"/>
               <w:right w:val="nil"/>
             </w:tcBorders>
-            <w:vAlign w:val="center"/>
             <w:tcMar>
               <w:top w:w="35" w:type="dxa"/>
               <w:left w:w="70" w:type="dxa"/>
               <w:bottom w:w="35" w:type="dxa"/>
               <w:right w:w="70" w:type="dxa"/>
             </w:tcMar>
+            <w:vAlign w:val="center"/>
           </w:tcPr>
           <w:p>
             <w:pPr>
-              <w:spacing w:after="0" w:line="240" w:lineRule="auto"/>
-              <w:jc w:val="center"/>
+              <w:jc w:val="right"/>
               <w:rPr>
                 <w:rFonts w:ascii="Calibri" w:hAnsi="Calibri" w:cs="Calibri"/>
-                <w:b/>
+                <w:bCs/>
                 <w:sz w:val="16"/>
                 <w:szCs w:val="16"/>
               </w:rPr>
@@ -2128,7 +1908,16 @@
             <w:r>
               <w:rPr>
                 <w:rFonts w:ascii="Calibri" w:hAnsi="Calibri" w:cs="Calibri"/>
-                <w:b/>
+                <w:bCs/>
+                <w:sz w:val="16"/>
+                <w:szCs w:val="16"/>
+              </w:rPr>
+              <w:t>R$</w:t>
+            </w:r>
+            <w:r>
+              <w:rPr>
+                <w:rFonts w:ascii="Calibri" w:hAnsi="Calibri" w:cs="Calibri"/>
+                <w:bCs/>
                 <w:sz w:val="16"/>
                 <w:szCs w:val="16"/>
               </w:rPr>
@@ -2140,66 +1929,29 @@
       <w:tr>
         <w:tc>
           <w:tcPr>
-            <w:tcW w:w="8020" w:type="dxa"/>
-            <w:gridSpan w:val="7"/>
+            <w:tcW w:w="8810" w:type="dxa"/>
+            <w:gridSpan w:val="6"/>
             <w:tcBorders>
               <w:top w:val="single" w:sz="4" w:space="0" w:color="BFBFBF"/>
               <w:left w:val="nil"/>
               <w:bottom w:val="nil"/>
               <w:right w:val="nil"/>
             </w:tcBorders>
-            <w:vAlign w:val="center"/>
             <w:tcMar>
               <w:top w:w="35" w:type="dxa"/>
               <w:left w:w="70" w:type="dxa"/>
               <w:bottom w:w="35" w:type="dxa"/>
               <w:right w:w="70" w:type="dxa"/>
             </w:tcMar>
+            <w:vAlign w:val="center"/>
           </w:tcPr>
           <w:p>
             <w:pPr>
-              <w:spacing w:after="0" w:line="240" w:lineRule="auto"/>
-              <w:jc w:val="right"/>
-              <w:rPr>
-                <w:rFonts w:ascii="Calibri" w:hAnsi="Calibri" w:cs="Calibri"/>
-                <w:sz w:val="16"/>
-                <w:szCs w:val="16"/>
-              </w:rPr>
-            </w:pPr>
-            <w:r>
-              <w:rPr>
-                <w:rFonts w:ascii="Calibri" w:hAnsi="Calibri" w:cs="Calibri"/>
-                <w:sz w:val="16"/>
-                <w:szCs w:val="16"/>
-              </w:rPr>
-              <w:t>TOTAL {titulo} :</w:t>
-            </w:r>
-          </w:p>
-        </w:tc>
-        <w:tc>
-          <w:tcPr>
-            <w:tcW w:w="1340" w:type="dxa"/>
-            <w:tcBorders>
-              <w:top w:val="single" w:sz="4" w:space="0" w:color="BFBFBF"/>
-              <w:left w:val="nil"/>
-              <w:bottom w:val="nil"/>
-              <w:right w:val="nil"/>
-            </w:tcBorders>
-            <w:vAlign w:val="center"/>
-            <w:tcMar>
-              <w:top w:w="35" w:type="dxa"/>
-              <w:left w:w="70" w:type="dxa"/>
-              <w:bottom w:w="35" w:type="dxa"/>
-              <w:right w:w="70" w:type="dxa"/>
-            </w:tcMar>
-          </w:tcPr>
-          <w:p>
-            <w:pPr>
-              <w:spacing w:after="0" w:line="240" w:lineRule="auto"/>
               <w:jc w:val="right"/>
               <w:rPr>
                 <w:rFonts w:ascii="Calibri" w:hAnsi="Calibri" w:cs="Calibri"/>
                 <w:b/>
+                <w:bCs/>
                 <w:sz w:val="16"/>
                 <w:szCs w:val="16"/>
               </w:rPr>
@@ -2208,6 +1960,57 @@
               <w:rPr>
                 <w:rFonts w:ascii="Calibri" w:hAnsi="Calibri" w:cs="Calibri"/>
                 <w:b/>
+                <w:bCs/>
+                <w:sz w:val="16"/>
+                <w:szCs w:val="16"/>
+              </w:rPr>
+              <w:t>TOTAL {titulo}:</w:t>
+            </w:r>
+          </w:p>
+        </w:tc>
+        <w:tc>
+          <w:tcPr>
+            <w:tcW w:w="1435" w:type="dxa"/>
+            <w:tcBorders>
+              <w:top w:val="single" w:sz="4" w:space="0" w:color="BFBFBF"/>
+              <w:left w:val="nil"/>
+              <w:bottom w:val="nil"/>
+              <w:right w:val="nil"/>
+            </w:tcBorders>
+            <w:tcMar>
+              <w:top w:w="35" w:type="dxa"/>
+              <w:left w:w="70" w:type="dxa"/>
+              <w:bottom w:w="35" w:type="dxa"/>
+              <w:right w:w="70" w:type="dxa"/>
+            </w:tcMar>
+            <w:vAlign w:val="center"/>
+          </w:tcPr>
+          <w:p>
+            <w:pPr>
+              <w:jc w:val="right"/>
+              <w:rPr>
+                <w:rFonts w:ascii="Calibri" w:hAnsi="Calibri" w:cs="Calibri"/>
+                <w:b/>
+                <w:bCs/>
+                <w:sz w:val="16"/>
+                <w:szCs w:val="16"/>
+              </w:rPr>
+            </w:pPr>
+            <w:r>
+              <w:rPr>
+                <w:rFonts w:ascii="Calibri" w:hAnsi="Calibri" w:cs="Calibri"/>
+                <w:b/>
+                <w:bCs/>
+                <w:sz w:val="16"/>
+                <w:szCs w:val="16"/>
+              </w:rPr>
+              <w:t>R$</w:t>
+            </w:r>
+            <w:r>
+              <w:rPr>
+                <w:rFonts w:ascii="Calibri" w:hAnsi="Calibri" w:cs="Calibri"/>
+                <w:b/>
+                <w:bCs/>
                 <w:sz w:val="16"/>
                 <w:szCs w:val="16"/>
               </w:rPr>
@@ -2220,7 +2023,10 @@
     <w:p>
       <w:pPr>
         <w:spacing w:before="150" w:after="150" w:line="120" w:lineRule="exact"/>
-        <w:rPr>
+        <w:jc w:val="right"/>
+        <w:rPr>
+          <w:b/>
+          <w:bCs/>
           <w:sz w:val="4"/>
           <w:szCs w:val="4"/>
         </w:rPr>
@@ -2228,9 +2034,8 @@
     </w:p>
     <w:tbl>
       <w:tblPr>
-        <w:tblW w:w="9360" w:type="dxa"/>
-        <w:jc w:val="center"/>
-        <w:tblLayout w:type="fixed"/>
+        <w:tblW w:w="10245" w:type="dxa"/>
+        <w:tblInd w:w="390" w:type="dxa"/>
         <w:tblBorders>
           <w:top w:val="nil"/>
           <w:left w:val="nil"/>
@@ -2239,142 +2044,171 @@
           <w:insideH w:val="nil"/>
           <w:insideV w:val="nil"/>
         </w:tblBorders>
-        <w:tblLook w:val="0000" w:firstRow="0" w:lastRow="0" w:firstColumn="0" w:lastColumn="0" w:noHBand="1" w:noVBand="1"/>
+        <w:tblLayout w:type="fixed"/>
+        <w:tblLook w:val="0600" w:firstRow="0" w:lastRow="0" w:firstColumn="0" w:lastColumn="0" w:noHBand="1" w:noVBand="1"/>
       </w:tblPr>
       <w:tblGrid>
-        <w:gridCol w:w="650"/>
-        <w:gridCol w:w="760"/>
-        <w:gridCol w:w="3040"/>
-        <w:gridCol w:w="900"/>
-        <w:gridCol w:w="720"/>
-        <w:gridCol w:w="650"/>
-        <w:gridCol w:w="1300"/>
-        <w:gridCol w:w="1340"/>
+        <w:gridCol w:w="5123"/>
+        <w:gridCol w:w="5122"/>
       </w:tblGrid>
+      <w:tr>
+        <w:trPr>
+          <w:trHeight w:hRule="exact" w:val="340"/>
+        </w:trPr>
+        <w:tc>
+          <w:tcPr>
+            <w:tcW w:w="10245" w:type="dxa"/>
+            <w:gridSpan w:val="2"/>
+            <w:tcBorders>
+              <w:top w:val="nil"/>
+              <w:left w:val="nil"/>
+              <w:bottom w:val="nil"/>
+              <w:right w:val="nil"/>
+            </w:tcBorders>
+            <w:tcMar>
+              <w:top w:w="0" w:type="dxa"/>
+              <w:left w:w="0" w:type="dxa"/>
+              <w:bottom w:w="0" w:type="dxa"/>
+              <w:right w:w="0" w:type="dxa"/>
+            </w:tcMar>
+            <w:vAlign w:val="center"/>
+          </w:tcPr>
+          <w:p>
+            <w:pPr>
+              <w:spacing w:line="340" w:lineRule="exact"/>
+              <w:jc w:val="center"/>
+            </w:pPr>
+            <w:r>
+              <w:pict w14:anchorId="110E67F5">
+                <v:roundrect id="ResumoPrecoArredondado" o:spid="_x0000_s2050" style="width:512.25pt;height:15.1pt;mso-left-percent:-10001;mso-top-percent:-10001;mso-position-horizontal:absolute;mso-position-horizontal-relative:char;mso-position-vertical:absolute;mso-position-vertical-relative:line;mso-left-percent:-10001;mso-top-percent:-10001" arcsize="7864f" fillcolor="#bfbfbf" strokecolor="#404040">
+                  <v:textbox inset="0,0,0,0">
+                    <w:txbxContent>
+                      <w:tbl>
+                        <w:tblPr>
+                          <w:tblW w:w="10245" w:type="dxa"/>
+                          <w:tblBorders>
+                            <w:top w:val="nil"/>
+                            <w:left w:val="nil"/>
+                            <w:bottom w:val="nil"/>
+                            <w:right w:val="nil"/>
+                            <w:insideH w:val="nil"/>
+                            <w:insideV w:val="nil"/>
+                          </w:tblBorders>
+                          <w:tblLayout w:type="fixed"/>
+                          <w:tblLook w:val="0600" w:firstRow="0" w:lastRow="0" w:firstColumn="0" w:lastColumn="0" w:noHBand="1" w:noVBand="1"/>
+                        </w:tblPr>
+                        <w:tblGrid>
+                          <w:gridCol w:w="2760"/>
+                          <w:gridCol w:w="7485"/>
+                        </w:tblGrid>
+                        <w:tr>
+                          <w:tc>
+                            <w:tcPr>
+                              <w:tcW w:w="2760" w:type="dxa"/>
+                              <w:tcBorders>
+                                <w:top w:val="nil"/>
+                                <w:left w:val="nil"/>
+                                <w:bottom w:val="nil"/>
+                                <w:right w:val="single" w:sz="6" w:space="0" w:color="404040"/>
+                              </w:tcBorders>
+                              <w:tcMar>
+                                <w:top w:w="35" w:type="dxa"/>
+                                <w:left w:w="70" w:type="dxa"/>
+                                <w:bottom w:w="35" w:type="dxa"/>
+                                <w:right w:w="70" w:type="dxa"/>
+                              </w:tcMar>
+                              <w:vAlign w:val="center"/>
+                            </w:tcPr>
+                            <w:p>
+                              <w:pPr>
+                                <w:jc w:val="center"/>
+                                <w:rPr>
+                                  <w:rFonts w:ascii="Calibri" w:hAnsi="Calibri" w:cs="Calibri"/>
+                                  <w:b/>
+                                  <w:sz w:val="16"/>
+                                  <w:szCs w:val="16"/>
+                                </w:rPr>
+                              </w:pPr>
+                              <w:r>
+                                <w:rPr>
+                                  <w:rFonts w:ascii="Calibri" w:hAnsi="Calibri" w:cs="Calibri"/>
+                                  <w:b/>
+                                  <w:sz w:val="16"/>
+                                  <w:szCs w:val="16"/>
+                                </w:rPr>
+                                <w:t>PREÇO TOTAL</w:t>
+                              </w:r>
+                            </w:p>
+                          </w:tc>
+                          <w:tc>
+                            <w:tcPr>
+                              <w:tcW w:w="7485" w:type="dxa"/>
+                              <w:tcBorders>
+                                <w:top w:val="nil"/>
+                                <w:left w:val="nil"/>
+                                <w:bottom w:val="nil"/>
+                                <w:right w:val="nil"/>
+                              </w:tcBorders>
+                              <w:tcMar>
+                                <w:top w:w="35" w:type="dxa"/>
+                                <w:left w:w="70" w:type="dxa"/>
+                                <w:bottom w:w="35" w:type="dxa"/>
+                                <w:right w:w="70" w:type="dxa"/>
+                              </w:tcMar>
+                              <w:vAlign w:val="center"/>
+                            </w:tcPr>
+                            <w:p>
+                              <w:pPr>
+                                <w:jc w:val="center"/>
+                                <w:rPr>
+                                  <w:rFonts w:ascii="Calibri" w:hAnsi="Calibri" w:cs="Calibri"/>
+                                  <w:b/>
+                                  <w:sz w:val="16"/>
+                                  <w:szCs w:val="16"/>
+                                </w:rPr>
+                              </w:pPr>
+                              <w:r>
+                                <w:rPr>
+                                  <w:rFonts w:ascii="Calibri" w:hAnsi="Calibri" w:cs="Calibri"/>
+                                  <w:b/>
+                                  <w:sz w:val="16"/>
+                                  <w:szCs w:val="16"/>
+                                </w:rPr>
+                                <w:t>{preco_total_numero} ({preco_total_extenso})</w:t>
+                              </w:r>
+                            </w:p>
+                          </w:tc>
+                        </w:tr>
+                      </w:tbl>
+                      <w:p/>
+                    </w:txbxContent>
+                  </v:textbox>
+                </v:roundrect>
+              </w:pict>
+            </w:r>
+          </w:p>
+        </w:tc>
+      </w:tr>
       <w:tr>
         <w:tc>
           <w:tcPr>
-            <w:tcW w:w="4450" w:type="dxa"/>
-            <w:gridSpan w:val="3"/>
-            <w:shd w:val="clear" w:color="auto" w:fill="BFBFBF"/>
+            <w:tcW w:w="5123" w:type="dxa"/>
             <w:tcBorders>
-              <w:top w:val="single" w:sz="6" w:space="0" w:color="404040"/>
-              <w:left w:val="single" w:sz="6" w:space="0" w:color="404040"/>
-              <w:bottom w:val="single" w:sz="6" w:space="0" w:color="404040"/>
-              <w:right w:val="single" w:sz="6" w:space="0" w:color="404040"/>
+              <w:top w:val="nil"/>
+              <w:left w:val="nil"/>
+              <w:bottom w:val="nil"/>
+              <w:right w:val="single" w:sz="4" w:space="0" w:color="7F7F7F"/>
             </w:tcBorders>
-            <w:vAlign w:val="center"/>
             <w:tcMar>
               <w:top w:w="35" w:type="dxa"/>
               <w:left w:w="70" w:type="dxa"/>
               <w:bottom w:w="35" w:type="dxa"/>
               <w:right w:w="70" w:type="dxa"/>
             </w:tcMar>
+            <w:vAlign w:val="center"/>
           </w:tcPr>
           <w:p>
             <w:pPr>
-              <w:spacing w:after="0" w:line="240" w:lineRule="auto"/>
-              <w:jc w:val="center"/>
-              <w:rPr>
-                <w:rFonts w:ascii="Calibri" w:hAnsi="Calibri" w:cs="Calibri"/>
-                <w:b/>
-                <w:sz w:val="16"/>
-                <w:szCs w:val="16"/>
-              </w:rPr>
-            </w:pPr>
-            <w:r>
-              <w:rPr>
-                <w:rFonts w:ascii="Calibri" w:hAnsi="Calibri" w:cs="Calibri"/>
-                <w:b/>
-                <w:sz w:val="16"/>
-                <w:szCs w:val="16"/>
-              </w:rPr>
-              <w:t>PREÇO TOTAL</w:t>
-            </w:r>
-          </w:p>
-        </w:tc>
-        <w:tc>
-          <w:tcPr>
-            <w:tcW w:w="4910" w:type="dxa"/>
-            <w:gridSpan w:val="5"/>
-            <w:shd w:val="clear" w:color="auto" w:fill="BFBFBF"/>
-            <w:tcBorders>
-              <w:top w:val="single" w:sz="6" w:space="0" w:color="404040"/>
-              <w:left w:val="single" w:sz="6" w:space="0" w:color="404040"/>
-              <w:bottom w:val="single" w:sz="6" w:space="0" w:color="404040"/>
-              <w:right w:val="single" w:sz="6" w:space="0" w:color="404040"/>
-            </w:tcBorders>
-            <w:vAlign w:val="center"/>
-            <w:tcMar>
-              <w:top w:w="35" w:type="dxa"/>
-              <w:left w:w="70" w:type="dxa"/>
-              <w:bottom w:w="35" w:type="dxa"/>
-              <w:right w:w="70" w:type="dxa"/>
-            </w:tcMar>
-          </w:tcPr>
-          <w:p>
-            <w:pPr>
-              <w:spacing w:after="0" w:line="240" w:lineRule="auto"/>
-              <w:jc w:val="center"/>
-              <w:rPr>
-                <w:rFonts w:ascii="Calibri" w:hAnsi="Calibri" w:cs="Calibri"/>
-                <w:b/>
-                <w:sz w:val="16"/>
-                <w:szCs w:val="16"/>
-              </w:rPr>
-            </w:pPr>
-            <w:r>
-              <w:rPr>
-                <w:rFonts w:ascii="Calibri" w:hAnsi="Calibri" w:cs="Calibri"/>
-                <w:b/>
-                <w:sz w:val="16"/>
-                <w:szCs w:val="16"/>
-              </w:rPr>
-              <w:t>{preco_total_numero} ({preco_total_extenso})</w:t>
-            </w:r>
-          </w:p>
-        </w:tc>
-      </w:tr>
-    </w:tbl>
-    <w:tbl>
-      <w:tblPr>
-        <w:tblW w:w="9360" w:type="dxa"/>
-        <w:jc w:val="center"/>
-        <w:tblLayout w:type="fixed"/>
-        <w:tblBorders>
-          <w:top w:val="nil"/>
-          <w:left w:val="nil"/>
-          <w:bottom w:val="nil"/>
-          <w:right w:val="nil"/>
-          <w:insideH w:val="nil"/>
-          <w:insideV w:val="nil"/>
-        </w:tblBorders>
-      </w:tblPr>
-      <w:tblGrid>
-        <w:gridCol w:w="4580"/>
-        <w:gridCol w:w="4580"/>
-      </w:tblGrid>
-      <w:tr>
-        <w:tc>
-          <w:tcPr>
-            <w:tcW w:w="4580" w:type="dxa"/>
-            <w:tcBorders>
-              <w:top w:val="nil"/>
-              <w:left w:val="nil"/>
-              <w:bottom w:val="nil"/>
-              <w:right w:val="nil"/>
-            </w:tcBorders>
-            <w:vAlign w:val="center"/>
-            <w:tcMar>
-              <w:top w:w="35" w:type="dxa"/>
-              <w:left w:w="70" w:type="dxa"/>
-              <w:bottom w:w="35" w:type="dxa"/>
-              <w:right w:w="70" w:type="dxa"/>
-            </w:tcMar>
-          </w:tcPr>
-          <w:p>
-            <w:pPr>
-              <w:spacing w:after="0" w:line="240" w:lineRule="auto"/>
               <w:rPr>
                 <w:rFonts w:ascii="Calibri" w:hAnsi="Calibri" w:cs="Calibri"/>
                 <w:sz w:val="16"/>
@@ -2402,24 +2236,23 @@
         </w:tc>
         <w:tc>
           <w:tcPr>
-            <w:tcW w:w="4580" w:type="dxa"/>
+            <w:tcW w:w="5123" w:type="dxa"/>
             <w:tcBorders>
               <w:top w:val="nil"/>
               <w:left w:val="nil"/>
               <w:bottom w:val="nil"/>
               <w:right w:val="nil"/>
             </w:tcBorders>
-            <w:vAlign w:val="center"/>
             <w:tcMar>
               <w:top w:w="35" w:type="dxa"/>
               <w:left w:w="70" w:type="dxa"/>
               <w:bottom w:w="35" w:type="dxa"/>
               <w:right w:w="70" w:type="dxa"/>
             </w:tcMar>
+            <w:vAlign w:val="center"/>
           </w:tcPr>
           <w:p>
             <w:pPr>
-              <w:spacing w:after="0" w:line="240" w:lineRule="auto"/>
               <w:rPr>
                 <w:rFonts w:ascii="Calibri" w:hAnsi="Calibri" w:cs="Calibri"/>
                 <w:sz w:val="16"/>
@@ -2449,24 +2282,23 @@
       <w:tr>
         <w:tc>
           <w:tcPr>
-            <w:tcW w:w="4580" w:type="dxa"/>
+            <w:tcW w:w="5123" w:type="dxa"/>
             <w:tcBorders>
               <w:top w:val="nil"/>
               <w:left w:val="nil"/>
               <w:bottom w:val="nil"/>
-              <w:right w:val="nil"/>
+              <w:right w:val="single" w:sz="4" w:space="0" w:color="7F7F7F"/>
             </w:tcBorders>
-            <w:vAlign w:val="center"/>
             <w:tcMar>
               <w:top w:w="35" w:type="dxa"/>
               <w:left w:w="70" w:type="dxa"/>
               <w:bottom w:w="35" w:type="dxa"/>
               <w:right w:w="70" w:type="dxa"/>
             </w:tcMar>
+            <w:vAlign w:val="center"/>
           </w:tcPr>
           <w:p>
             <w:pPr>
-              <w:spacing w:after="0" w:line="240" w:lineRule="auto"/>
               <w:rPr>
                 <w:rFonts w:ascii="Calibri" w:hAnsi="Calibri" w:cs="Calibri"/>
                 <w:sz w:val="16"/>
@@ -2494,24 +2326,23 @@
         </w:tc>
         <w:tc>
           <w:tcPr>
-            <w:tcW w:w="4580" w:type="dxa"/>
+            <w:tcW w:w="5123" w:type="dxa"/>
             <w:tcBorders>
               <w:top w:val="nil"/>
               <w:left w:val="nil"/>
               <w:bottom w:val="nil"/>
               <w:right w:val="nil"/>
             </w:tcBorders>
-            <w:vAlign w:val="center"/>
             <w:tcMar>
               <w:top w:w="35" w:type="dxa"/>
               <w:left w:w="70" w:type="dxa"/>
               <w:bottom w:w="35" w:type="dxa"/>
               <w:right w:w="70" w:type="dxa"/>
             </w:tcMar>
+            <w:vAlign w:val="center"/>
           </w:tcPr>
           <w:p>
             <w:pPr>
-              <w:spacing w:after="0" w:line="240" w:lineRule="auto"/>
               <w:rPr>
                 <w:rFonts w:ascii="Calibri" w:hAnsi="Calibri" w:cs="Calibri"/>
                 <w:sz w:val="16"/>
@@ -2541,24 +2372,23 @@
       <w:tr>
         <w:tc>
           <w:tcPr>
-            <w:tcW w:w="4580" w:type="dxa"/>
+            <w:tcW w:w="5123" w:type="dxa"/>
             <w:tcBorders>
               <w:top w:val="nil"/>
               <w:left w:val="nil"/>
               <w:bottom w:val="nil"/>
-              <w:right w:val="nil"/>
+              <w:right w:val="single" w:sz="4" w:space="0" w:color="7F7F7F"/>
             </w:tcBorders>
-            <w:vAlign w:val="center"/>
             <w:tcMar>
               <w:top w:w="35" w:type="dxa"/>
               <w:left w:w="70" w:type="dxa"/>
               <w:bottom w:w="35" w:type="dxa"/>
               <w:right w:w="70" w:type="dxa"/>
             </w:tcMar>
+            <w:vAlign w:val="center"/>
           </w:tcPr>
           <w:p>
             <w:pPr>
-              <w:spacing w:after="0" w:line="240" w:lineRule="auto"/>
               <w:rPr>
                 <w:rFonts w:ascii="Calibri" w:hAnsi="Calibri" w:cs="Calibri"/>
                 <w:sz w:val="16"/>
@@ -2586,24 +2416,23 @@
         </w:tc>
         <w:tc>
           <w:tcPr>
-            <w:tcW w:w="4580" w:type="dxa"/>
+            <w:tcW w:w="5123" w:type="dxa"/>
             <w:tcBorders>
               <w:top w:val="nil"/>
               <w:left w:val="nil"/>
               <w:bottom w:val="nil"/>
               <w:right w:val="nil"/>
             </w:tcBorders>
-            <w:vAlign w:val="center"/>
             <w:tcMar>
               <w:top w:w="35" w:type="dxa"/>
               <w:left w:w="70" w:type="dxa"/>
               <w:bottom w:w="35" w:type="dxa"/>
               <w:right w:w="70" w:type="dxa"/>
             </w:tcMar>
+            <w:vAlign w:val="center"/>
           </w:tcPr>
           <w:p>
             <w:pPr>
-              <w:spacing w:after="0" w:line="240" w:lineRule="auto"/>
               <w:rPr>
                 <w:rFonts w:ascii="Calibri" w:hAnsi="Calibri" w:cs="Calibri"/>
                 <w:sz w:val="16"/>
@@ -2635,6 +2464,7 @@
       <w:pPr>
         <w:spacing w:before="130" w:after="130" w:line="120" w:lineRule="exact"/>
         <w:rPr>
+          <w:bCs/>
           <w:sz w:val="4"/>
           <w:szCs w:val="4"/>
         </w:rPr>
@@ -2780,7 +2610,61 @@
           <w:szCs w:val="16"/>
           <w:lang w:eastAsia="pt-BR"/>
         </w:rPr>
-        <w:t>Prazo de Execução</w:t>
+        <w:t>{#mostrar_info_51}</w:t>
+      </w:r>
+    </w:p>
+    <w:p>
+      <w:pPr>
+        <w:pStyle w:val="PargrafodaLista"/>
+        <w:numPr>
+          <w:ilvl w:val="1"/>
+          <w:numId w:val="21"/>
+        </w:numPr>
+        <w:ind w:left="964" w:hanging="284"/>
+        <w:rPr>
+          <w:rFonts w:ascii="Calibri" w:eastAsia="Times New Roman" w:hAnsi="Calibri" w:cs="Calibri"/>
+          <w:color w:val="000000"/>
+          <w:sz w:val="16"/>
+          <w:szCs w:val="16"/>
+          <w:lang w:eastAsia="pt-BR"/>
+        </w:rPr>
+      </w:pPr>
+      <w:r>
+        <w:rPr>
+          <w:rFonts w:ascii="Calibri" w:eastAsia="Times New Roman" w:hAnsi="Calibri" w:cs="Calibri"/>
+          <w:color w:val="000000"/>
+          <w:sz w:val="16"/>
+          <w:szCs w:val="16"/>
+          <w:lang w:eastAsia="pt-BR"/>
+        </w:rPr>
+        <w:t>{texto_info_51}</w:t>
+      </w:r>
+    </w:p>
+    <w:p>
+      <w:pPr>
+        <w:pStyle w:val="PargrafodaLista"/>
+        <w:numPr>
+          <w:ilvl w:val="1"/>
+          <w:numId w:val="21"/>
+        </w:numPr>
+        <w:ind w:left="964" w:hanging="284"/>
+        <w:rPr>
+          <w:rFonts w:ascii="Calibri" w:eastAsia="Times New Roman" w:hAnsi="Calibri" w:cs="Calibri"/>
+          <w:color w:val="000000"/>
+          <w:sz w:val="16"/>
+          <w:szCs w:val="16"/>
+          <w:lang w:eastAsia="pt-BR"/>
+        </w:rPr>
+      </w:pPr>
+      <w:r>
+        <w:rPr>
+          <w:rFonts w:ascii="Calibri" w:eastAsia="Times New Roman" w:hAnsi="Calibri" w:cs="Calibri"/>
+          <w:color w:val="000000"/>
+          <w:sz w:val="16"/>
+          <w:szCs w:val="16"/>
+          <w:lang w:eastAsia="pt-BR"/>
+        </w:rPr>
+        <w:t>{/mostrar_info_51}</w:t>
       </w:r>
     </w:p>
     <w:p>
@@ -2807,7 +2691,7 @@
           <w:szCs w:val="16"/>
           <w:lang w:eastAsia="pt-BR"/>
         </w:rPr>
-        <w:t>Serviços: Estimados em {prazo_execucao_dias}, incluindo translado ida &amp; volta Equipe;</w:t>
+        <w:t>{#mostrar_info_511}</w:t>
       </w:r>
     </w:p>
     <w:p>
@@ -2834,27 +2718,7 @@
           <w:szCs w:val="16"/>
           <w:lang w:eastAsia="pt-BR"/>
         </w:rPr>
-        <w:t xml:space="preserve">Consumíveis/Materiais/Equipamentos: </w:t>
-      </w:r>
-      <w:r>
-        <w:rPr>
-          <w:rFonts w:ascii="Calibri" w:eastAsia="Times New Roman" w:hAnsi="Calibri" w:cs="Calibri"/>
-          <w:color w:val="000000"/>
-          <w:sz w:val="16"/>
-          <w:szCs w:val="16"/>
-          <w:lang w:eastAsia="pt-BR"/>
-        </w:rPr>
-        <w:t>Imediato</w:t>
-      </w:r>
-      <w:r>
-        <w:rPr>
-          <w:rFonts w:ascii="Calibri" w:eastAsia="Times New Roman" w:hAnsi="Calibri" w:cs="Calibri"/>
-          <w:color w:val="000000"/>
-          <w:sz w:val="16"/>
-          <w:szCs w:val="16"/>
-          <w:lang w:eastAsia="pt-BR"/>
-        </w:rPr>
-        <w:t>;</w:t>
+        <w:t>{texto_info_511}</w:t>
       </w:r>
     </w:p>
     <w:p>
@@ -2881,39 +2745,7 @@
           <w:szCs w:val="16"/>
           <w:lang w:eastAsia="pt-BR"/>
         </w:rPr>
-        <w:t>O p</w:t>
-      </w:r>
-      <w:r>
-        <w:rPr>
-          <w:rFonts w:ascii="Calibri" w:eastAsia="Times New Roman" w:hAnsi="Calibri" w:cs="Calibri"/>
-          <w:color w:val="000000"/>
-          <w:sz w:val="16"/>
-          <w:szCs w:val="16"/>
-          <w:lang w:eastAsia="pt-BR"/>
-        </w:rPr>
-        <w:t xml:space="preserve">razo de Execução dos serviços pode ser alterado de acordo com as condições de execução </w:t>
-      </w:r>
-      <w:proofErr w:type="gramStart"/>
-      <w:r>
-        <w:rPr>
-          <w:rFonts w:ascii="Calibri" w:eastAsia="Times New Roman" w:hAnsi="Calibri" w:cs="Calibri"/>
-          <w:color w:val="000000"/>
-          <w:sz w:val="16"/>
-          <w:szCs w:val="16"/>
-          <w:lang w:eastAsia="pt-BR"/>
-        </w:rPr>
-        <w:t>dos mesmos</w:t>
-      </w:r>
-      <w:proofErr w:type="gramEnd"/>
-      <w:r>
-        <w:rPr>
-          <w:rFonts w:ascii="Calibri" w:eastAsia="Times New Roman" w:hAnsi="Calibri" w:cs="Calibri"/>
-          <w:color w:val="000000"/>
-          <w:sz w:val="16"/>
-          <w:szCs w:val="16"/>
-          <w:lang w:eastAsia="pt-BR"/>
-        </w:rPr>
-        <w:t>;</w:t>
+        <w:t>{/mostrar_info_511}</w:t>
       </w:r>
     </w:p>
     <w:p>
@@ -2940,8 +2772,25 @@
           <w:szCs w:val="16"/>
           <w:lang w:eastAsia="pt-BR"/>
         </w:rPr>
-        <w:t>Caso o prazo de execução seja diferente do mencionado, o valor total da presente proposta será alterado conforme as informações abaixo</w:t>
+        <w:t>{#mostrar_info_512}</w:t>
       </w:r>
+    </w:p>
+    <w:p>
+      <w:pPr>
+        <w:pStyle w:val="PargrafodaLista"/>
+        <w:numPr>
+          <w:ilvl w:val="2"/>
+          <w:numId w:val="21"/>
+        </w:numPr>
+        <w:ind w:left="1191" w:hanging="227"/>
+        <w:rPr>
+          <w:rFonts w:ascii="Calibri" w:eastAsia="Times New Roman" w:hAnsi="Calibri" w:cs="Calibri"/>
+          <w:color w:val="000000"/>
+          <w:sz w:val="16"/>
+          <w:szCs w:val="16"/>
+          <w:lang w:eastAsia="pt-BR"/>
+        </w:rPr>
+      </w:pPr>
       <w:r>
         <w:rPr>
           <w:rFonts w:ascii="Calibri" w:eastAsia="Times New Roman" w:hAnsi="Calibri" w:cs="Calibri"/>
@@ -2950,7 +2799,196 @@
           <w:szCs w:val="16"/>
           <w:lang w:eastAsia="pt-BR"/>
         </w:rPr>
-        <w:t>:</w:t>
+        <w:t>{texto_info_512}</w:t>
+      </w:r>
+    </w:p>
+    <w:p>
+      <w:pPr>
+        <w:pStyle w:val="PargrafodaLista"/>
+        <w:numPr>
+          <w:ilvl w:val="2"/>
+          <w:numId w:val="21"/>
+        </w:numPr>
+        <w:ind w:left="1191" w:hanging="227"/>
+        <w:rPr>
+          <w:rFonts w:ascii="Calibri" w:eastAsia="Times New Roman" w:hAnsi="Calibri" w:cs="Calibri"/>
+          <w:color w:val="000000"/>
+          <w:sz w:val="16"/>
+          <w:szCs w:val="16"/>
+          <w:lang w:eastAsia="pt-BR"/>
+        </w:rPr>
+      </w:pPr>
+      <w:r>
+        <w:rPr>
+          <w:rFonts w:ascii="Calibri" w:eastAsia="Times New Roman" w:hAnsi="Calibri" w:cs="Calibri"/>
+          <w:color w:val="000000"/>
+          <w:sz w:val="16"/>
+          <w:szCs w:val="16"/>
+          <w:lang w:eastAsia="pt-BR"/>
+        </w:rPr>
+        <w:t>{/mostrar_info_512}</w:t>
+      </w:r>
+    </w:p>
+    <w:p>
+      <w:pPr>
+        <w:pStyle w:val="PargrafodaLista"/>
+        <w:numPr>
+          <w:ilvl w:val="2"/>
+          <w:numId w:val="21"/>
+        </w:numPr>
+        <w:ind w:left="1191" w:hanging="227"/>
+        <w:rPr>
+          <w:rFonts w:ascii="Calibri" w:eastAsia="Times New Roman" w:hAnsi="Calibri" w:cs="Calibri"/>
+          <w:color w:val="000000"/>
+          <w:sz w:val="16"/>
+          <w:szCs w:val="16"/>
+          <w:lang w:eastAsia="pt-BR"/>
+        </w:rPr>
+      </w:pPr>
+      <w:r>
+        <w:rPr>
+          <w:rFonts w:ascii="Calibri" w:eastAsia="Times New Roman" w:hAnsi="Calibri" w:cs="Calibri"/>
+          <w:color w:val="000000"/>
+          <w:sz w:val="16"/>
+          <w:szCs w:val="16"/>
+          <w:lang w:eastAsia="pt-BR"/>
+        </w:rPr>
+        <w:t>{#mostrar_info_513}</w:t>
+      </w:r>
+    </w:p>
+    <w:p>
+      <w:pPr>
+        <w:pStyle w:val="PargrafodaLista"/>
+        <w:numPr>
+          <w:ilvl w:val="2"/>
+          <w:numId w:val="21"/>
+        </w:numPr>
+        <w:ind w:left="1191" w:hanging="227"/>
+        <w:rPr>
+          <w:rFonts w:ascii="Calibri" w:eastAsia="Times New Roman" w:hAnsi="Calibri" w:cs="Calibri"/>
+          <w:color w:val="000000"/>
+          <w:sz w:val="16"/>
+          <w:szCs w:val="16"/>
+          <w:lang w:eastAsia="pt-BR"/>
+        </w:rPr>
+      </w:pPr>
+      <w:r>
+        <w:rPr>
+          <w:rFonts w:ascii="Calibri" w:eastAsia="Times New Roman" w:hAnsi="Calibri" w:cs="Calibri"/>
+          <w:color w:val="000000"/>
+          <w:sz w:val="16"/>
+          <w:szCs w:val="16"/>
+          <w:lang w:eastAsia="pt-BR"/>
+        </w:rPr>
+        <w:t>{texto_info_513}</w:t>
+      </w:r>
+    </w:p>
+    <w:p>
+      <w:pPr>
+        <w:pStyle w:val="PargrafodaLista"/>
+        <w:numPr>
+          <w:ilvl w:val="2"/>
+          <w:numId w:val="21"/>
+        </w:numPr>
+        <w:ind w:left="1191" w:hanging="227"/>
+        <w:rPr>
+          <w:rFonts w:ascii="Calibri" w:eastAsia="Times New Roman" w:hAnsi="Calibri" w:cs="Calibri"/>
+          <w:color w:val="000000"/>
+          <w:sz w:val="16"/>
+          <w:szCs w:val="16"/>
+          <w:lang w:eastAsia="pt-BR"/>
+        </w:rPr>
+      </w:pPr>
+      <w:r>
+        <w:rPr>
+          <w:rFonts w:ascii="Calibri" w:eastAsia="Times New Roman" w:hAnsi="Calibri" w:cs="Calibri"/>
+          <w:color w:val="000000"/>
+          <w:sz w:val="16"/>
+          <w:szCs w:val="16"/>
+          <w:lang w:eastAsia="pt-BR"/>
+        </w:rPr>
+        <w:t>{/mostrar_info_513}</w:t>
+      </w:r>
+    </w:p>
+    <w:p>
+      <w:pPr>
+        <w:pStyle w:val="PargrafodaLista"/>
+        <w:numPr>
+          <w:ilvl w:val="2"/>
+          <w:numId w:val="21"/>
+        </w:numPr>
+        <w:ind w:left="1191" w:hanging="227"/>
+        <w:rPr>
+          <w:rFonts w:ascii="Calibri" w:eastAsia="Times New Roman" w:hAnsi="Calibri" w:cs="Calibri"/>
+          <w:color w:val="000000"/>
+          <w:sz w:val="16"/>
+          <w:szCs w:val="16"/>
+          <w:lang w:eastAsia="pt-BR"/>
+        </w:rPr>
+      </w:pPr>
+      <w:r>
+        <w:rPr>
+          <w:rFonts w:ascii="Calibri" w:eastAsia="Times New Roman" w:hAnsi="Calibri" w:cs="Calibri"/>
+          <w:color w:val="000000"/>
+          <w:sz w:val="16"/>
+          <w:szCs w:val="16"/>
+          <w:lang w:eastAsia="pt-BR"/>
+        </w:rPr>
+        <w:t>{#mostrar_info_514}</w:t>
+      </w:r>
+    </w:p>
+    <w:p>
+      <w:pPr>
+        <w:pStyle w:val="PargrafodaLista"/>
+        <w:numPr>
+          <w:ilvl w:val="2"/>
+          <w:numId w:val="21"/>
+        </w:numPr>
+        <w:ind w:left="1191" w:hanging="227"/>
+        <w:rPr>
+          <w:rFonts w:ascii="Calibri" w:eastAsia="Times New Roman" w:hAnsi="Calibri" w:cs="Calibri"/>
+          <w:color w:val="000000"/>
+          <w:sz w:val="16"/>
+          <w:szCs w:val="16"/>
+          <w:lang w:eastAsia="pt-BR"/>
+        </w:rPr>
+      </w:pPr>
+      <w:r>
+        <w:rPr>
+          <w:rFonts w:ascii="Calibri" w:eastAsia="Times New Roman" w:hAnsi="Calibri" w:cs="Calibri"/>
+          <w:color w:val="000000"/>
+          <w:sz w:val="16"/>
+          <w:szCs w:val="16"/>
+          <w:lang w:eastAsia="pt-BR"/>
+        </w:rPr>
+        <w:t>{texto_info_514}</w:t>
+      </w:r>
+    </w:p>
+    <w:p>
+      <w:pPr>
+        <w:pStyle w:val="PargrafodaLista"/>
+        <w:numPr>
+          <w:ilvl w:val="2"/>
+          <w:numId w:val="21"/>
+        </w:numPr>
+        <w:ind w:left="1191" w:hanging="227"/>
+        <w:rPr>
+          <w:rFonts w:ascii="Calibri" w:eastAsia="Times New Roman" w:hAnsi="Calibri" w:cs="Calibri"/>
+          <w:color w:val="000000"/>
+          <w:sz w:val="16"/>
+          <w:szCs w:val="16"/>
+          <w:lang w:eastAsia="pt-BR"/>
+        </w:rPr>
+      </w:pPr>
+      <w:r>
+        <w:rPr>
+          <w:rFonts w:ascii="Calibri" w:eastAsia="Times New Roman" w:hAnsi="Calibri" w:cs="Calibri"/>
+          <w:color w:val="000000"/>
+          <w:sz w:val="16"/>
+          <w:szCs w:val="16"/>
+          <w:lang w:eastAsia="pt-BR"/>
+        </w:rPr>
+        <w:t>{/mostrar_info_514}</w:t>
       </w:r>
     </w:p>
     <w:p>
@@ -2977,7 +3015,7 @@
           <w:szCs w:val="16"/>
           <w:lang w:eastAsia="pt-BR"/>
         </w:rPr>
-        <w:t>De Segunda-feira a Sexta-feira das 17h30min até as 7h30min 50% adicional;</w:t>
+        <w:t>{#mostrar_info_514a}</w:t>
       </w:r>
     </w:p>
     <w:p>
@@ -3004,7 +3042,7 @@
           <w:szCs w:val="16"/>
           <w:lang w:eastAsia="pt-BR"/>
         </w:rPr>
-        <w:t>Durante o Sábado 50% adicional o dia todo;</w:t>
+        <w:t>{texto_info_514a}</w:t>
       </w:r>
     </w:p>
     <w:p>
@@ -3031,7 +3069,7 @@
           <w:szCs w:val="16"/>
           <w:lang w:eastAsia="pt-BR"/>
         </w:rPr>
-        <w:t>Domingos e Feriados 100% adicional o dia todo;</w:t>
+        <w:t>{/mostrar_info_514a}</w:t>
       </w:r>
     </w:p>
     <w:p>
@@ -3058,7 +3096,223 @@
           <w:szCs w:val="16"/>
           <w:lang w:eastAsia="pt-BR"/>
         </w:rPr>
-        <w:t>Diária Offshore quando o barco em operação ou fundeado e a equipe permanecer a bordo.</w:t>
+        <w:t>{#mostrar_info_514b}</w:t>
+      </w:r>
+    </w:p>
+    <w:p>
+      <w:pPr>
+        <w:pStyle w:val="PargrafodaLista"/>
+        <w:numPr>
+          <w:ilvl w:val="0"/>
+          <w:numId w:val="40"/>
+        </w:numPr>
+        <w:ind w:left="1645" w:hanging="227"/>
+        <w:rPr>
+          <w:rFonts w:ascii="Calibri" w:eastAsia="Times New Roman" w:hAnsi="Calibri" w:cs="Calibri"/>
+          <w:color w:val="000000"/>
+          <w:sz w:val="16"/>
+          <w:szCs w:val="16"/>
+          <w:lang w:eastAsia="pt-BR"/>
+        </w:rPr>
+      </w:pPr>
+      <w:r>
+        <w:rPr>
+          <w:rFonts w:ascii="Calibri" w:eastAsia="Times New Roman" w:hAnsi="Calibri" w:cs="Calibri"/>
+          <w:color w:val="000000"/>
+          <w:sz w:val="16"/>
+          <w:szCs w:val="16"/>
+          <w:lang w:eastAsia="pt-BR"/>
+        </w:rPr>
+        <w:t>{texto_info_514b}</w:t>
+      </w:r>
+    </w:p>
+    <w:p>
+      <w:pPr>
+        <w:pStyle w:val="PargrafodaLista"/>
+        <w:numPr>
+          <w:ilvl w:val="0"/>
+          <w:numId w:val="40"/>
+        </w:numPr>
+        <w:ind w:left="1645" w:hanging="227"/>
+        <w:rPr>
+          <w:rFonts w:ascii="Calibri" w:eastAsia="Times New Roman" w:hAnsi="Calibri" w:cs="Calibri"/>
+          <w:color w:val="000000"/>
+          <w:sz w:val="16"/>
+          <w:szCs w:val="16"/>
+          <w:lang w:eastAsia="pt-BR"/>
+        </w:rPr>
+      </w:pPr>
+      <w:r>
+        <w:rPr>
+          <w:rFonts w:ascii="Calibri" w:eastAsia="Times New Roman" w:hAnsi="Calibri" w:cs="Calibri"/>
+          <w:color w:val="000000"/>
+          <w:sz w:val="16"/>
+          <w:szCs w:val="16"/>
+          <w:lang w:eastAsia="pt-BR"/>
+        </w:rPr>
+        <w:t>{/mostrar_info_514b}</w:t>
+      </w:r>
+    </w:p>
+    <w:p>
+      <w:pPr>
+        <w:pStyle w:val="PargrafodaLista"/>
+        <w:numPr>
+          <w:ilvl w:val="0"/>
+          <w:numId w:val="40"/>
+        </w:numPr>
+        <w:ind w:left="1645" w:hanging="227"/>
+        <w:rPr>
+          <w:rFonts w:ascii="Calibri" w:eastAsia="Times New Roman" w:hAnsi="Calibri" w:cs="Calibri"/>
+          <w:color w:val="000000"/>
+          <w:sz w:val="16"/>
+          <w:szCs w:val="16"/>
+          <w:lang w:eastAsia="pt-BR"/>
+        </w:rPr>
+      </w:pPr>
+      <w:r>
+        <w:rPr>
+          <w:rFonts w:ascii="Calibri" w:eastAsia="Times New Roman" w:hAnsi="Calibri" w:cs="Calibri"/>
+          <w:color w:val="000000"/>
+          <w:sz w:val="16"/>
+          <w:szCs w:val="16"/>
+          <w:lang w:eastAsia="pt-BR"/>
+        </w:rPr>
+        <w:t>{#mostrar_info_514c}</w:t>
+      </w:r>
+    </w:p>
+    <w:p>
+      <w:pPr>
+        <w:pStyle w:val="PargrafodaLista"/>
+        <w:numPr>
+          <w:ilvl w:val="0"/>
+          <w:numId w:val="40"/>
+        </w:numPr>
+        <w:ind w:left="1645" w:hanging="227"/>
+        <w:rPr>
+          <w:rFonts w:ascii="Calibri" w:eastAsia="Times New Roman" w:hAnsi="Calibri" w:cs="Calibri"/>
+          <w:color w:val="000000"/>
+          <w:sz w:val="16"/>
+          <w:szCs w:val="16"/>
+          <w:lang w:eastAsia="pt-BR"/>
+        </w:rPr>
+      </w:pPr>
+      <w:r>
+        <w:rPr>
+          <w:rFonts w:ascii="Calibri" w:eastAsia="Times New Roman" w:hAnsi="Calibri" w:cs="Calibri"/>
+          <w:color w:val="000000"/>
+          <w:sz w:val="16"/>
+          <w:szCs w:val="16"/>
+          <w:lang w:eastAsia="pt-BR"/>
+        </w:rPr>
+        <w:t>{texto_info_514c}</w:t>
+      </w:r>
+    </w:p>
+    <w:p>
+      <w:pPr>
+        <w:pStyle w:val="PargrafodaLista"/>
+        <w:numPr>
+          <w:ilvl w:val="0"/>
+          <w:numId w:val="40"/>
+        </w:numPr>
+        <w:ind w:left="1645" w:hanging="227"/>
+        <w:rPr>
+          <w:rFonts w:ascii="Calibri" w:eastAsia="Times New Roman" w:hAnsi="Calibri" w:cs="Calibri"/>
+          <w:color w:val="000000"/>
+          <w:sz w:val="16"/>
+          <w:szCs w:val="16"/>
+          <w:lang w:eastAsia="pt-BR"/>
+        </w:rPr>
+      </w:pPr>
+      <w:r>
+        <w:rPr>
+          <w:rFonts w:ascii="Calibri" w:eastAsia="Times New Roman" w:hAnsi="Calibri" w:cs="Calibri"/>
+          <w:color w:val="000000"/>
+          <w:sz w:val="16"/>
+          <w:szCs w:val="16"/>
+          <w:lang w:eastAsia="pt-BR"/>
+        </w:rPr>
+        <w:t>{/mostrar_info_514c}</w:t>
+      </w:r>
+    </w:p>
+    <w:p>
+      <w:pPr>
+        <w:pStyle w:val="PargrafodaLista"/>
+        <w:numPr>
+          <w:ilvl w:val="0"/>
+          <w:numId w:val="40"/>
+        </w:numPr>
+        <w:ind w:left="1645" w:hanging="227"/>
+        <w:rPr>
+          <w:rFonts w:ascii="Calibri" w:eastAsia="Times New Roman" w:hAnsi="Calibri" w:cs="Calibri"/>
+          <w:color w:val="000000"/>
+          <w:sz w:val="16"/>
+          <w:szCs w:val="16"/>
+          <w:lang w:eastAsia="pt-BR"/>
+        </w:rPr>
+      </w:pPr>
+      <w:r>
+        <w:rPr>
+          <w:rFonts w:ascii="Calibri" w:eastAsia="Times New Roman" w:hAnsi="Calibri" w:cs="Calibri"/>
+          <w:color w:val="000000"/>
+          <w:sz w:val="16"/>
+          <w:szCs w:val="16"/>
+          <w:lang w:eastAsia="pt-BR"/>
+        </w:rPr>
+        <w:t>{#mostrar_info_514d}</w:t>
+      </w:r>
+    </w:p>
+    <w:p>
+      <w:pPr>
+        <w:pStyle w:val="PargrafodaLista"/>
+        <w:numPr>
+          <w:ilvl w:val="0"/>
+          <w:numId w:val="40"/>
+        </w:numPr>
+        <w:ind w:left="1645" w:hanging="227"/>
+        <w:rPr>
+          <w:rFonts w:ascii="Calibri" w:eastAsia="Times New Roman" w:hAnsi="Calibri" w:cs="Calibri"/>
+          <w:color w:val="000000"/>
+          <w:sz w:val="16"/>
+          <w:szCs w:val="16"/>
+          <w:lang w:eastAsia="pt-BR"/>
+        </w:rPr>
+      </w:pPr>
+      <w:r>
+        <w:rPr>
+          <w:rFonts w:ascii="Calibri" w:eastAsia="Times New Roman" w:hAnsi="Calibri" w:cs="Calibri"/>
+          <w:color w:val="000000"/>
+          <w:sz w:val="16"/>
+          <w:szCs w:val="16"/>
+          <w:lang w:eastAsia="pt-BR"/>
+        </w:rPr>
+        <w:t>{texto_info_514d}</w:t>
+      </w:r>
+    </w:p>
+    <w:p>
+      <w:pPr>
+        <w:pStyle w:val="PargrafodaLista"/>
+        <w:numPr>
+          <w:ilvl w:val="0"/>
+          <w:numId w:val="40"/>
+        </w:numPr>
+        <w:ind w:left="1645" w:hanging="227"/>
+        <w:rPr>
+          <w:rFonts w:ascii="Calibri" w:eastAsia="Times New Roman" w:hAnsi="Calibri" w:cs="Calibri"/>
+          <w:color w:val="000000"/>
+          <w:sz w:val="16"/>
+          <w:szCs w:val="16"/>
+          <w:lang w:eastAsia="pt-BR"/>
+        </w:rPr>
+      </w:pPr>
+      <w:r>
+        <w:rPr>
+          <w:rFonts w:ascii="Calibri" w:eastAsia="Times New Roman" w:hAnsi="Calibri" w:cs="Calibri"/>
+          <w:color w:val="000000"/>
+          <w:sz w:val="16"/>
+          <w:szCs w:val="16"/>
+          <w:lang w:eastAsia="pt-BR"/>
+        </w:rPr>
+        <w:t>{/mostrar_info_514d}</w:t>
       </w:r>
     </w:p>
     <w:p>
@@ -3085,79 +3339,7 @@
           <w:szCs w:val="16"/>
           <w:lang w:eastAsia="pt-BR"/>
         </w:rPr>
-        <w:t>Caso haja a necessidade de subs</w:t>
-      </w:r>
-      <w:r>
-        <w:rPr>
-          <w:rFonts w:ascii="Calibri" w:eastAsia="Calibri" w:hAnsi="Calibri" w:cs="Calibri"/>
-          <w:color w:val="000000"/>
-          <w:sz w:val="16"/>
-          <w:szCs w:val="16"/>
-          <w:lang w:eastAsia="pt-BR"/>
-        </w:rPr>
-        <w:t>ti</w:t>
-      </w:r>
-      <w:r>
-        <w:rPr>
-          <w:rFonts w:ascii="Calibri" w:eastAsia="Times New Roman" w:hAnsi="Calibri" w:cs="Calibri"/>
-          <w:color w:val="000000"/>
-          <w:sz w:val="16"/>
-          <w:szCs w:val="16"/>
-          <w:lang w:eastAsia="pt-BR"/>
-        </w:rPr>
-        <w:t xml:space="preserve">tuição de algum componente não previsto nesta proposta </w:t>
-      </w:r>
-      <w:proofErr w:type="gramStart"/>
-      <w:r>
-        <w:rPr>
-          <w:rFonts w:ascii="Calibri" w:eastAsia="Times New Roman" w:hAnsi="Calibri" w:cs="Calibri"/>
-          <w:color w:val="000000"/>
-          <w:sz w:val="16"/>
-          <w:szCs w:val="16"/>
-          <w:lang w:eastAsia="pt-BR"/>
-        </w:rPr>
-        <w:t>o mesmo</w:t>
-      </w:r>
-      <w:proofErr w:type="gramEnd"/>
-      <w:r>
-        <w:rPr>
-          <w:rFonts w:ascii="Calibri" w:eastAsia="Times New Roman" w:hAnsi="Calibri" w:cs="Calibri"/>
-          <w:color w:val="000000"/>
-          <w:sz w:val="16"/>
-          <w:szCs w:val="16"/>
-          <w:lang w:eastAsia="pt-BR"/>
-        </w:rPr>
-        <w:t xml:space="preserve"> será objeto de orçamento adi</w:t>
-      </w:r>
-      <w:r>
-        <w:rPr>
-          <w:rFonts w:ascii="Calibri" w:eastAsia="Calibri" w:hAnsi="Calibri" w:cs="Calibri"/>
-          <w:color w:val="000000"/>
-          <w:sz w:val="16"/>
-          <w:szCs w:val="16"/>
-          <w:lang w:eastAsia="pt-BR"/>
-        </w:rPr>
-        <w:t>ti</w:t>
-      </w:r>
-      <w:r>
-        <w:rPr>
-          <w:rFonts w:ascii="Calibri" w:eastAsia="Times New Roman" w:hAnsi="Calibri" w:cs="Calibri"/>
-          <w:color w:val="000000"/>
-          <w:sz w:val="16"/>
-          <w:szCs w:val="16"/>
-          <w:lang w:eastAsia="pt-BR"/>
-        </w:rPr>
-        <w:t>vo</w:t>
-      </w:r>
-      <w:r>
-        <w:rPr>
-          <w:rFonts w:ascii="Calibri" w:eastAsia="Times New Roman" w:hAnsi="Calibri" w:cs="Calibri"/>
-          <w:color w:val="000000"/>
-          <w:sz w:val="16"/>
-          <w:szCs w:val="16"/>
-          <w:lang w:eastAsia="pt-BR"/>
-        </w:rPr>
-        <w:t>.</w:t>
+        <w:t>{#mostrar_info_52}</w:t>
       </w:r>
     </w:p>
     <w:p>
@@ -3184,17 +3366,7 @@
           <w:szCs w:val="16"/>
           <w:lang w:eastAsia="pt-BR"/>
         </w:rPr>
-        <w:t>Após o término do serviço será enviado uma medição, incluindo as horas de viagem, espera a bordo e a disposição, caso necessário</w:t>
-      </w:r>
-      <w:r>
-        <w:rPr>
-          <w:rFonts w:ascii="Calibri" w:eastAsia="Times New Roman" w:hAnsi="Calibri" w:cs="Calibri"/>
-          <w:color w:val="000000"/>
-          <w:sz w:val="16"/>
-          <w:szCs w:val="16"/>
-          <w:lang w:eastAsia="pt-BR"/>
-        </w:rPr>
-        <w:t>.</w:t>
+        <w:t>{texto_info_52}</w:t>
       </w:r>
     </w:p>
     <w:p>
@@ -3221,8 +3393,25 @@
           <w:szCs w:val="16"/>
           <w:lang w:eastAsia="pt-BR"/>
         </w:rPr>
-        <w:t>Todas as despesas com deslocamento, alimentação e estadia da equipe, caso necessário, serão por conta do cliente</w:t>
+        <w:t>{/mostrar_info_52}</w:t>
       </w:r>
+    </w:p>
+    <w:p>
+      <w:pPr>
+        <w:pStyle w:val="PargrafodaLista"/>
+        <w:numPr>
+          <w:ilvl w:val="1"/>
+          <w:numId w:val="21"/>
+        </w:numPr>
+        <w:ind w:left="964" w:hanging="284"/>
+        <w:rPr>
+          <w:rFonts w:ascii="Calibri" w:eastAsia="Times New Roman" w:hAnsi="Calibri" w:cs="Calibri"/>
+          <w:color w:val="000000"/>
+          <w:sz w:val="16"/>
+          <w:szCs w:val="16"/>
+          <w:lang w:eastAsia="pt-BR"/>
+        </w:rPr>
+      </w:pPr>
       <w:r>
         <w:rPr>
           <w:rFonts w:ascii="Calibri" w:eastAsia="Times New Roman" w:hAnsi="Calibri" w:cs="Calibri"/>
@@ -3231,7 +3420,142 @@
           <w:szCs w:val="16"/>
           <w:lang w:eastAsia="pt-BR"/>
         </w:rPr>
-        <w:t>;</w:t>
+        <w:t>{#mostrar_info_53}</w:t>
+      </w:r>
+    </w:p>
+    <w:p>
+      <w:pPr>
+        <w:pStyle w:val="PargrafodaLista"/>
+        <w:numPr>
+          <w:ilvl w:val="1"/>
+          <w:numId w:val="21"/>
+        </w:numPr>
+        <w:ind w:left="964" w:hanging="284"/>
+        <w:rPr>
+          <w:rFonts w:ascii="Calibri" w:eastAsia="Times New Roman" w:hAnsi="Calibri" w:cs="Calibri"/>
+          <w:color w:val="000000"/>
+          <w:sz w:val="16"/>
+          <w:szCs w:val="16"/>
+          <w:lang w:eastAsia="pt-BR"/>
+        </w:rPr>
+      </w:pPr>
+      <w:r>
+        <w:rPr>
+          <w:rFonts w:ascii="Calibri" w:eastAsia="Times New Roman" w:hAnsi="Calibri" w:cs="Calibri"/>
+          <w:color w:val="000000"/>
+          <w:sz w:val="16"/>
+          <w:szCs w:val="16"/>
+          <w:lang w:eastAsia="pt-BR"/>
+        </w:rPr>
+        <w:t>{texto_info_53}</w:t>
+      </w:r>
+    </w:p>
+    <w:p>
+      <w:pPr>
+        <w:pStyle w:val="PargrafodaLista"/>
+        <w:numPr>
+          <w:ilvl w:val="1"/>
+          <w:numId w:val="21"/>
+        </w:numPr>
+        <w:ind w:left="964" w:hanging="284"/>
+        <w:rPr>
+          <w:rFonts w:ascii="Calibri" w:eastAsia="Times New Roman" w:hAnsi="Calibri" w:cs="Calibri"/>
+          <w:color w:val="000000"/>
+          <w:sz w:val="16"/>
+          <w:szCs w:val="16"/>
+          <w:lang w:eastAsia="pt-BR"/>
+        </w:rPr>
+      </w:pPr>
+      <w:r>
+        <w:rPr>
+          <w:rFonts w:ascii="Calibri" w:eastAsia="Times New Roman" w:hAnsi="Calibri" w:cs="Calibri"/>
+          <w:color w:val="000000"/>
+          <w:sz w:val="16"/>
+          <w:szCs w:val="16"/>
+          <w:lang w:eastAsia="pt-BR"/>
+        </w:rPr>
+        <w:t>{/mostrar_info_53}</w:t>
+      </w:r>
+    </w:p>
+    <w:p>
+      <w:pPr>
+        <w:pStyle w:val="PargrafodaLista"/>
+        <w:numPr>
+          <w:ilvl w:val="1"/>
+          <w:numId w:val="21"/>
+        </w:numPr>
+        <w:ind w:left="964" w:hanging="284"/>
+        <w:rPr>
+          <w:rFonts w:ascii="Calibri" w:eastAsia="Times New Roman" w:hAnsi="Calibri" w:cs="Calibri"/>
+          <w:color w:val="000000"/>
+          <w:sz w:val="16"/>
+          <w:szCs w:val="16"/>
+          <w:lang w:eastAsia="pt-BR"/>
+        </w:rPr>
+      </w:pPr>
+      <w:r>
+        <w:rPr>
+          <w:rFonts w:ascii="Calibri" w:eastAsia="Times New Roman" w:hAnsi="Calibri" w:cs="Calibri"/>
+          <w:color w:val="000000"/>
+          <w:sz w:val="16"/>
+          <w:szCs w:val="16"/>
+          <w:lang w:eastAsia="pt-BR"/>
+        </w:rPr>
+        <w:t>{#mostrar_info_54}</w:t>
+      </w:r>
+    </w:p>
+    <w:p>
+      <w:pPr>
+        <w:pStyle w:val="PargrafodaLista"/>
+        <w:numPr>
+          <w:ilvl w:val="1"/>
+          <w:numId w:val="21"/>
+        </w:numPr>
+        <w:ind w:left="964" w:hanging="284"/>
+        <w:rPr>
+          <w:rFonts w:ascii="Calibri" w:eastAsia="Times New Roman" w:hAnsi="Calibri" w:cs="Calibri"/>
+          <w:color w:val="000000"/>
+          <w:sz w:val="16"/>
+          <w:szCs w:val="16"/>
+          <w:lang w:eastAsia="pt-BR"/>
+        </w:rPr>
+      </w:pPr>
+      <w:r>
+        <w:rPr>
+          <w:rFonts w:ascii="Calibri" w:eastAsia="Times New Roman" w:hAnsi="Calibri" w:cs="Calibri"/>
+          <w:color w:val="000000"/>
+          <w:sz w:val="16"/>
+          <w:szCs w:val="16"/>
+          <w:lang w:eastAsia="pt-BR"/>
+        </w:rPr>
+        <w:t>{texto_info_54}</w:t>
+      </w:r>
+    </w:p>
+    <w:p>
+      <w:pPr>
+        <w:pStyle w:val="PargrafodaLista"/>
+        <w:numPr>
+          <w:ilvl w:val="1"/>
+          <w:numId w:val="21"/>
+        </w:numPr>
+        <w:ind w:left="964" w:hanging="284"/>
+        <w:rPr>
+          <w:rFonts w:ascii="Calibri" w:eastAsia="Times New Roman" w:hAnsi="Calibri" w:cs="Calibri"/>
+          <w:color w:val="000000"/>
+          <w:sz w:val="16"/>
+          <w:szCs w:val="16"/>
+          <w:lang w:eastAsia="pt-BR"/>
+        </w:rPr>
+      </w:pPr>
+      <w:r>
+        <w:rPr>
+          <w:rFonts w:ascii="Calibri" w:eastAsia="Times New Roman" w:hAnsi="Calibri" w:cs="Calibri"/>
+          <w:color w:val="000000"/>
+          <w:sz w:val="16"/>
+          <w:szCs w:val="16"/>
+          <w:lang w:eastAsia="pt-BR"/>
+        </w:rPr>
+        <w:t>{/mostrar_info_54}</w:t>
       </w:r>
     </w:p>
     <w:p>
@@ -3258,9 +3582,25 @@
           <w:szCs w:val="16"/>
           <w:lang w:eastAsia="pt-BR"/>
         </w:rPr>
-        <w:t xml:space="preserve">Os Equipamentos e Ferramentas de propriedade da SUPPLY MARINE deverão ser devolvidos no prazo máximo de 03 (três) dias após a conclusão dos serviços. Caso contrário, a SUPPLY MARINE cobrará pelos custos de cessão </w:t>
+        <w:t>{#mostrar_info_55}</w:t>
       </w:r>
-      <w:proofErr w:type="gramStart"/>
+    </w:p>
+    <w:p>
+      <w:pPr>
+        <w:pStyle w:val="PargrafodaLista"/>
+        <w:numPr>
+          <w:ilvl w:val="1"/>
+          <w:numId w:val="21"/>
+        </w:numPr>
+        <w:ind w:left="964" w:right="567" w:hanging="284"/>
+        <w:rPr>
+          <w:rFonts w:ascii="Calibri" w:eastAsia="Times New Roman" w:hAnsi="Calibri" w:cs="Calibri"/>
+          <w:color w:val="000000"/>
+          <w:sz w:val="16"/>
+          <w:szCs w:val="16"/>
+          <w:lang w:eastAsia="pt-BR"/>
+        </w:rPr>
+      </w:pPr>
       <w:r>
         <w:rPr>
           <w:rFonts w:ascii="Calibri" w:eastAsia="Times New Roman" w:hAnsi="Calibri" w:cs="Calibri"/>
@@ -3269,9 +3609,25 @@
           <w:szCs w:val="16"/>
           <w:lang w:eastAsia="pt-BR"/>
         </w:rPr>
-        <w:t>dos mesmos</w:t>
+        <w:t>{texto_info_55}</w:t>
       </w:r>
-      <w:proofErr w:type="gramEnd"/>
+    </w:p>
+    <w:p>
+      <w:pPr>
+        <w:pStyle w:val="PargrafodaLista"/>
+        <w:numPr>
+          <w:ilvl w:val="1"/>
+          <w:numId w:val="21"/>
+        </w:numPr>
+        <w:ind w:left="964" w:right="567" w:hanging="284"/>
+        <w:rPr>
+          <w:rFonts w:ascii="Calibri" w:eastAsia="Times New Roman" w:hAnsi="Calibri" w:cs="Calibri"/>
+          <w:color w:val="000000"/>
+          <w:sz w:val="16"/>
+          <w:szCs w:val="16"/>
+          <w:lang w:eastAsia="pt-BR"/>
+        </w:rPr>
+      </w:pPr>
       <w:r>
         <w:rPr>
           <w:rFonts w:ascii="Calibri" w:eastAsia="Times New Roman" w:hAnsi="Calibri" w:cs="Calibri"/>
@@ -3280,7 +3636,88 @@
           <w:szCs w:val="16"/>
           <w:lang w:eastAsia="pt-BR"/>
         </w:rPr>
-        <w:t xml:space="preserve"> conforme tabela abaixo:</w:t>
+        <w:t>{/mostrar_info_55}</w:t>
+      </w:r>
+    </w:p>
+    <w:p>
+      <w:pPr>
+        <w:pStyle w:val="PargrafodaLista"/>
+        <w:numPr>
+          <w:ilvl w:val="1"/>
+          <w:numId w:val="21"/>
+        </w:numPr>
+        <w:ind w:left="964" w:right="567" w:hanging="284"/>
+        <w:rPr>
+          <w:rFonts w:ascii="Calibri" w:eastAsia="Times New Roman" w:hAnsi="Calibri" w:cs="Calibri"/>
+          <w:color w:val="000000"/>
+          <w:sz w:val="16"/>
+          <w:szCs w:val="16"/>
+          <w:lang w:eastAsia="pt-BR"/>
+        </w:rPr>
+      </w:pPr>
+      <w:r>
+        <w:rPr>
+          <w:rFonts w:ascii="Calibri" w:eastAsia="Times New Roman" w:hAnsi="Calibri" w:cs="Calibri"/>
+          <w:color w:val="000000"/>
+          <w:sz w:val="16"/>
+          <w:szCs w:val="16"/>
+          <w:lang w:eastAsia="pt-BR"/>
+        </w:rPr>
+        <w:t>{#informacoes_adicionais}</w:t>
+      </w:r>
+    </w:p>
+    <w:p>
+      <w:pPr>
+        <w:pStyle w:val="PargrafodaLista"/>
+        <w:numPr>
+          <w:ilvl w:val="1"/>
+          <w:numId w:val="21"/>
+        </w:numPr>
+        <w:ind w:left="964" w:right="567" w:hanging="284"/>
+        <w:rPr>
+          <w:rFonts w:ascii="Calibri" w:eastAsia="Times New Roman" w:hAnsi="Calibri" w:cs="Calibri"/>
+          <w:color w:val="000000"/>
+          <w:sz w:val="16"/>
+          <w:szCs w:val="16"/>
+          <w:lang w:eastAsia="pt-BR"/>
+        </w:rPr>
+      </w:pPr>
+      <w:r>
+        <w:rPr>
+          <w:rFonts w:ascii="Calibri" w:eastAsia="Times New Roman" w:hAnsi="Calibri" w:cs="Calibri"/>
+          <w:color w:val="000000"/>
+          <w:sz w:val="16"/>
+          <w:szCs w:val="16"/>
+          <w:lang w:eastAsia="pt-BR"/>
+        </w:rPr>
+        <w:t>{item}</w:t>
+      </w:r>
+    </w:p>
+    <w:p>
+      <w:pPr>
+        <w:pStyle w:val="PargrafodaLista"/>
+        <w:numPr>
+          <w:ilvl w:val="1"/>
+          <w:numId w:val="21"/>
+        </w:numPr>
+        <w:ind w:left="964" w:right="567" w:hanging="284"/>
+        <w:rPr>
+          <w:rFonts w:ascii="Calibri" w:eastAsia="Times New Roman" w:hAnsi="Calibri" w:cs="Calibri"/>
+          <w:color w:val="000000"/>
+          <w:sz w:val="16"/>
+          <w:szCs w:val="16"/>
+          <w:lang w:eastAsia="pt-BR"/>
+        </w:rPr>
+      </w:pPr>
+      <w:r>
+        <w:rPr>
+          <w:rFonts w:ascii="Calibri" w:eastAsia="Times New Roman" w:hAnsi="Calibri" w:cs="Calibri"/>
+          <w:color w:val="000000"/>
+          <w:sz w:val="16"/>
+          <w:szCs w:val="16"/>
+          <w:lang w:eastAsia="pt-BR"/>
+        </w:rPr>
+        <w:t>{/informacoes_adicionais}</w:t>
       </w:r>
     </w:p>
     <w:p>
@@ -3359,8 +3796,8 @@
       </w:r>
     </w:p>
     <w:sectPr>
-      <w:headerReference w:type="default" r:id="rId12"/>
-      <w:footerReference w:type="default" r:id="rId13"/>
+      <w:headerReference w:type="default" r:id="rId13"/>
+      <w:footerReference w:type="default" r:id="rId14"/>
       <w:type w:val="continuous"/>
       <w:pgSz w:w="11906" w:h="16838" w:code="9"/>
       <w:pgMar w:top="1701" w:right="244" w:bottom="397" w:left="284" w:header="0" w:footer="964" w:gutter="0"/>
@@ -9635,12 +10072,9 @@
 </file>
 
 <file path=customXml/item1.xml><?xml version="1.0" encoding="utf-8"?>
-<?mso-contentType ?>
-<FormTemplates xmlns="http://schemas.microsoft.com/sharepoint/v3/contenttype/forms">
-  <Display>DocumentLibraryForm</Display>
-  <Edit>DocumentLibraryForm</Edit>
-  <New>DocumentLibraryForm</New>
-</FormTemplates>
+<p:properties xmlns:p="http://schemas.microsoft.com/office/2006/metadata/properties" xmlns:xsi="http://www.w3.org/2001/XMLSchema-instance" xmlns:pc="http://schemas.microsoft.com/office/infopath/2007/PartnerControls">
+  <documentManagement/>
+</p:properties>
 </file>
 
 <file path=customXml/item2.xml><?xml version="1.0" encoding="utf-8"?>
@@ -9808,15 +10242,23 @@
 </file>
 
 <file path=customXml/item3.xml><?xml version="1.0" encoding="utf-8"?>
-<p:properties xmlns:p="http://schemas.microsoft.com/office/2006/metadata/properties" xmlns:xsi="http://www.w3.org/2001/XMLSchema-instance" xmlns:pc="http://schemas.microsoft.com/office/infopath/2007/PartnerControls">
-  <documentManagement/>
-</p:properties>
+<?mso-contentType ?>
+<FormTemplates xmlns="http://schemas.microsoft.com/sharepoint/v3/contenttype/forms">
+  <Display>DocumentLibraryForm</Display>
+  <Edit>DocumentLibraryForm</Edit>
+  <New>DocumentLibraryForm</New>
+</FormTemplates>
+</file>
+
+<file path=customXml/item4.xml><?xml version="1.0" encoding="utf-8"?>
+<b:Sources xmlns:b="http://schemas.openxmlformats.org/officeDocument/2006/bibliography" xmlns="http://schemas.openxmlformats.org/officeDocument/2006/bibliography" SelectedStyle="\APASixthEditionOfficeOnline.xsl" StyleName="APA" Version="6"/>
 </file>
 
 <file path=customXml/itemProps1.xml><?xml version="1.0" encoding="utf-8"?>
-<ds:datastoreItem xmlns:ds="http://schemas.openxmlformats.org/officeDocument/2006/customXml" ds:itemID="{6A6DB6DC-5E25-404D-837F-EED97508210D}">
+<ds:datastoreItem xmlns:ds="http://schemas.openxmlformats.org/officeDocument/2006/customXml" ds:itemID="{56D08023-C9A9-4771-B259-4E5ABEBE4DB5}">
   <ds:schemaRefs>
-    <ds:schemaRef ds:uri="http://schemas.microsoft.com/sharepoint/v3/contenttype/forms"/>
+    <ds:schemaRef ds:uri="http://schemas.microsoft.com/office/2006/metadata/properties"/>
+    <ds:schemaRef ds:uri="http://schemas.microsoft.com/office/infopath/2007/PartnerControls"/>
   </ds:schemaRefs>
 </ds:datastoreItem>
 </file>
@@ -9840,10 +10282,17 @@
 </file>
 
 <file path=customXml/itemProps3.xml><?xml version="1.0" encoding="utf-8"?>
-<ds:datastoreItem xmlns:ds="http://schemas.openxmlformats.org/officeDocument/2006/customXml" ds:itemID="{56D08023-C9A9-4771-B259-4E5ABEBE4DB5}">
+<ds:datastoreItem xmlns:ds="http://schemas.openxmlformats.org/officeDocument/2006/customXml" ds:itemID="{6A6DB6DC-5E25-404D-837F-EED97508210D}">
   <ds:schemaRefs>
-    <ds:schemaRef ds:uri="http://schemas.microsoft.com/office/2006/metadata/properties"/>
-    <ds:schemaRef ds:uri="http://schemas.microsoft.com/office/infopath/2007/PartnerControls"/>
+    <ds:schemaRef ds:uri="http://schemas.microsoft.com/sharepoint/v3/contenttype/forms"/>
+  </ds:schemaRefs>
+</ds:datastoreItem>
+</file>
+
+<file path=customXml/itemProps4.xml><?xml version="1.0" encoding="utf-8"?>
+<ds:datastoreItem xmlns:ds="http://schemas.openxmlformats.org/officeDocument/2006/customXml" ds:itemID="{7F353C01-F2A8-491F-8680-64886334D565}">
+  <ds:schemaRefs>
+    <ds:schemaRef ds:uri="http://schemas.openxmlformats.org/officeDocument/2006/bibliography"/>
   </ds:schemaRefs>
 </ds:datastoreItem>
 </file>
</xml_diff>